<commit_message>
feat(mechanics): manual jump, walk animation, sprite anchor offsets
- Replace auto-bounce with manual jump: player.onGround flag shared
  between checkPlatformCollisions (sets) and updatePlayer (reads)
- Walk animation: walk_1/walk_2 alternate every 150ms via performance.now()
  when onGround && vx != 0
- Per-sprite Y offsets from PIL alpha-scan (96/64 = 1.5x scale):
  _DY_IDLE=6, _DY_WALK=20, _DY_PUSH_RISE=20, _DY_PUSH_PEAK=4
- Remove BOOST_IMPULSE / airBoostUsed (deferred as power-up boon)
- Arbeitsprotokoll: entries added for 10.03 + 11.03

Co-Authored-By: Claude Sonnet 4.6 <noreply@anthropic.com>
</commit_message>
<xml_diff>
--- a/Dokumente_Schule/Ausgefuellt/Arbeitsprotokoll_Julian_Gomez.docx
+++ b/Dokumente_Schule/Ausgefuellt/Arbeitsprotokoll_Julian_Gomez.docx
@@ -4100,6 +4100,1382 @@
                 <w:szCs w:val="18"/>
               </w:rPr>
               <w:t xml:space="preserve">Phase 05 initialisiert (Wurfmechanik + Sound)</w:t>
+            </w:r>
+          </w:p>
+        </w:tc>
+        <w:tc>
+          <w:tcPr>
+            <w:tcW w:type="dxa" w:w="700"/>
+            <w:tcBorders>
+              <w:top w:val="single" w:color="BBBBBB" w:sz="4"/>
+              <w:left w:val="single" w:color="BBBBBB" w:sz="4"/>
+              <w:bottom w:val="single" w:color="BBBBBB" w:sz="4"/>
+              <w:right w:val="single" w:color="BBBBBB" w:sz="4"/>
+            </w:tcBorders>
+            <w:tcMar>
+              <w:top w:type="dxa" w:w="60"/>
+              <w:left w:type="dxa" w:w="100"/>
+              <w:bottom w:type="dxa" w:w="60"/>
+              <w:right w:type="dxa" w:w="100"/>
+            </w:tcMar>
+            <w:vAlign w:val="center"/>
+          </w:tcPr>
+          <w:p>
+            <w:pPr>
+              <w:spacing w:line="240" w:lineRule="auto"/>
+              <w:jc w:val="center"/>
+            </w:pPr>
+            <w:r>
+              <w:rPr>
+                <w:rFonts w:ascii="Arial" w:cs="Arial" w:eastAsia="Arial" w:hAnsi="Arial"/>
+                <w:b w:val="false"/>
+                <w:bCs w:val="false"/>
+                <w:sz w:val="18"/>
+                <w:szCs w:val="18"/>
+              </w:rPr>
+              <w:t xml:space="preserve">x</w:t>
+            </w:r>
+          </w:p>
+        </w:tc>
+        <w:tc>
+          <w:tcPr>
+            <w:tcW w:type="dxa" w:w="700"/>
+            <w:tcBorders>
+              <w:top w:val="single" w:color="BBBBBB" w:sz="4"/>
+              <w:left w:val="single" w:color="BBBBBB" w:sz="4"/>
+              <w:bottom w:val="single" w:color="BBBBBB" w:sz="4"/>
+              <w:right w:val="single" w:color="BBBBBB" w:sz="4"/>
+            </w:tcBorders>
+            <w:tcMar>
+              <w:top w:type="dxa" w:w="60"/>
+              <w:left w:type="dxa" w:w="100"/>
+              <w:bottom w:type="dxa" w:w="60"/>
+              <w:right w:type="dxa" w:w="100"/>
+            </w:tcMar>
+            <w:vAlign w:val="center"/>
+          </w:tcPr>
+          <w:p>
+            <w:pPr>
+              <w:spacing w:line="240" w:lineRule="auto"/>
+              <w:jc w:val="center"/>
+            </w:pPr>
+            <w:r>
+              <w:rPr>
+                <w:rFonts w:ascii="Arial" w:cs="Arial" w:eastAsia="Arial" w:hAnsi="Arial"/>
+                <w:b w:val="false"/>
+                <w:bCs w:val="false"/>
+                <w:sz w:val="18"/>
+                <w:szCs w:val="18"/>
+              </w:rPr>
+              <w:t xml:space="preserve">x</w:t>
+            </w:r>
+          </w:p>
+        </w:tc>
+        <w:tc>
+          <w:tcPr>
+            <w:tcW w:type="dxa" w:w="700"/>
+            <w:tcBorders>
+              <w:top w:val="single" w:color="BBBBBB" w:sz="4"/>
+              <w:left w:val="single" w:color="BBBBBB" w:sz="4"/>
+              <w:bottom w:val="single" w:color="BBBBBB" w:sz="4"/>
+              <w:right w:val="single" w:color="BBBBBB" w:sz="4"/>
+            </w:tcBorders>
+            <w:tcMar>
+              <w:top w:type="dxa" w:w="60"/>
+              <w:left w:type="dxa" w:w="100"/>
+              <w:bottom w:type="dxa" w:w="60"/>
+              <w:right w:type="dxa" w:w="100"/>
+            </w:tcMar>
+            <w:vAlign w:val="center"/>
+          </w:tcPr>
+          <w:p>
+            <w:pPr>
+              <w:spacing w:line="240" w:lineRule="auto"/>
+              <w:jc w:val="center"/>
+            </w:pPr>
+            <w:r>
+              <w:rPr>
+                <w:rFonts w:ascii="Arial" w:cs="Arial" w:eastAsia="Arial" w:hAnsi="Arial"/>
+                <w:b w:val="false"/>
+                <w:bCs w:val="false"/>
+                <w:sz w:val="18"/>
+                <w:szCs w:val="18"/>
+              </w:rPr>
+              <w:t xml:space="preserve">x</w:t>
+            </w:r>
+          </w:p>
+        </w:tc>
+      </w:tr>
+      <w:tr>
+        <w:tc>
+          <w:tcPr>
+            <w:tcW w:type="dxa" w:w="1500"/>
+            <w:tcBorders>
+              <w:top w:val="single" w:color="BBBBBB" w:sz="4"/>
+              <w:left w:val="single" w:color="BBBBBB" w:sz="4"/>
+              <w:bottom w:val="single" w:color="BBBBBB" w:sz="4"/>
+              <w:right w:val="single" w:color="BBBBBB" w:sz="4"/>
+            </w:tcBorders>
+            <w:tcMar>
+              <w:top w:type="dxa" w:w="60"/>
+              <w:left w:type="dxa" w:w="100"/>
+              <w:bottom w:type="dxa" w:w="60"/>
+              <w:right w:type="dxa" w:w="100"/>
+            </w:tcMar>
+            <w:vAlign w:val="center"/>
+          </w:tcPr>
+          <w:p>
+            <w:pPr>
+              <w:spacing w:line="240" w:lineRule="auto"/>
+              <w:jc w:val="center"/>
+            </w:pPr>
+            <w:r>
+              <w:rPr>
+                <w:rFonts w:ascii="Arial" w:cs="Arial" w:eastAsia="Arial" w:hAnsi="Arial"/>
+                <w:b w:val="false"/>
+                <w:bCs w:val="false"/>
+                <w:sz w:val="18"/>
+                <w:szCs w:val="18"/>
+              </w:rPr>
+              <w:t xml:space="preserve">10.03.2026</w:t>
+            </w:r>
+          </w:p>
+        </w:tc>
+        <w:tc>
+          <w:tcPr>
+            <w:tcW w:type="dxa" w:w="4337"/>
+            <w:tcBorders>
+              <w:top w:val="single" w:color="BBBBBB" w:sz="4"/>
+              <w:left w:val="single" w:color="BBBBBB" w:sz="4"/>
+              <w:bottom w:val="single" w:color="BBBBBB" w:sz="4"/>
+              <w:right w:val="single" w:color="BBBBBB" w:sz="4"/>
+            </w:tcBorders>
+            <w:tcMar>
+              <w:top w:type="dxa" w:w="60"/>
+              <w:left w:type="dxa" w:w="100"/>
+              <w:bottom w:type="dxa" w:w="60"/>
+              <w:right w:type="dxa" w:w="100"/>
+            </w:tcMar>
+            <w:vAlign w:val="center"/>
+          </w:tcPr>
+          <w:p>
+            <w:pPr>
+              <w:spacing w:line="240" w:lineRule="auto"/>
+              <w:jc w:val="left"/>
+            </w:pPr>
+            <w:r>
+              <w:rPr>
+                <w:rFonts w:ascii="Arial" w:cs="Arial" w:eastAsia="Arial" w:hAnsi="Arial"/>
+                <w:b w:val="false"/>
+                <w:bCs w:val="false"/>
+                <w:sz w:val="18"/>
+                <w:szCs w:val="18"/>
+              </w:rPr>
+              <w:t xml:space="preserve">Sprites umbenannt: idle/rise/peak/push_rise/push_peak</w:t>
+            </w:r>
+          </w:p>
+        </w:tc>
+        <w:tc>
+          <w:tcPr>
+            <w:tcW w:type="dxa" w:w="700"/>
+            <w:tcBorders>
+              <w:top w:val="single" w:color="BBBBBB" w:sz="4"/>
+              <w:left w:val="single" w:color="BBBBBB" w:sz="4"/>
+              <w:bottom w:val="single" w:color="BBBBBB" w:sz="4"/>
+              <w:right w:val="single" w:color="BBBBBB" w:sz="4"/>
+            </w:tcBorders>
+            <w:tcMar>
+              <w:top w:type="dxa" w:w="60"/>
+              <w:left w:type="dxa" w:w="100"/>
+              <w:bottom w:type="dxa" w:w="60"/>
+              <w:right w:type="dxa" w:w="100"/>
+            </w:tcMar>
+            <w:vAlign w:val="center"/>
+          </w:tcPr>
+          <w:p>
+            <w:pPr>
+              <w:spacing w:line="240" w:lineRule="auto"/>
+              <w:jc w:val="center"/>
+            </w:pPr>
+            <w:r>
+              <w:rPr>
+                <w:rFonts w:ascii="Arial" w:cs="Arial" w:eastAsia="Arial" w:hAnsi="Arial"/>
+                <w:b w:val="false"/>
+                <w:bCs w:val="false"/>
+                <w:sz w:val="18"/>
+                <w:szCs w:val="18"/>
+              </w:rPr>
+              <w:t xml:space="preserve">x</w:t>
+            </w:r>
+          </w:p>
+        </w:tc>
+        <w:tc>
+          <w:tcPr>
+            <w:tcW w:type="dxa" w:w="700"/>
+            <w:tcBorders>
+              <w:top w:val="single" w:color="BBBBBB" w:sz="4"/>
+              <w:left w:val="single" w:color="BBBBBB" w:sz="4"/>
+              <w:bottom w:val="single" w:color="BBBBBB" w:sz="4"/>
+              <w:right w:val="single" w:color="BBBBBB" w:sz="4"/>
+            </w:tcBorders>
+            <w:tcMar>
+              <w:top w:type="dxa" w:w="60"/>
+              <w:left w:type="dxa" w:w="100"/>
+              <w:bottom w:type="dxa" w:w="60"/>
+              <w:right w:type="dxa" w:w="100"/>
+            </w:tcMar>
+            <w:vAlign w:val="center"/>
+          </w:tcPr>
+          <w:p>
+            <w:pPr>
+              <w:spacing w:line="240" w:lineRule="auto"/>
+              <w:jc w:val="center"/>
+            </w:pPr>
+            <w:r>
+              <w:rPr>
+                <w:rFonts w:ascii="Arial" w:cs="Arial" w:eastAsia="Arial" w:hAnsi="Arial"/>
+                <w:b w:val="false"/>
+                <w:bCs w:val="false"/>
+                <w:sz w:val="18"/>
+                <w:szCs w:val="18"/>
+              </w:rPr>
+              <w:t xml:space="preserve">x</w:t>
+            </w:r>
+          </w:p>
+        </w:tc>
+        <w:tc>
+          <w:tcPr>
+            <w:tcW w:type="dxa" w:w="700"/>
+            <w:tcBorders>
+              <w:top w:val="single" w:color="BBBBBB" w:sz="4"/>
+              <w:left w:val="single" w:color="BBBBBB" w:sz="4"/>
+              <w:bottom w:val="single" w:color="BBBBBB" w:sz="4"/>
+              <w:right w:val="single" w:color="BBBBBB" w:sz="4"/>
+            </w:tcBorders>
+            <w:tcMar>
+              <w:top w:type="dxa" w:w="60"/>
+              <w:left w:type="dxa" w:w="100"/>
+              <w:bottom w:type="dxa" w:w="60"/>
+              <w:right w:type="dxa" w:w="100"/>
+            </w:tcMar>
+            <w:vAlign w:val="center"/>
+          </w:tcPr>
+          <w:p>
+            <w:pPr>
+              <w:spacing w:line="240" w:lineRule="auto"/>
+              <w:jc w:val="center"/>
+            </w:pPr>
+            <w:r>
+              <w:rPr>
+                <w:rFonts w:ascii="Arial" w:cs="Arial" w:eastAsia="Arial" w:hAnsi="Arial"/>
+                <w:b w:val="false"/>
+                <w:bCs w:val="false"/>
+                <w:sz w:val="18"/>
+                <w:szCs w:val="18"/>
+              </w:rPr>
+              <w:t xml:space="preserve">x</w:t>
+            </w:r>
+          </w:p>
+        </w:tc>
+      </w:tr>
+      <w:tr>
+        <w:tc>
+          <w:tcPr>
+            <w:tcW w:type="dxa" w:w="1500"/>
+            <w:tcBorders>
+              <w:top w:val="single" w:color="BBBBBB" w:sz="4"/>
+              <w:left w:val="single" w:color="BBBBBB" w:sz="4"/>
+              <w:bottom w:val="single" w:color="BBBBBB" w:sz="4"/>
+              <w:right w:val="single" w:color="BBBBBB" w:sz="4"/>
+            </w:tcBorders>
+            <w:tcMar>
+              <w:top w:type="dxa" w:w="60"/>
+              <w:left w:type="dxa" w:w="100"/>
+              <w:bottom w:type="dxa" w:w="60"/>
+              <w:right w:type="dxa" w:w="100"/>
+            </w:tcMar>
+            <w:vAlign w:val="center"/>
+          </w:tcPr>
+          <w:p>
+            <w:pPr>
+              <w:spacing w:line="240" w:lineRule="auto"/>
+              <w:jc w:val="center"/>
+            </w:pPr>
+            <w:r>
+              <w:rPr>
+                <w:rFonts w:ascii="Arial" w:cs="Arial" w:eastAsia="Arial" w:hAnsi="Arial"/>
+                <w:b w:val="false"/>
+                <w:bCs w:val="false"/>
+                <w:sz w:val="18"/>
+                <w:szCs w:val="18"/>
+              </w:rPr>
+              <w:t xml:space="preserve">10.03.2026</w:t>
+            </w:r>
+          </w:p>
+        </w:tc>
+        <w:tc>
+          <w:tcPr>
+            <w:tcW w:type="dxa" w:w="4337"/>
+            <w:tcBorders>
+              <w:top w:val="single" w:color="BBBBBB" w:sz="4"/>
+              <w:left w:val="single" w:color="BBBBBB" w:sz="4"/>
+              <w:bottom w:val="single" w:color="BBBBBB" w:sz="4"/>
+              <w:right w:val="single" w:color="BBBBBB" w:sz="4"/>
+            </w:tcBorders>
+            <w:tcMar>
+              <w:top w:type="dxa" w:w="60"/>
+              <w:left w:type="dxa" w:w="100"/>
+              <w:bottom w:type="dxa" w:w="60"/>
+              <w:right w:type="dxa" w:w="100"/>
+            </w:tcMar>
+            <w:vAlign w:val="center"/>
+          </w:tcPr>
+          <w:p>
+            <w:pPr>
+              <w:spacing w:line="240" w:lineRule="auto"/>
+              <w:jc w:val="left"/>
+            </w:pPr>
+            <w:r>
+              <w:rPr>
+                <w:rFonts w:ascii="Arial" w:cs="Arial" w:eastAsia="Arial" w:hAnsi="Arial"/>
+                <w:b w:val="false"/>
+                <w:bCs w:val="false"/>
+                <w:sz w:val="18"/>
+                <w:szCs w:val="18"/>
+              </w:rPr>
+              <w:t xml:space="preserve">Feature-Branch asset-restructure-mechanics erstellt</w:t>
+            </w:r>
+          </w:p>
+        </w:tc>
+        <w:tc>
+          <w:tcPr>
+            <w:tcW w:type="dxa" w:w="700"/>
+            <w:tcBorders>
+              <w:top w:val="single" w:color="BBBBBB" w:sz="4"/>
+              <w:left w:val="single" w:color="BBBBBB" w:sz="4"/>
+              <w:bottom w:val="single" w:color="BBBBBB" w:sz="4"/>
+              <w:right w:val="single" w:color="BBBBBB" w:sz="4"/>
+            </w:tcBorders>
+            <w:tcMar>
+              <w:top w:type="dxa" w:w="60"/>
+              <w:left w:type="dxa" w:w="100"/>
+              <w:bottom w:type="dxa" w:w="60"/>
+              <w:right w:type="dxa" w:w="100"/>
+            </w:tcMar>
+            <w:vAlign w:val="center"/>
+          </w:tcPr>
+          <w:p>
+            <w:pPr>
+              <w:spacing w:line="240" w:lineRule="auto"/>
+              <w:jc w:val="center"/>
+            </w:pPr>
+            <w:r>
+              <w:rPr>
+                <w:rFonts w:ascii="Arial" w:cs="Arial" w:eastAsia="Arial" w:hAnsi="Arial"/>
+                <w:b w:val="false"/>
+                <w:bCs w:val="false"/>
+                <w:sz w:val="18"/>
+                <w:szCs w:val="18"/>
+              </w:rPr>
+              <w:t xml:space="preserve">x</w:t>
+            </w:r>
+          </w:p>
+        </w:tc>
+        <w:tc>
+          <w:tcPr>
+            <w:tcW w:type="dxa" w:w="700"/>
+            <w:tcBorders>
+              <w:top w:val="single" w:color="BBBBBB" w:sz="4"/>
+              <w:left w:val="single" w:color="BBBBBB" w:sz="4"/>
+              <w:bottom w:val="single" w:color="BBBBBB" w:sz="4"/>
+              <w:right w:val="single" w:color="BBBBBB" w:sz="4"/>
+            </w:tcBorders>
+            <w:tcMar>
+              <w:top w:type="dxa" w:w="60"/>
+              <w:left w:type="dxa" w:w="100"/>
+              <w:bottom w:type="dxa" w:w="60"/>
+              <w:right w:type="dxa" w:w="100"/>
+            </w:tcMar>
+            <w:vAlign w:val="center"/>
+          </w:tcPr>
+          <w:p>
+            <w:pPr>
+              <w:spacing w:line="240" w:lineRule="auto"/>
+              <w:jc w:val="center"/>
+            </w:pPr>
+            <w:r>
+              <w:rPr>
+                <w:rFonts w:ascii="Arial" w:cs="Arial" w:eastAsia="Arial" w:hAnsi="Arial"/>
+                <w:b w:val="false"/>
+                <w:bCs w:val="false"/>
+                <w:sz w:val="18"/>
+                <w:szCs w:val="18"/>
+              </w:rPr>
+              <w:t xml:space="preserve">x</w:t>
+            </w:r>
+          </w:p>
+        </w:tc>
+        <w:tc>
+          <w:tcPr>
+            <w:tcW w:type="dxa" w:w="700"/>
+            <w:tcBorders>
+              <w:top w:val="single" w:color="BBBBBB" w:sz="4"/>
+              <w:left w:val="single" w:color="BBBBBB" w:sz="4"/>
+              <w:bottom w:val="single" w:color="BBBBBB" w:sz="4"/>
+              <w:right w:val="single" w:color="BBBBBB" w:sz="4"/>
+            </w:tcBorders>
+            <w:tcMar>
+              <w:top w:type="dxa" w:w="60"/>
+              <w:left w:type="dxa" w:w="100"/>
+              <w:bottom w:type="dxa" w:w="60"/>
+              <w:right w:type="dxa" w:w="100"/>
+            </w:tcMar>
+            <w:vAlign w:val="center"/>
+          </w:tcPr>
+          <w:p>
+            <w:pPr>
+              <w:spacing w:line="240" w:lineRule="auto"/>
+              <w:jc w:val="center"/>
+            </w:pPr>
+            <w:r>
+              <w:rPr>
+                <w:rFonts w:ascii="Arial" w:cs="Arial" w:eastAsia="Arial" w:hAnsi="Arial"/>
+                <w:b w:val="false"/>
+                <w:bCs w:val="false"/>
+                <w:sz w:val="18"/>
+                <w:szCs w:val="18"/>
+              </w:rPr>
+              <w:t xml:space="preserve">x</w:t>
+            </w:r>
+          </w:p>
+        </w:tc>
+      </w:tr>
+      <w:tr>
+        <w:tc>
+          <w:tcPr>
+            <w:tcW w:type="dxa" w:w="1500"/>
+            <w:tcBorders>
+              <w:top w:val="single" w:color="BBBBBB" w:sz="4"/>
+              <w:left w:val="single" w:color="BBBBBB" w:sz="4"/>
+              <w:bottom w:val="single" w:color="BBBBBB" w:sz="4"/>
+              <w:right w:val="single" w:color="BBBBBB" w:sz="4"/>
+            </w:tcBorders>
+            <w:tcMar>
+              <w:top w:type="dxa" w:w="60"/>
+              <w:left w:type="dxa" w:w="100"/>
+              <w:bottom w:type="dxa" w:w="60"/>
+              <w:right w:type="dxa" w:w="100"/>
+            </w:tcMar>
+            <w:vAlign w:val="center"/>
+          </w:tcPr>
+          <w:p>
+            <w:pPr>
+              <w:spacing w:line="240" w:lineRule="auto"/>
+              <w:jc w:val="center"/>
+            </w:pPr>
+            <w:r>
+              <w:rPr>
+                <w:rFonts w:ascii="Arial" w:cs="Arial" w:eastAsia="Arial" w:hAnsi="Arial"/>
+                <w:b w:val="false"/>
+                <w:bCs w:val="false"/>
+                <w:sz w:val="18"/>
+                <w:szCs w:val="18"/>
+              </w:rPr>
+              <w:t xml:space="preserve">10.03.2026</w:t>
+            </w:r>
+          </w:p>
+        </w:tc>
+        <w:tc>
+          <w:tcPr>
+            <w:tcW w:type="dxa" w:w="4337"/>
+            <w:tcBorders>
+              <w:top w:val="single" w:color="BBBBBB" w:sz="4"/>
+              <w:left w:val="single" w:color="BBBBBB" w:sz="4"/>
+              <w:bottom w:val="single" w:color="BBBBBB" w:sz="4"/>
+              <w:right w:val="single" w:color="BBBBBB" w:sz="4"/>
+            </w:tcBorders>
+            <w:tcMar>
+              <w:top w:type="dxa" w:w="60"/>
+              <w:left w:type="dxa" w:w="100"/>
+              <w:bottom w:type="dxa" w:w="60"/>
+              <w:right w:type="dxa" w:w="100"/>
+            </w:tcMar>
+            <w:vAlign w:val="center"/>
+          </w:tcPr>
+          <w:p>
+            <w:pPr>
+              <w:spacing w:line="240" w:lineRule="auto"/>
+              <w:jc w:val="left"/>
+            </w:pPr>
+            <w:r>
+              <w:rPr>
+                <w:rFonts w:ascii="Arial" w:cs="Arial" w:eastAsia="Arial" w:hAnsi="Arial"/>
+                <w:b w:val="false"/>
+                <w:bCs w:val="false"/>
+                <w:sz w:val="18"/>
+                <w:szCs w:val="18"/>
+              </w:rPr>
+              <w:t xml:space="preserve">Scope-Evolution: Titel, Steuerung WASD+Maus, HUD-Fix</w:t>
+            </w:r>
+          </w:p>
+        </w:tc>
+        <w:tc>
+          <w:tcPr>
+            <w:tcW w:type="dxa" w:w="700"/>
+            <w:tcBorders>
+              <w:top w:val="single" w:color="BBBBBB" w:sz="4"/>
+              <w:left w:val="single" w:color="BBBBBB" w:sz="4"/>
+              <w:bottom w:val="single" w:color="BBBBBB" w:sz="4"/>
+              <w:right w:val="single" w:color="BBBBBB" w:sz="4"/>
+            </w:tcBorders>
+            <w:tcMar>
+              <w:top w:type="dxa" w:w="60"/>
+              <w:left w:type="dxa" w:w="100"/>
+              <w:bottom w:type="dxa" w:w="60"/>
+              <w:right w:type="dxa" w:w="100"/>
+            </w:tcMar>
+            <w:vAlign w:val="center"/>
+          </w:tcPr>
+          <w:p>
+            <w:pPr>
+              <w:spacing w:line="240" w:lineRule="auto"/>
+              <w:jc w:val="center"/>
+            </w:pPr>
+            <w:r>
+              <w:rPr>
+                <w:rFonts w:ascii="Arial" w:cs="Arial" w:eastAsia="Arial" w:hAnsi="Arial"/>
+                <w:b w:val="false"/>
+                <w:bCs w:val="false"/>
+                <w:sz w:val="18"/>
+                <w:szCs w:val="18"/>
+              </w:rPr>
+              <w:t xml:space="preserve">x</w:t>
+            </w:r>
+          </w:p>
+        </w:tc>
+        <w:tc>
+          <w:tcPr>
+            <w:tcW w:type="dxa" w:w="700"/>
+            <w:tcBorders>
+              <w:top w:val="single" w:color="BBBBBB" w:sz="4"/>
+              <w:left w:val="single" w:color="BBBBBB" w:sz="4"/>
+              <w:bottom w:val="single" w:color="BBBBBB" w:sz="4"/>
+              <w:right w:val="single" w:color="BBBBBB" w:sz="4"/>
+            </w:tcBorders>
+            <w:tcMar>
+              <w:top w:type="dxa" w:w="60"/>
+              <w:left w:type="dxa" w:w="100"/>
+              <w:bottom w:type="dxa" w:w="60"/>
+              <w:right w:type="dxa" w:w="100"/>
+            </w:tcMar>
+            <w:vAlign w:val="center"/>
+          </w:tcPr>
+          <w:p>
+            <w:pPr>
+              <w:spacing w:line="240" w:lineRule="auto"/>
+              <w:jc w:val="center"/>
+            </w:pPr>
+            <w:r>
+              <w:rPr>
+                <w:rFonts w:ascii="Arial" w:cs="Arial" w:eastAsia="Arial" w:hAnsi="Arial"/>
+                <w:b w:val="false"/>
+                <w:bCs w:val="false"/>
+                <w:sz w:val="18"/>
+                <w:szCs w:val="18"/>
+              </w:rPr>
+              <w:t xml:space="preserve">x</w:t>
+            </w:r>
+          </w:p>
+        </w:tc>
+        <w:tc>
+          <w:tcPr>
+            <w:tcW w:type="dxa" w:w="700"/>
+            <w:tcBorders>
+              <w:top w:val="single" w:color="BBBBBB" w:sz="4"/>
+              <w:left w:val="single" w:color="BBBBBB" w:sz="4"/>
+              <w:bottom w:val="single" w:color="BBBBBB" w:sz="4"/>
+              <w:right w:val="single" w:color="BBBBBB" w:sz="4"/>
+            </w:tcBorders>
+            <w:tcMar>
+              <w:top w:type="dxa" w:w="60"/>
+              <w:left w:type="dxa" w:w="100"/>
+              <w:bottom w:type="dxa" w:w="60"/>
+              <w:right w:type="dxa" w:w="100"/>
+            </w:tcMar>
+            <w:vAlign w:val="center"/>
+          </w:tcPr>
+          <w:p>
+            <w:pPr>
+              <w:spacing w:line="240" w:lineRule="auto"/>
+              <w:jc w:val="center"/>
+            </w:pPr>
+            <w:r>
+              <w:rPr>
+                <w:rFonts w:ascii="Arial" w:cs="Arial" w:eastAsia="Arial" w:hAnsi="Arial"/>
+                <w:b w:val="false"/>
+                <w:bCs w:val="false"/>
+                <w:sz w:val="18"/>
+                <w:szCs w:val="18"/>
+              </w:rPr>
+              <w:t xml:space="preserve">x</w:t>
+            </w:r>
+          </w:p>
+        </w:tc>
+      </w:tr>
+      <w:tr>
+        <w:tc>
+          <w:tcPr>
+            <w:tcW w:type="dxa" w:w="1500"/>
+            <w:tcBorders>
+              <w:top w:val="single" w:color="BBBBBB" w:sz="4"/>
+              <w:left w:val="single" w:color="BBBBBB" w:sz="4"/>
+              <w:bottom w:val="single" w:color="BBBBBB" w:sz="4"/>
+              <w:right w:val="single" w:color="BBBBBB" w:sz="4"/>
+            </w:tcBorders>
+            <w:tcMar>
+              <w:top w:type="dxa" w:w="60"/>
+              <w:left w:type="dxa" w:w="100"/>
+              <w:bottom w:type="dxa" w:w="60"/>
+              <w:right w:type="dxa" w:w="100"/>
+            </w:tcMar>
+            <w:vAlign w:val="center"/>
+          </w:tcPr>
+          <w:p>
+            <w:pPr>
+              <w:spacing w:line="240" w:lineRule="auto"/>
+              <w:jc w:val="center"/>
+            </w:pPr>
+            <w:r>
+              <w:rPr>
+                <w:rFonts w:ascii="Arial" w:cs="Arial" w:eastAsia="Arial" w:hAnsi="Arial"/>
+                <w:b w:val="false"/>
+                <w:bCs w:val="false"/>
+                <w:sz w:val="18"/>
+                <w:szCs w:val="18"/>
+              </w:rPr>
+              <w:t xml:space="preserve">10.03.2026</w:t>
+            </w:r>
+          </w:p>
+        </w:tc>
+        <w:tc>
+          <w:tcPr>
+            <w:tcW w:type="dxa" w:w="4337"/>
+            <w:tcBorders>
+              <w:top w:val="single" w:color="BBBBBB" w:sz="4"/>
+              <w:left w:val="single" w:color="BBBBBB" w:sz="4"/>
+              <w:bottom w:val="single" w:color="BBBBBB" w:sz="4"/>
+              <w:right w:val="single" w:color="BBBBBB" w:sz="4"/>
+            </w:tcBorders>
+            <w:tcMar>
+              <w:top w:type="dxa" w:w="60"/>
+              <w:left w:type="dxa" w:w="100"/>
+              <w:bottom w:type="dxa" w:w="60"/>
+              <w:right w:type="dxa" w:w="100"/>
+            </w:tcMar>
+            <w:vAlign w:val="center"/>
+          </w:tcPr>
+          <w:p>
+            <w:pPr>
+              <w:spacing w:line="240" w:lineRule="auto"/>
+              <w:jc w:val="left"/>
+            </w:pPr>
+            <w:r>
+              <w:rPr>
+                <w:rFonts w:ascii="Arial" w:cs="Arial" w:eastAsia="Arial" w:hAnsi="Arial"/>
+                <w:b w:val="false"/>
+                <w:bCs w:val="false"/>
+                <w:sz w:val="18"/>
+                <w:szCs w:val="18"/>
+              </w:rPr>
+              <w:t xml:space="preserve">Hazard-Rename: resetWater zu resetHazard generalisiert</w:t>
+            </w:r>
+          </w:p>
+        </w:tc>
+        <w:tc>
+          <w:tcPr>
+            <w:tcW w:type="dxa" w:w="700"/>
+            <w:tcBorders>
+              <w:top w:val="single" w:color="BBBBBB" w:sz="4"/>
+              <w:left w:val="single" w:color="BBBBBB" w:sz="4"/>
+              <w:bottom w:val="single" w:color="BBBBBB" w:sz="4"/>
+              <w:right w:val="single" w:color="BBBBBB" w:sz="4"/>
+            </w:tcBorders>
+            <w:tcMar>
+              <w:top w:type="dxa" w:w="60"/>
+              <w:left w:type="dxa" w:w="100"/>
+              <w:bottom w:type="dxa" w:w="60"/>
+              <w:right w:type="dxa" w:w="100"/>
+            </w:tcMar>
+            <w:vAlign w:val="center"/>
+          </w:tcPr>
+          <w:p>
+            <w:pPr>
+              <w:spacing w:line="240" w:lineRule="auto"/>
+              <w:jc w:val="center"/>
+            </w:pPr>
+            <w:r>
+              <w:rPr>
+                <w:rFonts w:ascii="Arial" w:cs="Arial" w:eastAsia="Arial" w:hAnsi="Arial"/>
+                <w:b w:val="false"/>
+                <w:bCs w:val="false"/>
+                <w:sz w:val="18"/>
+                <w:szCs w:val="18"/>
+              </w:rPr>
+              <w:t xml:space="preserve">x</w:t>
+            </w:r>
+          </w:p>
+        </w:tc>
+        <w:tc>
+          <w:tcPr>
+            <w:tcW w:type="dxa" w:w="700"/>
+            <w:tcBorders>
+              <w:top w:val="single" w:color="BBBBBB" w:sz="4"/>
+              <w:left w:val="single" w:color="BBBBBB" w:sz="4"/>
+              <w:bottom w:val="single" w:color="BBBBBB" w:sz="4"/>
+              <w:right w:val="single" w:color="BBBBBB" w:sz="4"/>
+            </w:tcBorders>
+            <w:tcMar>
+              <w:top w:type="dxa" w:w="60"/>
+              <w:left w:type="dxa" w:w="100"/>
+              <w:bottom w:type="dxa" w:w="60"/>
+              <w:right w:type="dxa" w:w="100"/>
+            </w:tcMar>
+            <w:vAlign w:val="center"/>
+          </w:tcPr>
+          <w:p>
+            <w:pPr>
+              <w:spacing w:line="240" w:lineRule="auto"/>
+              <w:jc w:val="center"/>
+            </w:pPr>
+            <w:r>
+              <w:rPr>
+                <w:rFonts w:ascii="Arial" w:cs="Arial" w:eastAsia="Arial" w:hAnsi="Arial"/>
+                <w:b w:val="false"/>
+                <w:bCs w:val="false"/>
+                <w:sz w:val="18"/>
+                <w:szCs w:val="18"/>
+              </w:rPr>
+              <w:t xml:space="preserve">x</w:t>
+            </w:r>
+          </w:p>
+        </w:tc>
+        <w:tc>
+          <w:tcPr>
+            <w:tcW w:type="dxa" w:w="700"/>
+            <w:tcBorders>
+              <w:top w:val="single" w:color="BBBBBB" w:sz="4"/>
+              <w:left w:val="single" w:color="BBBBBB" w:sz="4"/>
+              <w:bottom w:val="single" w:color="BBBBBB" w:sz="4"/>
+              <w:right w:val="single" w:color="BBBBBB" w:sz="4"/>
+            </w:tcBorders>
+            <w:tcMar>
+              <w:top w:type="dxa" w:w="60"/>
+              <w:left w:type="dxa" w:w="100"/>
+              <w:bottom w:type="dxa" w:w="60"/>
+              <w:right w:type="dxa" w:w="100"/>
+            </w:tcMar>
+            <w:vAlign w:val="center"/>
+          </w:tcPr>
+          <w:p>
+            <w:pPr>
+              <w:spacing w:line="240" w:lineRule="auto"/>
+              <w:jc w:val="center"/>
+            </w:pPr>
+            <w:r>
+              <w:rPr>
+                <w:rFonts w:ascii="Arial" w:cs="Arial" w:eastAsia="Arial" w:hAnsi="Arial"/>
+                <w:b w:val="false"/>
+                <w:bCs w:val="false"/>
+                <w:sz w:val="18"/>
+                <w:szCs w:val="18"/>
+              </w:rPr>
+              <w:t xml:space="preserve">x</w:t>
+            </w:r>
+          </w:p>
+        </w:tc>
+      </w:tr>
+      <w:tr>
+        <w:tc>
+          <w:tcPr>
+            <w:tcW w:type="dxa" w:w="1500"/>
+            <w:tcBorders>
+              <w:top w:val="single" w:color="BBBBBB" w:sz="4"/>
+              <w:left w:val="single" w:color="BBBBBB" w:sz="4"/>
+              <w:bottom w:val="single" w:color="BBBBBB" w:sz="4"/>
+              <w:right w:val="single" w:color="BBBBBB" w:sz="4"/>
+            </w:tcBorders>
+            <w:tcMar>
+              <w:top w:type="dxa" w:w="60"/>
+              <w:left w:type="dxa" w:w="100"/>
+              <w:bottom w:type="dxa" w:w="60"/>
+              <w:right w:type="dxa" w:w="100"/>
+            </w:tcMar>
+            <w:vAlign w:val="center"/>
+          </w:tcPr>
+          <w:p>
+            <w:pPr>
+              <w:spacing w:line="240" w:lineRule="auto"/>
+              <w:jc w:val="center"/>
+            </w:pPr>
+            <w:r>
+              <w:rPr>
+                <w:rFonts w:ascii="Arial" w:cs="Arial" w:eastAsia="Arial" w:hAnsi="Arial"/>
+                <w:b w:val="false"/>
+                <w:bCs w:val="false"/>
+                <w:sz w:val="18"/>
+                <w:szCs w:val="18"/>
+              </w:rPr>
+              <w:t xml:space="preserve">10.03.2026</w:t>
+            </w:r>
+          </w:p>
+        </w:tc>
+        <w:tc>
+          <w:tcPr>
+            <w:tcW w:type="dxa" w:w="4337"/>
+            <w:tcBorders>
+              <w:top w:val="single" w:color="BBBBBB" w:sz="4"/>
+              <w:left w:val="single" w:color="BBBBBB" w:sz="4"/>
+              <w:bottom w:val="single" w:color="BBBBBB" w:sz="4"/>
+              <w:right w:val="single" w:color="BBBBBB" w:sz="4"/>
+            </w:tcBorders>
+            <w:tcMar>
+              <w:top w:type="dxa" w:w="60"/>
+              <w:left w:type="dxa" w:w="100"/>
+              <w:bottom w:type="dxa" w:w="60"/>
+              <w:right w:type="dxa" w:w="100"/>
+            </w:tcMar>
+            <w:vAlign w:val="center"/>
+          </w:tcPr>
+          <w:p>
+            <w:pPr>
+              <w:spacing w:line="240" w:lineRule="auto"/>
+              <w:jc w:val="left"/>
+            </w:pPr>
+            <w:r>
+              <w:rPr>
+                <w:rFonts w:ascii="Arial" w:cs="Arial" w:eastAsia="Arial" w:hAnsi="Arial"/>
+                <w:b w:val="false"/>
+                <w:bCs w:val="false"/>
+                <w:sz w:val="18"/>
+                <w:szCs w:val="18"/>
+              </w:rPr>
+              <w:t xml:space="preserve">Maus-Eingabe: Left-Click=Jump, Right-Click=Action</w:t>
+            </w:r>
+          </w:p>
+        </w:tc>
+        <w:tc>
+          <w:tcPr>
+            <w:tcW w:type="dxa" w:w="700"/>
+            <w:tcBorders>
+              <w:top w:val="single" w:color="BBBBBB" w:sz="4"/>
+              <w:left w:val="single" w:color="BBBBBB" w:sz="4"/>
+              <w:bottom w:val="single" w:color="BBBBBB" w:sz="4"/>
+              <w:right w:val="single" w:color="BBBBBB" w:sz="4"/>
+            </w:tcBorders>
+            <w:tcMar>
+              <w:top w:type="dxa" w:w="60"/>
+              <w:left w:type="dxa" w:w="100"/>
+              <w:bottom w:type="dxa" w:w="60"/>
+              <w:right w:type="dxa" w:w="100"/>
+            </w:tcMar>
+            <w:vAlign w:val="center"/>
+          </w:tcPr>
+          <w:p>
+            <w:pPr>
+              <w:spacing w:line="240" w:lineRule="auto"/>
+              <w:jc w:val="center"/>
+            </w:pPr>
+            <w:r>
+              <w:rPr>
+                <w:rFonts w:ascii="Arial" w:cs="Arial" w:eastAsia="Arial" w:hAnsi="Arial"/>
+                <w:b w:val="false"/>
+                <w:bCs w:val="false"/>
+                <w:sz w:val="18"/>
+                <w:szCs w:val="18"/>
+              </w:rPr>
+              <w:t xml:space="preserve">x</w:t>
+            </w:r>
+          </w:p>
+        </w:tc>
+        <w:tc>
+          <w:tcPr>
+            <w:tcW w:type="dxa" w:w="700"/>
+            <w:tcBorders>
+              <w:top w:val="single" w:color="BBBBBB" w:sz="4"/>
+              <w:left w:val="single" w:color="BBBBBB" w:sz="4"/>
+              <w:bottom w:val="single" w:color="BBBBBB" w:sz="4"/>
+              <w:right w:val="single" w:color="BBBBBB" w:sz="4"/>
+            </w:tcBorders>
+            <w:tcMar>
+              <w:top w:type="dxa" w:w="60"/>
+              <w:left w:type="dxa" w:w="100"/>
+              <w:bottom w:type="dxa" w:w="60"/>
+              <w:right w:type="dxa" w:w="100"/>
+            </w:tcMar>
+            <w:vAlign w:val="center"/>
+          </w:tcPr>
+          <w:p>
+            <w:pPr>
+              <w:spacing w:line="240" w:lineRule="auto"/>
+              <w:jc w:val="center"/>
+            </w:pPr>
+            <w:r>
+              <w:rPr>
+                <w:rFonts w:ascii="Arial" w:cs="Arial" w:eastAsia="Arial" w:hAnsi="Arial"/>
+                <w:b w:val="false"/>
+                <w:bCs w:val="false"/>
+                <w:sz w:val="18"/>
+                <w:szCs w:val="18"/>
+              </w:rPr>
+              <w:t xml:space="preserve">x</w:t>
+            </w:r>
+          </w:p>
+        </w:tc>
+        <w:tc>
+          <w:tcPr>
+            <w:tcW w:type="dxa" w:w="700"/>
+            <w:tcBorders>
+              <w:top w:val="single" w:color="BBBBBB" w:sz="4"/>
+              <w:left w:val="single" w:color="BBBBBB" w:sz="4"/>
+              <w:bottom w:val="single" w:color="BBBBBB" w:sz="4"/>
+              <w:right w:val="single" w:color="BBBBBB" w:sz="4"/>
+            </w:tcBorders>
+            <w:tcMar>
+              <w:top w:type="dxa" w:w="60"/>
+              <w:left w:type="dxa" w:w="100"/>
+              <w:bottom w:type="dxa" w:w="60"/>
+              <w:right w:type="dxa" w:w="100"/>
+            </w:tcMar>
+            <w:vAlign w:val="center"/>
+          </w:tcPr>
+          <w:p>
+            <w:pPr>
+              <w:spacing w:line="240" w:lineRule="auto"/>
+              <w:jc w:val="center"/>
+            </w:pPr>
+            <w:r>
+              <w:rPr>
+                <w:rFonts w:ascii="Arial" w:cs="Arial" w:eastAsia="Arial" w:hAnsi="Arial"/>
+                <w:b w:val="false"/>
+                <w:bCs w:val="false"/>
+                <w:sz w:val="18"/>
+                <w:szCs w:val="18"/>
+              </w:rPr>
+              <w:t xml:space="preserve">x</w:t>
+            </w:r>
+          </w:p>
+        </w:tc>
+      </w:tr>
+      <w:tr>
+        <w:tc>
+          <w:tcPr>
+            <w:tcW w:type="dxa" w:w="1500"/>
+            <w:tcBorders>
+              <w:top w:val="single" w:color="BBBBBB" w:sz="4"/>
+              <w:left w:val="single" w:color="BBBBBB" w:sz="4"/>
+              <w:bottom w:val="single" w:color="BBBBBB" w:sz="4"/>
+              <w:right w:val="single" w:color="BBBBBB" w:sz="4"/>
+            </w:tcBorders>
+            <w:tcMar>
+              <w:top w:type="dxa" w:w="60"/>
+              <w:left w:type="dxa" w:w="100"/>
+              <w:bottom w:type="dxa" w:w="60"/>
+              <w:right w:type="dxa" w:w="100"/>
+            </w:tcMar>
+            <w:vAlign w:val="center"/>
+          </w:tcPr>
+          <w:p>
+            <w:pPr>
+              <w:spacing w:line="240" w:lineRule="auto"/>
+              <w:jc w:val="center"/>
+            </w:pPr>
+            <w:r>
+              <w:rPr>
+                <w:rFonts w:ascii="Arial" w:cs="Arial" w:eastAsia="Arial" w:hAnsi="Arial"/>
+                <w:b w:val="false"/>
+                <w:bCs w:val="false"/>
+                <w:sz w:val="18"/>
+                <w:szCs w:val="18"/>
+              </w:rPr>
+              <w:t xml:space="preserve">11.03.2026</w:t>
+            </w:r>
+          </w:p>
+        </w:tc>
+        <w:tc>
+          <w:tcPr>
+            <w:tcW w:type="dxa" w:w="4337"/>
+            <w:tcBorders>
+              <w:top w:val="single" w:color="BBBBBB" w:sz="4"/>
+              <w:left w:val="single" w:color="BBBBBB" w:sz="4"/>
+              <w:bottom w:val="single" w:color="BBBBBB" w:sz="4"/>
+              <w:right w:val="single" w:color="BBBBBB" w:sz="4"/>
+            </w:tcBorders>
+            <w:tcMar>
+              <w:top w:type="dxa" w:w="60"/>
+              <w:left w:type="dxa" w:w="100"/>
+              <w:bottom w:type="dxa" w:w="60"/>
+              <w:right w:type="dxa" w:w="100"/>
+            </w:tcMar>
+            <w:vAlign w:val="center"/>
+          </w:tcPr>
+          <w:p>
+            <w:pPr>
+              <w:spacing w:line="240" w:lineRule="auto"/>
+              <w:jc w:val="left"/>
+            </w:pPr>
+            <w:r>
+              <w:rPr>
+                <w:rFonts w:ascii="Arial" w:cs="Arial" w:eastAsia="Arial" w:hAnsi="Arial"/>
+                <w:b w:val="false"/>
+                <w:bCs w:val="false"/>
+                <w:sz w:val="18"/>
+                <w:szCs w:val="18"/>
+              </w:rPr>
+              <w:t xml:space="preserve">Auto-Bounce entfernt: manuelle Sprung-Mechanik</w:t>
+            </w:r>
+          </w:p>
+        </w:tc>
+        <w:tc>
+          <w:tcPr>
+            <w:tcW w:type="dxa" w:w="700"/>
+            <w:tcBorders>
+              <w:top w:val="single" w:color="BBBBBB" w:sz="4"/>
+              <w:left w:val="single" w:color="BBBBBB" w:sz="4"/>
+              <w:bottom w:val="single" w:color="BBBBBB" w:sz="4"/>
+              <w:right w:val="single" w:color="BBBBBB" w:sz="4"/>
+            </w:tcBorders>
+            <w:tcMar>
+              <w:top w:type="dxa" w:w="60"/>
+              <w:left w:type="dxa" w:w="100"/>
+              <w:bottom w:type="dxa" w:w="60"/>
+              <w:right w:type="dxa" w:w="100"/>
+            </w:tcMar>
+            <w:vAlign w:val="center"/>
+          </w:tcPr>
+          <w:p>
+            <w:pPr>
+              <w:spacing w:line="240" w:lineRule="auto"/>
+              <w:jc w:val="center"/>
+            </w:pPr>
+            <w:r>
+              <w:rPr>
+                <w:rFonts w:ascii="Arial" w:cs="Arial" w:eastAsia="Arial" w:hAnsi="Arial"/>
+                <w:b w:val="false"/>
+                <w:bCs w:val="false"/>
+                <w:sz w:val="18"/>
+                <w:szCs w:val="18"/>
+              </w:rPr>
+              <w:t xml:space="preserve">x</w:t>
+            </w:r>
+          </w:p>
+        </w:tc>
+        <w:tc>
+          <w:tcPr>
+            <w:tcW w:type="dxa" w:w="700"/>
+            <w:tcBorders>
+              <w:top w:val="single" w:color="BBBBBB" w:sz="4"/>
+              <w:left w:val="single" w:color="BBBBBB" w:sz="4"/>
+              <w:bottom w:val="single" w:color="BBBBBB" w:sz="4"/>
+              <w:right w:val="single" w:color="BBBBBB" w:sz="4"/>
+            </w:tcBorders>
+            <w:tcMar>
+              <w:top w:type="dxa" w:w="60"/>
+              <w:left w:type="dxa" w:w="100"/>
+              <w:bottom w:type="dxa" w:w="60"/>
+              <w:right w:type="dxa" w:w="100"/>
+            </w:tcMar>
+            <w:vAlign w:val="center"/>
+          </w:tcPr>
+          <w:p>
+            <w:pPr>
+              <w:spacing w:line="240" w:lineRule="auto"/>
+              <w:jc w:val="center"/>
+            </w:pPr>
+            <w:r>
+              <w:rPr>
+                <w:rFonts w:ascii="Arial" w:cs="Arial" w:eastAsia="Arial" w:hAnsi="Arial"/>
+                <w:b w:val="false"/>
+                <w:bCs w:val="false"/>
+                <w:sz w:val="18"/>
+                <w:szCs w:val="18"/>
+              </w:rPr>
+              <w:t xml:space="preserve">x</w:t>
+            </w:r>
+          </w:p>
+        </w:tc>
+        <w:tc>
+          <w:tcPr>
+            <w:tcW w:type="dxa" w:w="700"/>
+            <w:tcBorders>
+              <w:top w:val="single" w:color="BBBBBB" w:sz="4"/>
+              <w:left w:val="single" w:color="BBBBBB" w:sz="4"/>
+              <w:bottom w:val="single" w:color="BBBBBB" w:sz="4"/>
+              <w:right w:val="single" w:color="BBBBBB" w:sz="4"/>
+            </w:tcBorders>
+            <w:tcMar>
+              <w:top w:type="dxa" w:w="60"/>
+              <w:left w:type="dxa" w:w="100"/>
+              <w:bottom w:type="dxa" w:w="60"/>
+              <w:right w:type="dxa" w:w="100"/>
+            </w:tcMar>
+            <w:vAlign w:val="center"/>
+          </w:tcPr>
+          <w:p>
+            <w:pPr>
+              <w:spacing w:line="240" w:lineRule="auto"/>
+              <w:jc w:val="center"/>
+            </w:pPr>
+            <w:r>
+              <w:rPr>
+                <w:rFonts w:ascii="Arial" w:cs="Arial" w:eastAsia="Arial" w:hAnsi="Arial"/>
+                <w:b w:val="false"/>
+                <w:bCs w:val="false"/>
+                <w:sz w:val="18"/>
+                <w:szCs w:val="18"/>
+              </w:rPr>
+              <w:t xml:space="preserve">x</w:t>
+            </w:r>
+          </w:p>
+        </w:tc>
+      </w:tr>
+      <w:tr>
+        <w:tc>
+          <w:tcPr>
+            <w:tcW w:type="dxa" w:w="1500"/>
+            <w:tcBorders>
+              <w:top w:val="single" w:color="BBBBBB" w:sz="4"/>
+              <w:left w:val="single" w:color="BBBBBB" w:sz="4"/>
+              <w:bottom w:val="single" w:color="BBBBBB" w:sz="4"/>
+              <w:right w:val="single" w:color="BBBBBB" w:sz="4"/>
+            </w:tcBorders>
+            <w:tcMar>
+              <w:top w:type="dxa" w:w="60"/>
+              <w:left w:type="dxa" w:w="100"/>
+              <w:bottom w:type="dxa" w:w="60"/>
+              <w:right w:type="dxa" w:w="100"/>
+            </w:tcMar>
+            <w:vAlign w:val="center"/>
+          </w:tcPr>
+          <w:p>
+            <w:pPr>
+              <w:spacing w:line="240" w:lineRule="auto"/>
+              <w:jc w:val="center"/>
+            </w:pPr>
+            <w:r>
+              <w:rPr>
+                <w:rFonts w:ascii="Arial" w:cs="Arial" w:eastAsia="Arial" w:hAnsi="Arial"/>
+                <w:b w:val="false"/>
+                <w:bCs w:val="false"/>
+                <w:sz w:val="18"/>
+                <w:szCs w:val="18"/>
+              </w:rPr>
+              <w:t xml:space="preserve">11.03.2026</w:t>
+            </w:r>
+          </w:p>
+        </w:tc>
+        <w:tc>
+          <w:tcPr>
+            <w:tcW w:type="dxa" w:w="4337"/>
+            <w:tcBorders>
+              <w:top w:val="single" w:color="BBBBBB" w:sz="4"/>
+              <w:left w:val="single" w:color="BBBBBB" w:sz="4"/>
+              <w:bottom w:val="single" w:color="BBBBBB" w:sz="4"/>
+              <w:right w:val="single" w:color="BBBBBB" w:sz="4"/>
+            </w:tcBorders>
+            <w:tcMar>
+              <w:top w:type="dxa" w:w="60"/>
+              <w:left w:type="dxa" w:w="100"/>
+              <w:bottom w:type="dxa" w:w="60"/>
+              <w:right w:type="dxa" w:w="100"/>
+            </w:tcMar>
+            <w:vAlign w:val="center"/>
+          </w:tcPr>
+          <w:p>
+            <w:pPr>
+              <w:spacing w:line="240" w:lineRule="auto"/>
+              <w:jc w:val="left"/>
+            </w:pPr>
+            <w:r>
+              <w:rPr>
+                <w:rFonts w:ascii="Arial" w:cs="Arial" w:eastAsia="Arial" w:hAnsi="Arial"/>
+                <w:b w:val="false"/>
+                <w:bCs w:val="false"/>
+                <w:sz w:val="18"/>
+                <w:szCs w:val="18"/>
+              </w:rPr>
+              <w:t xml:space="preserve">Walk-Animation integriert (walk_1/2, 150ms-Zyklus)</w:t>
+            </w:r>
+          </w:p>
+        </w:tc>
+        <w:tc>
+          <w:tcPr>
+            <w:tcW w:type="dxa" w:w="700"/>
+            <w:tcBorders>
+              <w:top w:val="single" w:color="BBBBBB" w:sz="4"/>
+              <w:left w:val="single" w:color="BBBBBB" w:sz="4"/>
+              <w:bottom w:val="single" w:color="BBBBBB" w:sz="4"/>
+              <w:right w:val="single" w:color="BBBBBB" w:sz="4"/>
+            </w:tcBorders>
+            <w:tcMar>
+              <w:top w:type="dxa" w:w="60"/>
+              <w:left w:type="dxa" w:w="100"/>
+              <w:bottom w:type="dxa" w:w="60"/>
+              <w:right w:type="dxa" w:w="100"/>
+            </w:tcMar>
+            <w:vAlign w:val="center"/>
+          </w:tcPr>
+          <w:p>
+            <w:pPr>
+              <w:spacing w:line="240" w:lineRule="auto"/>
+              <w:jc w:val="center"/>
+            </w:pPr>
+            <w:r>
+              <w:rPr>
+                <w:rFonts w:ascii="Arial" w:cs="Arial" w:eastAsia="Arial" w:hAnsi="Arial"/>
+                <w:b w:val="false"/>
+                <w:bCs w:val="false"/>
+                <w:sz w:val="18"/>
+                <w:szCs w:val="18"/>
+              </w:rPr>
+              <w:t xml:space="preserve">x</w:t>
+            </w:r>
+          </w:p>
+        </w:tc>
+        <w:tc>
+          <w:tcPr>
+            <w:tcW w:type="dxa" w:w="700"/>
+            <w:tcBorders>
+              <w:top w:val="single" w:color="BBBBBB" w:sz="4"/>
+              <w:left w:val="single" w:color="BBBBBB" w:sz="4"/>
+              <w:bottom w:val="single" w:color="BBBBBB" w:sz="4"/>
+              <w:right w:val="single" w:color="BBBBBB" w:sz="4"/>
+            </w:tcBorders>
+            <w:tcMar>
+              <w:top w:type="dxa" w:w="60"/>
+              <w:left w:type="dxa" w:w="100"/>
+              <w:bottom w:type="dxa" w:w="60"/>
+              <w:right w:type="dxa" w:w="100"/>
+            </w:tcMar>
+            <w:vAlign w:val="center"/>
+          </w:tcPr>
+          <w:p>
+            <w:pPr>
+              <w:spacing w:line="240" w:lineRule="auto"/>
+              <w:jc w:val="center"/>
+            </w:pPr>
+            <w:r>
+              <w:rPr>
+                <w:rFonts w:ascii="Arial" w:cs="Arial" w:eastAsia="Arial" w:hAnsi="Arial"/>
+                <w:b w:val="false"/>
+                <w:bCs w:val="false"/>
+                <w:sz w:val="18"/>
+                <w:szCs w:val="18"/>
+              </w:rPr>
+              <w:t xml:space="preserve">x</w:t>
+            </w:r>
+          </w:p>
+        </w:tc>
+        <w:tc>
+          <w:tcPr>
+            <w:tcW w:type="dxa" w:w="700"/>
+            <w:tcBorders>
+              <w:top w:val="single" w:color="BBBBBB" w:sz="4"/>
+              <w:left w:val="single" w:color="BBBBBB" w:sz="4"/>
+              <w:bottom w:val="single" w:color="BBBBBB" w:sz="4"/>
+              <w:right w:val="single" w:color="BBBBBB" w:sz="4"/>
+            </w:tcBorders>
+            <w:tcMar>
+              <w:top w:type="dxa" w:w="60"/>
+              <w:left w:type="dxa" w:w="100"/>
+              <w:bottom w:type="dxa" w:w="60"/>
+              <w:right w:type="dxa" w:w="100"/>
+            </w:tcMar>
+            <w:vAlign w:val="center"/>
+          </w:tcPr>
+          <w:p>
+            <w:pPr>
+              <w:spacing w:line="240" w:lineRule="auto"/>
+              <w:jc w:val="center"/>
+            </w:pPr>
+            <w:r>
+              <w:rPr>
+                <w:rFonts w:ascii="Arial" w:cs="Arial" w:eastAsia="Arial" w:hAnsi="Arial"/>
+                <w:b w:val="false"/>
+                <w:bCs w:val="false"/>
+                <w:sz w:val="18"/>
+                <w:szCs w:val="18"/>
+              </w:rPr>
+              <w:t xml:space="preserve">x</w:t>
+            </w:r>
+          </w:p>
+        </w:tc>
+      </w:tr>
+      <w:tr>
+        <w:tc>
+          <w:tcPr>
+            <w:tcW w:type="dxa" w:w="1500"/>
+            <w:tcBorders>
+              <w:top w:val="single" w:color="BBBBBB" w:sz="4"/>
+              <w:left w:val="single" w:color="BBBBBB" w:sz="4"/>
+              <w:bottom w:val="single" w:color="BBBBBB" w:sz="4"/>
+              <w:right w:val="single" w:color="BBBBBB" w:sz="4"/>
+            </w:tcBorders>
+            <w:tcMar>
+              <w:top w:type="dxa" w:w="60"/>
+              <w:left w:type="dxa" w:w="100"/>
+              <w:bottom w:type="dxa" w:w="60"/>
+              <w:right w:type="dxa" w:w="100"/>
+            </w:tcMar>
+            <w:vAlign w:val="center"/>
+          </w:tcPr>
+          <w:p>
+            <w:pPr>
+              <w:spacing w:line="240" w:lineRule="auto"/>
+              <w:jc w:val="center"/>
+            </w:pPr>
+            <w:r>
+              <w:rPr>
+                <w:rFonts w:ascii="Arial" w:cs="Arial" w:eastAsia="Arial" w:hAnsi="Arial"/>
+                <w:b w:val="false"/>
+                <w:bCs w:val="false"/>
+                <w:sz w:val="18"/>
+                <w:szCs w:val="18"/>
+              </w:rPr>
+              <w:t xml:space="preserve">11.03.2026</w:t>
+            </w:r>
+          </w:p>
+        </w:tc>
+        <w:tc>
+          <w:tcPr>
+            <w:tcW w:type="dxa" w:w="4337"/>
+            <w:tcBorders>
+              <w:top w:val="single" w:color="BBBBBB" w:sz="4"/>
+              <w:left w:val="single" w:color="BBBBBB" w:sz="4"/>
+              <w:bottom w:val="single" w:color="BBBBBB" w:sz="4"/>
+              <w:right w:val="single" w:color="BBBBBB" w:sz="4"/>
+            </w:tcBorders>
+            <w:tcMar>
+              <w:top w:type="dxa" w:w="60"/>
+              <w:left w:type="dxa" w:w="100"/>
+              <w:bottom w:type="dxa" w:w="60"/>
+              <w:right w:type="dxa" w:w="100"/>
+            </w:tcMar>
+            <w:vAlign w:val="center"/>
+          </w:tcPr>
+          <w:p>
+            <w:pPr>
+              <w:spacing w:line="240" w:lineRule="auto"/>
+              <w:jc w:val="left"/>
+            </w:pPr>
+            <w:r>
+              <w:rPr>
+                <w:rFonts w:ascii="Arial" w:cs="Arial" w:eastAsia="Arial" w:hAnsi="Arial"/>
+                <w:b w:val="false"/>
+                <w:bCs w:val="false"/>
+                <w:sz w:val="18"/>
+                <w:szCs w:val="18"/>
+              </w:rPr>
+              <w:t xml:space="preserve">Sprite Y-Offsets: PIL alpha-scan, per-Frame-System</w:t>
             </w:r>
           </w:p>
         </w:tc>

</xml_diff>

<commit_message>
feat(L1+HUD): rebuild L1 background from separate sprites, cat lives icon
L1 background: replaced composite Entrance_Garbage with 5 individual
sprites (building_wall, trash-bin, Cornice, Building_Roof, building-door).
Wall tiles brick-only above ground (no sidewalk repeat), stops at roof.
Cornice raised 95px. Colliders updated to match visual positions.

HUD: hearts replaced with cat_beishe.png icon (repeated, max 9).
New assets: extra-life balloon + plush catch sprite in interactible_objects.

Docs: 4→3 levels, Wurf→Push rename, hazard types, crumble color fix,
variable jump values. Arbeitsprotokoll updated for 16.03.2026.

Co-Authored-By: Claude Opus 4.6 <noreply@anthropic.com>
</commit_message>
<xml_diff>
--- a/Dokumente_Schule/Ausgefuellt/Arbeitsprotokoll_Julian_Gomez.docx
+++ b/Dokumente_Schule/Ausgefuellt/Arbeitsprotokoll_Julian_Gomez.docx
@@ -7199,6 +7199,2070 @@
                 <w:szCs w:val="18"/>
               </w:rPr>
               <w:t xml:space="preserve">Sprung-Tuning: Min -520 px/s, Boost 900/0.20s</w:t>
+            </w:r>
+          </w:p>
+        </w:tc>
+        <w:tc>
+          <w:tcPr>
+            <w:tcW w:type="dxa" w:w="700"/>
+            <w:tcBorders>
+              <w:top w:val="single" w:color="BBBBBB" w:sz="4"/>
+              <w:left w:val="single" w:color="BBBBBB" w:sz="4"/>
+              <w:bottom w:val="single" w:color="BBBBBB" w:sz="4"/>
+              <w:right w:val="single" w:color="BBBBBB" w:sz="4"/>
+            </w:tcBorders>
+            <w:tcMar>
+              <w:top w:type="dxa" w:w="60"/>
+              <w:left w:type="dxa" w:w="100"/>
+              <w:bottom w:type="dxa" w:w="60"/>
+              <w:right w:type="dxa" w:w="100"/>
+            </w:tcMar>
+            <w:vAlign w:val="center"/>
+          </w:tcPr>
+          <w:p>
+            <w:pPr>
+              <w:spacing w:line="240" w:lineRule="auto"/>
+              <w:jc w:val="center"/>
+            </w:pPr>
+            <w:r>
+              <w:rPr>
+                <w:rFonts w:ascii="Arial" w:cs="Arial" w:eastAsia="Arial" w:hAnsi="Arial"/>
+                <w:b w:val="false"/>
+                <w:bCs w:val="false"/>
+                <w:sz w:val="18"/>
+                <w:szCs w:val="18"/>
+              </w:rPr>
+              <w:t xml:space="preserve">x</w:t>
+            </w:r>
+          </w:p>
+        </w:tc>
+        <w:tc>
+          <w:tcPr>
+            <w:tcW w:type="dxa" w:w="700"/>
+            <w:tcBorders>
+              <w:top w:val="single" w:color="BBBBBB" w:sz="4"/>
+              <w:left w:val="single" w:color="BBBBBB" w:sz="4"/>
+              <w:bottom w:val="single" w:color="BBBBBB" w:sz="4"/>
+              <w:right w:val="single" w:color="BBBBBB" w:sz="4"/>
+            </w:tcBorders>
+            <w:tcMar>
+              <w:top w:type="dxa" w:w="60"/>
+              <w:left w:type="dxa" w:w="100"/>
+              <w:bottom w:type="dxa" w:w="60"/>
+              <w:right w:type="dxa" w:w="100"/>
+            </w:tcMar>
+            <w:vAlign w:val="center"/>
+          </w:tcPr>
+          <w:p>
+            <w:pPr>
+              <w:spacing w:line="240" w:lineRule="auto"/>
+              <w:jc w:val="center"/>
+            </w:pPr>
+            <w:r>
+              <w:rPr>
+                <w:rFonts w:ascii="Arial" w:cs="Arial" w:eastAsia="Arial" w:hAnsi="Arial"/>
+                <w:b w:val="false"/>
+                <w:bCs w:val="false"/>
+                <w:sz w:val="18"/>
+                <w:szCs w:val="18"/>
+              </w:rPr>
+              <w:t xml:space="preserve">x</w:t>
+            </w:r>
+          </w:p>
+        </w:tc>
+        <w:tc>
+          <w:tcPr>
+            <w:tcW w:type="dxa" w:w="700"/>
+            <w:tcBorders>
+              <w:top w:val="single" w:color="BBBBBB" w:sz="4"/>
+              <w:left w:val="single" w:color="BBBBBB" w:sz="4"/>
+              <w:bottom w:val="single" w:color="BBBBBB" w:sz="4"/>
+              <w:right w:val="single" w:color="BBBBBB" w:sz="4"/>
+            </w:tcBorders>
+            <w:tcMar>
+              <w:top w:type="dxa" w:w="60"/>
+              <w:left w:type="dxa" w:w="100"/>
+              <w:bottom w:type="dxa" w:w="60"/>
+              <w:right w:type="dxa" w:w="100"/>
+            </w:tcMar>
+            <w:vAlign w:val="center"/>
+          </w:tcPr>
+          <w:p>
+            <w:pPr>
+              <w:spacing w:line="240" w:lineRule="auto"/>
+              <w:jc w:val="center"/>
+            </w:pPr>
+            <w:r>
+              <w:rPr>
+                <w:rFonts w:ascii="Arial" w:cs="Arial" w:eastAsia="Arial" w:hAnsi="Arial"/>
+                <w:b w:val="false"/>
+                <w:bCs w:val="false"/>
+                <w:sz w:val="18"/>
+                <w:szCs w:val="18"/>
+              </w:rPr>
+              <w:t xml:space="preserve">x</w:t>
+            </w:r>
+          </w:p>
+        </w:tc>
+      </w:tr>
+      <w:tr>
+        <w:tc>
+          <w:tcPr>
+            <w:tcW w:type="dxa" w:w="1500"/>
+            <w:tcBorders>
+              <w:top w:val="single" w:color="BBBBBB" w:sz="4"/>
+              <w:left w:val="single" w:color="BBBBBB" w:sz="4"/>
+              <w:bottom w:val="single" w:color="BBBBBB" w:sz="4"/>
+              <w:right w:val="single" w:color="BBBBBB" w:sz="4"/>
+            </w:tcBorders>
+            <w:tcMar>
+              <w:top w:type="dxa" w:w="60"/>
+              <w:left w:type="dxa" w:w="100"/>
+              <w:bottom w:type="dxa" w:w="60"/>
+              <w:right w:type="dxa" w:w="100"/>
+            </w:tcMar>
+            <w:vAlign w:val="center"/>
+          </w:tcPr>
+          <w:p>
+            <w:pPr>
+              <w:spacing w:line="240" w:lineRule="auto"/>
+              <w:jc w:val="center"/>
+            </w:pPr>
+            <w:r>
+              <w:rPr>
+                <w:rFonts w:ascii="Arial" w:cs="Arial" w:eastAsia="Arial" w:hAnsi="Arial"/>
+                <w:b w:val="false"/>
+                <w:bCs w:val="false"/>
+                <w:sz w:val="18"/>
+                <w:szCs w:val="18"/>
+              </w:rPr>
+              <w:t xml:space="preserve">16.03.2026</w:t>
+            </w:r>
+          </w:p>
+        </w:tc>
+        <w:tc>
+          <w:tcPr>
+            <w:tcW w:type="dxa" w:w="4337"/>
+            <w:tcBorders>
+              <w:top w:val="single" w:color="BBBBBB" w:sz="4"/>
+              <w:left w:val="single" w:color="BBBBBB" w:sz="4"/>
+              <w:bottom w:val="single" w:color="BBBBBB" w:sz="4"/>
+              <w:right w:val="single" w:color="BBBBBB" w:sz="4"/>
+            </w:tcBorders>
+            <w:tcMar>
+              <w:top w:type="dxa" w:w="60"/>
+              <w:left w:type="dxa" w:w="100"/>
+              <w:bottom w:type="dxa" w:w="60"/>
+              <w:right w:type="dxa" w:w="100"/>
+            </w:tcMar>
+            <w:vAlign w:val="center"/>
+          </w:tcPr>
+          <w:p>
+            <w:pPr>
+              <w:spacing w:line="240" w:lineRule="auto"/>
+              <w:jc w:val="left"/>
+            </w:pPr>
+            <w:r>
+              <w:rPr>
+                <w:rFonts w:ascii="Arial" w:cs="Arial" w:eastAsia="Arial" w:hAnsi="Arial"/>
+                <w:b w:val="false"/>
+                <w:bCs w:val="false"/>
+                <w:sz w:val="18"/>
+                <w:szCs w:val="18"/>
+              </w:rPr>
+              <w:t xml:space="preserve">Hazard-Rename: water-Objekt zu hazard + Eigenschaftsnamen</w:t>
+            </w:r>
+          </w:p>
+        </w:tc>
+        <w:tc>
+          <w:tcPr>
+            <w:tcW w:type="dxa" w:w="700"/>
+            <w:tcBorders>
+              <w:top w:val="single" w:color="BBBBBB" w:sz="4"/>
+              <w:left w:val="single" w:color="BBBBBB" w:sz="4"/>
+              <w:bottom w:val="single" w:color="BBBBBB" w:sz="4"/>
+              <w:right w:val="single" w:color="BBBBBB" w:sz="4"/>
+            </w:tcBorders>
+            <w:tcMar>
+              <w:top w:type="dxa" w:w="60"/>
+              <w:left w:type="dxa" w:w="100"/>
+              <w:bottom w:type="dxa" w:w="60"/>
+              <w:right w:type="dxa" w:w="100"/>
+            </w:tcMar>
+            <w:vAlign w:val="center"/>
+          </w:tcPr>
+          <w:p>
+            <w:pPr>
+              <w:spacing w:line="240" w:lineRule="auto"/>
+              <w:jc w:val="center"/>
+            </w:pPr>
+            <w:r>
+              <w:rPr>
+                <w:rFonts w:ascii="Arial" w:cs="Arial" w:eastAsia="Arial" w:hAnsi="Arial"/>
+                <w:b w:val="false"/>
+                <w:bCs w:val="false"/>
+                <w:sz w:val="18"/>
+                <w:szCs w:val="18"/>
+              </w:rPr>
+              <w:t xml:space="preserve">x</w:t>
+            </w:r>
+          </w:p>
+        </w:tc>
+        <w:tc>
+          <w:tcPr>
+            <w:tcW w:type="dxa" w:w="700"/>
+            <w:tcBorders>
+              <w:top w:val="single" w:color="BBBBBB" w:sz="4"/>
+              <w:left w:val="single" w:color="BBBBBB" w:sz="4"/>
+              <w:bottom w:val="single" w:color="BBBBBB" w:sz="4"/>
+              <w:right w:val="single" w:color="BBBBBB" w:sz="4"/>
+            </w:tcBorders>
+            <w:tcMar>
+              <w:top w:type="dxa" w:w="60"/>
+              <w:left w:type="dxa" w:w="100"/>
+              <w:bottom w:type="dxa" w:w="60"/>
+              <w:right w:type="dxa" w:w="100"/>
+            </w:tcMar>
+            <w:vAlign w:val="center"/>
+          </w:tcPr>
+          <w:p>
+            <w:pPr>
+              <w:spacing w:line="240" w:lineRule="auto"/>
+              <w:jc w:val="center"/>
+            </w:pPr>
+            <w:r>
+              <w:rPr>
+                <w:rFonts w:ascii="Arial" w:cs="Arial" w:eastAsia="Arial" w:hAnsi="Arial"/>
+                <w:b w:val="false"/>
+                <w:bCs w:val="false"/>
+                <w:sz w:val="18"/>
+                <w:szCs w:val="18"/>
+              </w:rPr>
+              <w:t xml:space="preserve">x</w:t>
+            </w:r>
+          </w:p>
+        </w:tc>
+        <w:tc>
+          <w:tcPr>
+            <w:tcW w:type="dxa" w:w="700"/>
+            <w:tcBorders>
+              <w:top w:val="single" w:color="BBBBBB" w:sz="4"/>
+              <w:left w:val="single" w:color="BBBBBB" w:sz="4"/>
+              <w:bottom w:val="single" w:color="BBBBBB" w:sz="4"/>
+              <w:right w:val="single" w:color="BBBBBB" w:sz="4"/>
+            </w:tcBorders>
+            <w:tcMar>
+              <w:top w:type="dxa" w:w="60"/>
+              <w:left w:type="dxa" w:w="100"/>
+              <w:bottom w:type="dxa" w:w="60"/>
+              <w:right w:type="dxa" w:w="100"/>
+            </w:tcMar>
+            <w:vAlign w:val="center"/>
+          </w:tcPr>
+          <w:p>
+            <w:pPr>
+              <w:spacing w:line="240" w:lineRule="auto"/>
+              <w:jc w:val="center"/>
+            </w:pPr>
+            <w:r>
+              <w:rPr>
+                <w:rFonts w:ascii="Arial" w:cs="Arial" w:eastAsia="Arial" w:hAnsi="Arial"/>
+                <w:b w:val="false"/>
+                <w:bCs w:val="false"/>
+                <w:sz w:val="18"/>
+                <w:szCs w:val="18"/>
+              </w:rPr>
+              <w:t xml:space="preserve">x</w:t>
+            </w:r>
+          </w:p>
+        </w:tc>
+      </w:tr>
+      <w:tr>
+        <w:tc>
+          <w:tcPr>
+            <w:tcW w:type="dxa" w:w="1500"/>
+            <w:tcBorders>
+              <w:top w:val="single" w:color="BBBBBB" w:sz="4"/>
+              <w:left w:val="single" w:color="BBBBBB" w:sz="4"/>
+              <w:bottom w:val="single" w:color="BBBBBB" w:sz="4"/>
+              <w:right w:val="single" w:color="BBBBBB" w:sz="4"/>
+            </w:tcBorders>
+            <w:tcMar>
+              <w:top w:type="dxa" w:w="60"/>
+              <w:left w:type="dxa" w:w="100"/>
+              <w:bottom w:type="dxa" w:w="60"/>
+              <w:right w:type="dxa" w:w="100"/>
+            </w:tcMar>
+            <w:vAlign w:val="center"/>
+          </w:tcPr>
+          <w:p>
+            <w:pPr>
+              <w:spacing w:line="240" w:lineRule="auto"/>
+              <w:jc w:val="center"/>
+            </w:pPr>
+            <w:r>
+              <w:rPr>
+                <w:rFonts w:ascii="Arial" w:cs="Arial" w:eastAsia="Arial" w:hAnsi="Arial"/>
+                <w:b w:val="false"/>
+                <w:bCs w:val="false"/>
+                <w:sz w:val="18"/>
+                <w:szCs w:val="18"/>
+              </w:rPr>
+              <w:t xml:space="preserve">16.03.2026</w:t>
+            </w:r>
+          </w:p>
+        </w:tc>
+        <w:tc>
+          <w:tcPr>
+            <w:tcW w:type="dxa" w:w="4337"/>
+            <w:tcBorders>
+              <w:top w:val="single" w:color="BBBBBB" w:sz="4"/>
+              <w:left w:val="single" w:color="BBBBBB" w:sz="4"/>
+              <w:bottom w:val="single" w:color="BBBBBB" w:sz="4"/>
+              <w:right w:val="single" w:color="BBBBBB" w:sz="4"/>
+            </w:tcBorders>
+            <w:tcMar>
+              <w:top w:type="dxa" w:w="60"/>
+              <w:left w:type="dxa" w:w="100"/>
+              <w:bottom w:type="dxa" w:w="60"/>
+              <w:right w:type="dxa" w:w="100"/>
+            </w:tcMar>
+            <w:vAlign w:val="center"/>
+          </w:tcPr>
+          <w:p>
+            <w:pPr>
+              <w:spacing w:line="240" w:lineRule="auto"/>
+              <w:jc w:val="left"/>
+            </w:pPr>
+            <w:r>
+              <w:rPr>
+                <w:rFonts w:ascii="Arial" w:cs="Arial" w:eastAsia="Arial" w:hAnsi="Arial"/>
+                <w:b w:val="false"/>
+                <w:bCs w:val="false"/>
+                <w:sz w:val="18"/>
+                <w:szCs w:val="18"/>
+              </w:rPr>
+              <w:t xml:space="preserve">Hazard-Renderer: Smog (L1), Flut (L2), Elektrizitaet (L3)</w:t>
+            </w:r>
+          </w:p>
+        </w:tc>
+        <w:tc>
+          <w:tcPr>
+            <w:tcW w:type="dxa" w:w="700"/>
+            <w:tcBorders>
+              <w:top w:val="single" w:color="BBBBBB" w:sz="4"/>
+              <w:left w:val="single" w:color="BBBBBB" w:sz="4"/>
+              <w:bottom w:val="single" w:color="BBBBBB" w:sz="4"/>
+              <w:right w:val="single" w:color="BBBBBB" w:sz="4"/>
+            </w:tcBorders>
+            <w:tcMar>
+              <w:top w:type="dxa" w:w="60"/>
+              <w:left w:type="dxa" w:w="100"/>
+              <w:bottom w:type="dxa" w:w="60"/>
+              <w:right w:type="dxa" w:w="100"/>
+            </w:tcMar>
+            <w:vAlign w:val="center"/>
+          </w:tcPr>
+          <w:p>
+            <w:pPr>
+              <w:spacing w:line="240" w:lineRule="auto"/>
+              <w:jc w:val="center"/>
+            </w:pPr>
+            <w:r>
+              <w:rPr>
+                <w:rFonts w:ascii="Arial" w:cs="Arial" w:eastAsia="Arial" w:hAnsi="Arial"/>
+                <w:b w:val="false"/>
+                <w:bCs w:val="false"/>
+                <w:sz w:val="18"/>
+                <w:szCs w:val="18"/>
+              </w:rPr>
+              <w:t xml:space="preserve">x</w:t>
+            </w:r>
+          </w:p>
+        </w:tc>
+        <w:tc>
+          <w:tcPr>
+            <w:tcW w:type="dxa" w:w="700"/>
+            <w:tcBorders>
+              <w:top w:val="single" w:color="BBBBBB" w:sz="4"/>
+              <w:left w:val="single" w:color="BBBBBB" w:sz="4"/>
+              <w:bottom w:val="single" w:color="BBBBBB" w:sz="4"/>
+              <w:right w:val="single" w:color="BBBBBB" w:sz="4"/>
+            </w:tcBorders>
+            <w:tcMar>
+              <w:top w:type="dxa" w:w="60"/>
+              <w:left w:type="dxa" w:w="100"/>
+              <w:bottom w:type="dxa" w:w="60"/>
+              <w:right w:type="dxa" w:w="100"/>
+            </w:tcMar>
+            <w:vAlign w:val="center"/>
+          </w:tcPr>
+          <w:p>
+            <w:pPr>
+              <w:spacing w:line="240" w:lineRule="auto"/>
+              <w:jc w:val="center"/>
+            </w:pPr>
+            <w:r>
+              <w:rPr>
+                <w:rFonts w:ascii="Arial" w:cs="Arial" w:eastAsia="Arial" w:hAnsi="Arial"/>
+                <w:b w:val="false"/>
+                <w:bCs w:val="false"/>
+                <w:sz w:val="18"/>
+                <w:szCs w:val="18"/>
+              </w:rPr>
+              <w:t xml:space="preserve">x</w:t>
+            </w:r>
+          </w:p>
+        </w:tc>
+        <w:tc>
+          <w:tcPr>
+            <w:tcW w:type="dxa" w:w="700"/>
+            <w:tcBorders>
+              <w:top w:val="single" w:color="BBBBBB" w:sz="4"/>
+              <w:left w:val="single" w:color="BBBBBB" w:sz="4"/>
+              <w:bottom w:val="single" w:color="BBBBBB" w:sz="4"/>
+              <w:right w:val="single" w:color="BBBBBB" w:sz="4"/>
+            </w:tcBorders>
+            <w:tcMar>
+              <w:top w:type="dxa" w:w="60"/>
+              <w:left w:type="dxa" w:w="100"/>
+              <w:bottom w:type="dxa" w:w="60"/>
+              <w:right w:type="dxa" w:w="100"/>
+            </w:tcMar>
+            <w:vAlign w:val="center"/>
+          </w:tcPr>
+          <w:p>
+            <w:pPr>
+              <w:spacing w:line="240" w:lineRule="auto"/>
+              <w:jc w:val="center"/>
+            </w:pPr>
+            <w:r>
+              <w:rPr>
+                <w:rFonts w:ascii="Arial" w:cs="Arial" w:eastAsia="Arial" w:hAnsi="Arial"/>
+                <w:b w:val="false"/>
+                <w:bCs w:val="false"/>
+                <w:sz w:val="18"/>
+                <w:szCs w:val="18"/>
+              </w:rPr>
+              <w:t xml:space="preserve">x</w:t>
+            </w:r>
+          </w:p>
+        </w:tc>
+      </w:tr>
+      <w:tr>
+        <w:tc>
+          <w:tcPr>
+            <w:tcW w:type="dxa" w:w="1500"/>
+            <w:tcBorders>
+              <w:top w:val="single" w:color="BBBBBB" w:sz="4"/>
+              <w:left w:val="single" w:color="BBBBBB" w:sz="4"/>
+              <w:bottom w:val="single" w:color="BBBBBB" w:sz="4"/>
+              <w:right w:val="single" w:color="BBBBBB" w:sz="4"/>
+            </w:tcBorders>
+            <w:tcMar>
+              <w:top w:type="dxa" w:w="60"/>
+              <w:left w:type="dxa" w:w="100"/>
+              <w:bottom w:type="dxa" w:w="60"/>
+              <w:right w:type="dxa" w:w="100"/>
+            </w:tcMar>
+            <w:vAlign w:val="center"/>
+          </w:tcPr>
+          <w:p>
+            <w:pPr>
+              <w:spacing w:line="240" w:lineRule="auto"/>
+              <w:jc w:val="center"/>
+            </w:pPr>
+            <w:r>
+              <w:rPr>
+                <w:rFonts w:ascii="Arial" w:cs="Arial" w:eastAsia="Arial" w:hAnsi="Arial"/>
+                <w:b w:val="false"/>
+                <w:bCs w:val="false"/>
+                <w:sz w:val="18"/>
+                <w:szCs w:val="18"/>
+              </w:rPr>
+              <w:t xml:space="preserve">16.03.2026</w:t>
+            </w:r>
+          </w:p>
+        </w:tc>
+        <w:tc>
+          <w:tcPr>
+            <w:tcW w:type="dxa" w:w="4337"/>
+            <w:tcBorders>
+              <w:top w:val="single" w:color="BBBBBB" w:sz="4"/>
+              <w:left w:val="single" w:color="BBBBBB" w:sz="4"/>
+              <w:bottom w:val="single" w:color="BBBBBB" w:sz="4"/>
+              <w:right w:val="single" w:color="BBBBBB" w:sz="4"/>
+            </w:tcBorders>
+            <w:tcMar>
+              <w:top w:type="dxa" w:w="60"/>
+              <w:left w:type="dxa" w:w="100"/>
+              <w:bottom w:type="dxa" w:w="60"/>
+              <w:right w:type="dxa" w:w="100"/>
+            </w:tcMar>
+            <w:vAlign w:val="center"/>
+          </w:tcPr>
+          <w:p>
+            <w:pPr>
+              <w:spacing w:line="240" w:lineRule="auto"/>
+              <w:jc w:val="left"/>
+            </w:pPr>
+            <w:r>
+              <w:rPr>
+                <w:rFonts w:ascii="Arial" w:cs="Arial" w:eastAsia="Arial" w:hAnsi="Arial"/>
+                <w:b w:val="false"/>
+                <w:bCs w:val="false"/>
+                <w:sz w:val="18"/>
+                <w:szCs w:val="18"/>
+              </w:rPr>
+              <w:t xml:space="preserve">Konstanten-Taxonomie: HAZARD_* (shared) vs FLOOD_WAVE_*</w:t>
+            </w:r>
+          </w:p>
+        </w:tc>
+        <w:tc>
+          <w:tcPr>
+            <w:tcW w:type="dxa" w:w="700"/>
+            <w:tcBorders>
+              <w:top w:val="single" w:color="BBBBBB" w:sz="4"/>
+              <w:left w:val="single" w:color="BBBBBB" w:sz="4"/>
+              <w:bottom w:val="single" w:color="BBBBBB" w:sz="4"/>
+              <w:right w:val="single" w:color="BBBBBB" w:sz="4"/>
+            </w:tcBorders>
+            <w:tcMar>
+              <w:top w:type="dxa" w:w="60"/>
+              <w:left w:type="dxa" w:w="100"/>
+              <w:bottom w:type="dxa" w:w="60"/>
+              <w:right w:type="dxa" w:w="100"/>
+            </w:tcMar>
+            <w:vAlign w:val="center"/>
+          </w:tcPr>
+          <w:p>
+            <w:pPr>
+              <w:spacing w:line="240" w:lineRule="auto"/>
+              <w:jc w:val="center"/>
+            </w:pPr>
+            <w:r>
+              <w:rPr>
+                <w:rFonts w:ascii="Arial" w:cs="Arial" w:eastAsia="Arial" w:hAnsi="Arial"/>
+                <w:b w:val="false"/>
+                <w:bCs w:val="false"/>
+                <w:sz w:val="18"/>
+                <w:szCs w:val="18"/>
+              </w:rPr>
+              <w:t xml:space="preserve">x</w:t>
+            </w:r>
+          </w:p>
+        </w:tc>
+        <w:tc>
+          <w:tcPr>
+            <w:tcW w:type="dxa" w:w="700"/>
+            <w:tcBorders>
+              <w:top w:val="single" w:color="BBBBBB" w:sz="4"/>
+              <w:left w:val="single" w:color="BBBBBB" w:sz="4"/>
+              <w:bottom w:val="single" w:color="BBBBBB" w:sz="4"/>
+              <w:right w:val="single" w:color="BBBBBB" w:sz="4"/>
+            </w:tcBorders>
+            <w:tcMar>
+              <w:top w:type="dxa" w:w="60"/>
+              <w:left w:type="dxa" w:w="100"/>
+              <w:bottom w:type="dxa" w:w="60"/>
+              <w:right w:type="dxa" w:w="100"/>
+            </w:tcMar>
+            <w:vAlign w:val="center"/>
+          </w:tcPr>
+          <w:p>
+            <w:pPr>
+              <w:spacing w:line="240" w:lineRule="auto"/>
+              <w:jc w:val="center"/>
+            </w:pPr>
+            <w:r>
+              <w:rPr>
+                <w:rFonts w:ascii="Arial" w:cs="Arial" w:eastAsia="Arial" w:hAnsi="Arial"/>
+                <w:b w:val="false"/>
+                <w:bCs w:val="false"/>
+                <w:sz w:val="18"/>
+                <w:szCs w:val="18"/>
+              </w:rPr>
+              <w:t xml:space="preserve">x</w:t>
+            </w:r>
+          </w:p>
+        </w:tc>
+        <w:tc>
+          <w:tcPr>
+            <w:tcW w:type="dxa" w:w="700"/>
+            <w:tcBorders>
+              <w:top w:val="single" w:color="BBBBBB" w:sz="4"/>
+              <w:left w:val="single" w:color="BBBBBB" w:sz="4"/>
+              <w:bottom w:val="single" w:color="BBBBBB" w:sz="4"/>
+              <w:right w:val="single" w:color="BBBBBB" w:sz="4"/>
+            </w:tcBorders>
+            <w:tcMar>
+              <w:top w:type="dxa" w:w="60"/>
+              <w:left w:type="dxa" w:w="100"/>
+              <w:bottom w:type="dxa" w:w="60"/>
+              <w:right w:type="dxa" w:w="100"/>
+            </w:tcMar>
+            <w:vAlign w:val="center"/>
+          </w:tcPr>
+          <w:p>
+            <w:pPr>
+              <w:spacing w:line="240" w:lineRule="auto"/>
+              <w:jc w:val="center"/>
+            </w:pPr>
+            <w:r>
+              <w:rPr>
+                <w:rFonts w:ascii="Arial" w:cs="Arial" w:eastAsia="Arial" w:hAnsi="Arial"/>
+                <w:b w:val="false"/>
+                <w:bCs w:val="false"/>
+                <w:sz w:val="18"/>
+                <w:szCs w:val="18"/>
+              </w:rPr>
+              <w:t xml:space="preserve">x</w:t>
+            </w:r>
+          </w:p>
+        </w:tc>
+      </w:tr>
+      <w:tr>
+        <w:tc>
+          <w:tcPr>
+            <w:tcW w:type="dxa" w:w="1500"/>
+            <w:tcBorders>
+              <w:top w:val="single" w:color="BBBBBB" w:sz="4"/>
+              <w:left w:val="single" w:color="BBBBBB" w:sz="4"/>
+              <w:bottom w:val="single" w:color="BBBBBB" w:sz="4"/>
+              <w:right w:val="single" w:color="BBBBBB" w:sz="4"/>
+            </w:tcBorders>
+            <w:tcMar>
+              <w:top w:type="dxa" w:w="60"/>
+              <w:left w:type="dxa" w:w="100"/>
+              <w:bottom w:type="dxa" w:w="60"/>
+              <w:right w:type="dxa" w:w="100"/>
+            </w:tcMar>
+            <w:vAlign w:val="center"/>
+          </w:tcPr>
+          <w:p>
+            <w:pPr>
+              <w:spacing w:line="240" w:lineRule="auto"/>
+              <w:jc w:val="center"/>
+            </w:pPr>
+            <w:r>
+              <w:rPr>
+                <w:rFonts w:ascii="Arial" w:cs="Arial" w:eastAsia="Arial" w:hAnsi="Arial"/>
+                <w:b w:val="false"/>
+                <w:bCs w:val="false"/>
+                <w:sz w:val="18"/>
+                <w:szCs w:val="18"/>
+              </w:rPr>
+              <w:t xml:space="preserve">16.03.2026</w:t>
+            </w:r>
+          </w:p>
+        </w:tc>
+        <w:tc>
+          <w:tcPr>
+            <w:tcW w:type="dxa" w:w="4337"/>
+            <w:tcBorders>
+              <w:top w:val="single" w:color="BBBBBB" w:sz="4"/>
+              <w:left w:val="single" w:color="BBBBBB" w:sz="4"/>
+              <w:bottom w:val="single" w:color="BBBBBB" w:sz="4"/>
+              <w:right w:val="single" w:color="BBBBBB" w:sz="4"/>
+            </w:tcBorders>
+            <w:tcMar>
+              <w:top w:type="dxa" w:w="60"/>
+              <w:left w:type="dxa" w:w="100"/>
+              <w:bottom w:type="dxa" w:w="60"/>
+              <w:right w:type="dxa" w:w="100"/>
+            </w:tcMar>
+            <w:vAlign w:val="center"/>
+          </w:tcPr>
+          <w:p>
+            <w:pPr>
+              <w:spacing w:line="240" w:lineRule="auto"/>
+              <w:jc w:val="left"/>
+            </w:pPr>
+            <w:r>
+              <w:rPr>
+                <w:rFonts w:ascii="Arial" w:cs="Arial" w:eastAsia="Arial" w:hAnsi="Arial"/>
+                <w:b w:val="false"/>
+                <w:bCs w:val="false"/>
+                <w:sz w:val="18"/>
+                <w:szCs w:val="18"/>
+              </w:rPr>
+              <w:t xml:space="preserve">Variabler Sprung +0.5%: Min -523, Boost 905 px/s²</w:t>
+            </w:r>
+          </w:p>
+        </w:tc>
+        <w:tc>
+          <w:tcPr>
+            <w:tcW w:type="dxa" w:w="700"/>
+            <w:tcBorders>
+              <w:top w:val="single" w:color="BBBBBB" w:sz="4"/>
+              <w:left w:val="single" w:color="BBBBBB" w:sz="4"/>
+              <w:bottom w:val="single" w:color="BBBBBB" w:sz="4"/>
+              <w:right w:val="single" w:color="BBBBBB" w:sz="4"/>
+            </w:tcBorders>
+            <w:tcMar>
+              <w:top w:type="dxa" w:w="60"/>
+              <w:left w:type="dxa" w:w="100"/>
+              <w:bottom w:type="dxa" w:w="60"/>
+              <w:right w:type="dxa" w:w="100"/>
+            </w:tcMar>
+            <w:vAlign w:val="center"/>
+          </w:tcPr>
+          <w:p>
+            <w:pPr>
+              <w:spacing w:line="240" w:lineRule="auto"/>
+              <w:jc w:val="center"/>
+            </w:pPr>
+            <w:r>
+              <w:rPr>
+                <w:rFonts w:ascii="Arial" w:cs="Arial" w:eastAsia="Arial" w:hAnsi="Arial"/>
+                <w:b w:val="false"/>
+                <w:bCs w:val="false"/>
+                <w:sz w:val="18"/>
+                <w:szCs w:val="18"/>
+              </w:rPr>
+              <w:t xml:space="preserve">x</w:t>
+            </w:r>
+          </w:p>
+        </w:tc>
+        <w:tc>
+          <w:tcPr>
+            <w:tcW w:type="dxa" w:w="700"/>
+            <w:tcBorders>
+              <w:top w:val="single" w:color="BBBBBB" w:sz="4"/>
+              <w:left w:val="single" w:color="BBBBBB" w:sz="4"/>
+              <w:bottom w:val="single" w:color="BBBBBB" w:sz="4"/>
+              <w:right w:val="single" w:color="BBBBBB" w:sz="4"/>
+            </w:tcBorders>
+            <w:tcMar>
+              <w:top w:type="dxa" w:w="60"/>
+              <w:left w:type="dxa" w:w="100"/>
+              <w:bottom w:type="dxa" w:w="60"/>
+              <w:right w:type="dxa" w:w="100"/>
+            </w:tcMar>
+            <w:vAlign w:val="center"/>
+          </w:tcPr>
+          <w:p>
+            <w:pPr>
+              <w:spacing w:line="240" w:lineRule="auto"/>
+              <w:jc w:val="center"/>
+            </w:pPr>
+            <w:r>
+              <w:rPr>
+                <w:rFonts w:ascii="Arial" w:cs="Arial" w:eastAsia="Arial" w:hAnsi="Arial"/>
+                <w:b w:val="false"/>
+                <w:bCs w:val="false"/>
+                <w:sz w:val="18"/>
+                <w:szCs w:val="18"/>
+              </w:rPr>
+              <w:t xml:space="preserve">x</w:t>
+            </w:r>
+          </w:p>
+        </w:tc>
+        <w:tc>
+          <w:tcPr>
+            <w:tcW w:type="dxa" w:w="700"/>
+            <w:tcBorders>
+              <w:top w:val="single" w:color="BBBBBB" w:sz="4"/>
+              <w:left w:val="single" w:color="BBBBBB" w:sz="4"/>
+              <w:bottom w:val="single" w:color="BBBBBB" w:sz="4"/>
+              <w:right w:val="single" w:color="BBBBBB" w:sz="4"/>
+            </w:tcBorders>
+            <w:tcMar>
+              <w:top w:type="dxa" w:w="60"/>
+              <w:left w:type="dxa" w:w="100"/>
+              <w:bottom w:type="dxa" w:w="60"/>
+              <w:right w:type="dxa" w:w="100"/>
+            </w:tcMar>
+            <w:vAlign w:val="center"/>
+          </w:tcPr>
+          <w:p>
+            <w:pPr>
+              <w:spacing w:line="240" w:lineRule="auto"/>
+              <w:jc w:val="center"/>
+            </w:pPr>
+            <w:r>
+              <w:rPr>
+                <w:rFonts w:ascii="Arial" w:cs="Arial" w:eastAsia="Arial" w:hAnsi="Arial"/>
+                <w:b w:val="false"/>
+                <w:bCs w:val="false"/>
+                <w:sz w:val="18"/>
+                <w:szCs w:val="18"/>
+              </w:rPr>
+              <w:t xml:space="preserve">x</w:t>
+            </w:r>
+          </w:p>
+        </w:tc>
+      </w:tr>
+      <w:tr>
+        <w:tc>
+          <w:tcPr>
+            <w:tcW w:type="dxa" w:w="1500"/>
+            <w:tcBorders>
+              <w:top w:val="single" w:color="BBBBBB" w:sz="4"/>
+              <w:left w:val="single" w:color="BBBBBB" w:sz="4"/>
+              <w:bottom w:val="single" w:color="BBBBBB" w:sz="4"/>
+              <w:right w:val="single" w:color="BBBBBB" w:sz="4"/>
+            </w:tcBorders>
+            <w:tcMar>
+              <w:top w:type="dxa" w:w="60"/>
+              <w:left w:type="dxa" w:w="100"/>
+              <w:bottom w:type="dxa" w:w="60"/>
+              <w:right w:type="dxa" w:w="100"/>
+            </w:tcMar>
+            <w:vAlign w:val="center"/>
+          </w:tcPr>
+          <w:p>
+            <w:pPr>
+              <w:spacing w:line="240" w:lineRule="auto"/>
+              <w:jc w:val="center"/>
+            </w:pPr>
+            <w:r>
+              <w:rPr>
+                <w:rFonts w:ascii="Arial" w:cs="Arial" w:eastAsia="Arial" w:hAnsi="Arial"/>
+                <w:b w:val="false"/>
+                <w:bCs w:val="false"/>
+                <w:sz w:val="18"/>
+                <w:szCs w:val="18"/>
+              </w:rPr>
+              <w:t xml:space="preserve">16.03.2026</w:t>
+            </w:r>
+          </w:p>
+        </w:tc>
+        <w:tc>
+          <w:tcPr>
+            <w:tcW w:type="dxa" w:w="4337"/>
+            <w:tcBorders>
+              <w:top w:val="single" w:color="BBBBBB" w:sz="4"/>
+              <w:left w:val="single" w:color="BBBBBB" w:sz="4"/>
+              <w:bottom w:val="single" w:color="BBBBBB" w:sz="4"/>
+              <w:right w:val="single" w:color="BBBBBB" w:sz="4"/>
+            </w:tcBorders>
+            <w:tcMar>
+              <w:top w:type="dxa" w:w="60"/>
+              <w:left w:type="dxa" w:w="100"/>
+              <w:bottom w:type="dxa" w:w="60"/>
+              <w:right w:type="dxa" w:w="100"/>
+            </w:tcMar>
+            <w:vAlign w:val="center"/>
+          </w:tcPr>
+          <w:p>
+            <w:pPr>
+              <w:spacing w:line="240" w:lineRule="auto"/>
+              <w:jc w:val="left"/>
+            </w:pPr>
+            <w:r>
+              <w:rPr>
+                <w:rFonts w:ascii="Arial" w:cs="Arial" w:eastAsia="Arial" w:hAnsi="Arial"/>
+                <w:b w:val="false"/>
+                <w:bCs w:val="false"/>
+                <w:sz w:val="18"/>
+                <w:szCs w:val="18"/>
+              </w:rPr>
+              <w:t xml:space="preserve">L1 unsichtbare Plattformen: Boden, Muelltonnen, Tuer</w:t>
+            </w:r>
+          </w:p>
+        </w:tc>
+        <w:tc>
+          <w:tcPr>
+            <w:tcW w:type="dxa" w:w="700"/>
+            <w:tcBorders>
+              <w:top w:val="single" w:color="BBBBBB" w:sz="4"/>
+              <w:left w:val="single" w:color="BBBBBB" w:sz="4"/>
+              <w:bottom w:val="single" w:color="BBBBBB" w:sz="4"/>
+              <w:right w:val="single" w:color="BBBBBB" w:sz="4"/>
+            </w:tcBorders>
+            <w:tcMar>
+              <w:top w:type="dxa" w:w="60"/>
+              <w:left w:type="dxa" w:w="100"/>
+              <w:bottom w:type="dxa" w:w="60"/>
+              <w:right w:type="dxa" w:w="100"/>
+            </w:tcMar>
+            <w:vAlign w:val="center"/>
+          </w:tcPr>
+          <w:p>
+            <w:pPr>
+              <w:spacing w:line="240" w:lineRule="auto"/>
+              <w:jc w:val="center"/>
+            </w:pPr>
+            <w:r>
+              <w:rPr>
+                <w:rFonts w:ascii="Arial" w:cs="Arial" w:eastAsia="Arial" w:hAnsi="Arial"/>
+                <w:b w:val="false"/>
+                <w:bCs w:val="false"/>
+                <w:sz w:val="18"/>
+                <w:szCs w:val="18"/>
+              </w:rPr>
+              <w:t xml:space="preserve">x</w:t>
+            </w:r>
+          </w:p>
+        </w:tc>
+        <w:tc>
+          <w:tcPr>
+            <w:tcW w:type="dxa" w:w="700"/>
+            <w:tcBorders>
+              <w:top w:val="single" w:color="BBBBBB" w:sz="4"/>
+              <w:left w:val="single" w:color="BBBBBB" w:sz="4"/>
+              <w:bottom w:val="single" w:color="BBBBBB" w:sz="4"/>
+              <w:right w:val="single" w:color="BBBBBB" w:sz="4"/>
+            </w:tcBorders>
+            <w:tcMar>
+              <w:top w:type="dxa" w:w="60"/>
+              <w:left w:type="dxa" w:w="100"/>
+              <w:bottom w:type="dxa" w:w="60"/>
+              <w:right w:type="dxa" w:w="100"/>
+            </w:tcMar>
+            <w:vAlign w:val="center"/>
+          </w:tcPr>
+          <w:p>
+            <w:pPr>
+              <w:spacing w:line="240" w:lineRule="auto"/>
+              <w:jc w:val="center"/>
+            </w:pPr>
+            <w:r>
+              <w:rPr>
+                <w:rFonts w:ascii="Arial" w:cs="Arial" w:eastAsia="Arial" w:hAnsi="Arial"/>
+                <w:b w:val="false"/>
+                <w:bCs w:val="false"/>
+                <w:sz w:val="18"/>
+                <w:szCs w:val="18"/>
+              </w:rPr>
+              <w:t xml:space="preserve">x</w:t>
+            </w:r>
+          </w:p>
+        </w:tc>
+        <w:tc>
+          <w:tcPr>
+            <w:tcW w:type="dxa" w:w="700"/>
+            <w:tcBorders>
+              <w:top w:val="single" w:color="BBBBBB" w:sz="4"/>
+              <w:left w:val="single" w:color="BBBBBB" w:sz="4"/>
+              <w:bottom w:val="single" w:color="BBBBBB" w:sz="4"/>
+              <w:right w:val="single" w:color="BBBBBB" w:sz="4"/>
+            </w:tcBorders>
+            <w:tcMar>
+              <w:top w:type="dxa" w:w="60"/>
+              <w:left w:type="dxa" w:w="100"/>
+              <w:bottom w:type="dxa" w:w="60"/>
+              <w:right w:type="dxa" w:w="100"/>
+            </w:tcMar>
+            <w:vAlign w:val="center"/>
+          </w:tcPr>
+          <w:p>
+            <w:pPr>
+              <w:spacing w:line="240" w:lineRule="auto"/>
+              <w:jc w:val="center"/>
+            </w:pPr>
+            <w:r>
+              <w:rPr>
+                <w:rFonts w:ascii="Arial" w:cs="Arial" w:eastAsia="Arial" w:hAnsi="Arial"/>
+                <w:b w:val="false"/>
+                <w:bCs w:val="false"/>
+                <w:sz w:val="18"/>
+                <w:szCs w:val="18"/>
+              </w:rPr>
+              <w:t xml:space="preserve">x</w:t>
+            </w:r>
+          </w:p>
+        </w:tc>
+      </w:tr>
+      <w:tr>
+        <w:tc>
+          <w:tcPr>
+            <w:tcW w:type="dxa" w:w="1500"/>
+            <w:tcBorders>
+              <w:top w:val="single" w:color="BBBBBB" w:sz="4"/>
+              <w:left w:val="single" w:color="BBBBBB" w:sz="4"/>
+              <w:bottom w:val="single" w:color="BBBBBB" w:sz="4"/>
+              <w:right w:val="single" w:color="BBBBBB" w:sz="4"/>
+            </w:tcBorders>
+            <w:tcMar>
+              <w:top w:type="dxa" w:w="60"/>
+              <w:left w:type="dxa" w:w="100"/>
+              <w:bottom w:type="dxa" w:w="60"/>
+              <w:right w:type="dxa" w:w="100"/>
+            </w:tcMar>
+            <w:vAlign w:val="center"/>
+          </w:tcPr>
+          <w:p>
+            <w:pPr>
+              <w:spacing w:line="240" w:lineRule="auto"/>
+              <w:jc w:val="center"/>
+            </w:pPr>
+            <w:r>
+              <w:rPr>
+                <w:rFonts w:ascii="Arial" w:cs="Arial" w:eastAsia="Arial" w:hAnsi="Arial"/>
+                <w:b w:val="false"/>
+                <w:bCs w:val="false"/>
+                <w:sz w:val="18"/>
+                <w:szCs w:val="18"/>
+              </w:rPr>
+              <w:t xml:space="preserve">16.03.2026</w:t>
+            </w:r>
+          </w:p>
+        </w:tc>
+        <w:tc>
+          <w:tcPr>
+            <w:tcW w:type="dxa" w:w="4337"/>
+            <w:tcBorders>
+              <w:top w:val="single" w:color="BBBBBB" w:sz="4"/>
+              <w:left w:val="single" w:color="BBBBBB" w:sz="4"/>
+              <w:bottom w:val="single" w:color="BBBBBB" w:sz="4"/>
+              <w:right w:val="single" w:color="BBBBBB" w:sz="4"/>
+            </w:tcBorders>
+            <w:tcMar>
+              <w:top w:type="dxa" w:w="60"/>
+              <w:left w:type="dxa" w:w="100"/>
+              <w:bottom w:type="dxa" w:w="60"/>
+              <w:right w:type="dxa" w:w="100"/>
+            </w:tcMar>
+            <w:vAlign w:val="center"/>
+          </w:tcPr>
+          <w:p>
+            <w:pPr>
+              <w:spacing w:line="240" w:lineRule="auto"/>
+              <w:jc w:val="left"/>
+            </w:pPr>
+            <w:r>
+              <w:rPr>
+                <w:rFonts w:ascii="Arial" w:cs="Arial" w:eastAsia="Arial" w:hAnsi="Arial"/>
+                <w:b w:val="false"/>
+                <w:bCs w:val="false"/>
+                <w:sz w:val="18"/>
+                <w:szCs w:val="18"/>
+              </w:rPr>
+              <w:t xml:space="preserve">PIL Alpha-Scan: exakte Koordinaten fuer L1-Collider</w:t>
+            </w:r>
+          </w:p>
+        </w:tc>
+        <w:tc>
+          <w:tcPr>
+            <w:tcW w:type="dxa" w:w="700"/>
+            <w:tcBorders>
+              <w:top w:val="single" w:color="BBBBBB" w:sz="4"/>
+              <w:left w:val="single" w:color="BBBBBB" w:sz="4"/>
+              <w:bottom w:val="single" w:color="BBBBBB" w:sz="4"/>
+              <w:right w:val="single" w:color="BBBBBB" w:sz="4"/>
+            </w:tcBorders>
+            <w:tcMar>
+              <w:top w:type="dxa" w:w="60"/>
+              <w:left w:type="dxa" w:w="100"/>
+              <w:bottom w:type="dxa" w:w="60"/>
+              <w:right w:type="dxa" w:w="100"/>
+            </w:tcMar>
+            <w:vAlign w:val="center"/>
+          </w:tcPr>
+          <w:p>
+            <w:pPr>
+              <w:spacing w:line="240" w:lineRule="auto"/>
+              <w:jc w:val="center"/>
+            </w:pPr>
+            <w:r>
+              <w:rPr>
+                <w:rFonts w:ascii="Arial" w:cs="Arial" w:eastAsia="Arial" w:hAnsi="Arial"/>
+                <w:b w:val="false"/>
+                <w:bCs w:val="false"/>
+                <w:sz w:val="18"/>
+                <w:szCs w:val="18"/>
+              </w:rPr>
+              <w:t xml:space="preserve">x</w:t>
+            </w:r>
+          </w:p>
+        </w:tc>
+        <w:tc>
+          <w:tcPr>
+            <w:tcW w:type="dxa" w:w="700"/>
+            <w:tcBorders>
+              <w:top w:val="single" w:color="BBBBBB" w:sz="4"/>
+              <w:left w:val="single" w:color="BBBBBB" w:sz="4"/>
+              <w:bottom w:val="single" w:color="BBBBBB" w:sz="4"/>
+              <w:right w:val="single" w:color="BBBBBB" w:sz="4"/>
+            </w:tcBorders>
+            <w:tcMar>
+              <w:top w:type="dxa" w:w="60"/>
+              <w:left w:type="dxa" w:w="100"/>
+              <w:bottom w:type="dxa" w:w="60"/>
+              <w:right w:type="dxa" w:w="100"/>
+            </w:tcMar>
+            <w:vAlign w:val="center"/>
+          </w:tcPr>
+          <w:p>
+            <w:pPr>
+              <w:spacing w:line="240" w:lineRule="auto"/>
+              <w:jc w:val="center"/>
+            </w:pPr>
+            <w:r>
+              <w:rPr>
+                <w:rFonts w:ascii="Arial" w:cs="Arial" w:eastAsia="Arial" w:hAnsi="Arial"/>
+                <w:b w:val="false"/>
+                <w:bCs w:val="false"/>
+                <w:sz w:val="18"/>
+                <w:szCs w:val="18"/>
+              </w:rPr>
+              <w:t xml:space="preserve">x</w:t>
+            </w:r>
+          </w:p>
+        </w:tc>
+        <w:tc>
+          <w:tcPr>
+            <w:tcW w:type="dxa" w:w="700"/>
+            <w:tcBorders>
+              <w:top w:val="single" w:color="BBBBBB" w:sz="4"/>
+              <w:left w:val="single" w:color="BBBBBB" w:sz="4"/>
+              <w:bottom w:val="single" w:color="BBBBBB" w:sz="4"/>
+              <w:right w:val="single" w:color="BBBBBB" w:sz="4"/>
+            </w:tcBorders>
+            <w:tcMar>
+              <w:top w:type="dxa" w:w="60"/>
+              <w:left w:type="dxa" w:w="100"/>
+              <w:bottom w:type="dxa" w:w="60"/>
+              <w:right w:type="dxa" w:w="100"/>
+            </w:tcMar>
+            <w:vAlign w:val="center"/>
+          </w:tcPr>
+          <w:p>
+            <w:pPr>
+              <w:spacing w:line="240" w:lineRule="auto"/>
+              <w:jc w:val="center"/>
+            </w:pPr>
+            <w:r>
+              <w:rPr>
+                <w:rFonts w:ascii="Arial" w:cs="Arial" w:eastAsia="Arial" w:hAnsi="Arial"/>
+                <w:b w:val="false"/>
+                <w:bCs w:val="false"/>
+                <w:sz w:val="18"/>
+                <w:szCs w:val="18"/>
+              </w:rPr>
+              <w:t xml:space="preserve">x</w:t>
+            </w:r>
+          </w:p>
+        </w:tc>
+      </w:tr>
+      <w:tr>
+        <w:tc>
+          <w:tcPr>
+            <w:tcW w:type="dxa" w:w="1500"/>
+            <w:tcBorders>
+              <w:top w:val="single" w:color="BBBBBB" w:sz="4"/>
+              <w:left w:val="single" w:color="BBBBBB" w:sz="4"/>
+              <w:bottom w:val="single" w:color="BBBBBB" w:sz="4"/>
+              <w:right w:val="single" w:color="BBBBBB" w:sz="4"/>
+            </w:tcBorders>
+            <w:tcMar>
+              <w:top w:type="dxa" w:w="60"/>
+              <w:left w:type="dxa" w:w="100"/>
+              <w:bottom w:type="dxa" w:w="60"/>
+              <w:right w:type="dxa" w:w="100"/>
+            </w:tcMar>
+            <w:vAlign w:val="center"/>
+          </w:tcPr>
+          <w:p>
+            <w:pPr>
+              <w:spacing w:line="240" w:lineRule="auto"/>
+              <w:jc w:val="center"/>
+            </w:pPr>
+            <w:r>
+              <w:rPr>
+                <w:rFonts w:ascii="Arial" w:cs="Arial" w:eastAsia="Arial" w:hAnsi="Arial"/>
+                <w:b w:val="false"/>
+                <w:bCs w:val="false"/>
+                <w:sz w:val="18"/>
+                <w:szCs w:val="18"/>
+              </w:rPr>
+              <w:t xml:space="preserve">16.03.2026</w:t>
+            </w:r>
+          </w:p>
+        </w:tc>
+        <w:tc>
+          <w:tcPr>
+            <w:tcW w:type="dxa" w:w="4337"/>
+            <w:tcBorders>
+              <w:top w:val="single" w:color="BBBBBB" w:sz="4"/>
+              <w:left w:val="single" w:color="BBBBBB" w:sz="4"/>
+              <w:bottom w:val="single" w:color="BBBBBB" w:sz="4"/>
+              <w:right w:val="single" w:color="BBBBBB" w:sz="4"/>
+            </w:tcBorders>
+            <w:tcMar>
+              <w:top w:type="dxa" w:w="60"/>
+              <w:left w:type="dxa" w:w="100"/>
+              <w:bottom w:type="dxa" w:w="60"/>
+              <w:right w:type="dxa" w:w="100"/>
+            </w:tcMar>
+            <w:vAlign w:val="center"/>
+          </w:tcPr>
+          <w:p>
+            <w:pPr>
+              <w:spacing w:line="240" w:lineRule="auto"/>
+              <w:jc w:val="left"/>
+            </w:pPr>
+            <w:r>
+              <w:rPr>
+                <w:rFonts w:ascii="Arial" w:cs="Arial" w:eastAsia="Arial" w:hAnsi="Arial"/>
+                <w:b w:val="false"/>
+                <w:bCs w:val="false"/>
+                <w:sz w:val="18"/>
+                <w:szCs w:val="18"/>
+              </w:rPr>
+              <w:t xml:space="preserve">Starter-Plattform nur L2; L1+L3 unsichtbarer Boden</w:t>
+            </w:r>
+          </w:p>
+        </w:tc>
+        <w:tc>
+          <w:tcPr>
+            <w:tcW w:type="dxa" w:w="700"/>
+            <w:tcBorders>
+              <w:top w:val="single" w:color="BBBBBB" w:sz="4"/>
+              <w:left w:val="single" w:color="BBBBBB" w:sz="4"/>
+              <w:bottom w:val="single" w:color="BBBBBB" w:sz="4"/>
+              <w:right w:val="single" w:color="BBBBBB" w:sz="4"/>
+            </w:tcBorders>
+            <w:tcMar>
+              <w:top w:type="dxa" w:w="60"/>
+              <w:left w:type="dxa" w:w="100"/>
+              <w:bottom w:type="dxa" w:w="60"/>
+              <w:right w:type="dxa" w:w="100"/>
+            </w:tcMar>
+            <w:vAlign w:val="center"/>
+          </w:tcPr>
+          <w:p>
+            <w:pPr>
+              <w:spacing w:line="240" w:lineRule="auto"/>
+              <w:jc w:val="center"/>
+            </w:pPr>
+            <w:r>
+              <w:rPr>
+                <w:rFonts w:ascii="Arial" w:cs="Arial" w:eastAsia="Arial" w:hAnsi="Arial"/>
+                <w:b w:val="false"/>
+                <w:bCs w:val="false"/>
+                <w:sz w:val="18"/>
+                <w:szCs w:val="18"/>
+              </w:rPr>
+              <w:t xml:space="preserve">x</w:t>
+            </w:r>
+          </w:p>
+        </w:tc>
+        <w:tc>
+          <w:tcPr>
+            <w:tcW w:type="dxa" w:w="700"/>
+            <w:tcBorders>
+              <w:top w:val="single" w:color="BBBBBB" w:sz="4"/>
+              <w:left w:val="single" w:color="BBBBBB" w:sz="4"/>
+              <w:bottom w:val="single" w:color="BBBBBB" w:sz="4"/>
+              <w:right w:val="single" w:color="BBBBBB" w:sz="4"/>
+            </w:tcBorders>
+            <w:tcMar>
+              <w:top w:type="dxa" w:w="60"/>
+              <w:left w:type="dxa" w:w="100"/>
+              <w:bottom w:type="dxa" w:w="60"/>
+              <w:right w:type="dxa" w:w="100"/>
+            </w:tcMar>
+            <w:vAlign w:val="center"/>
+          </w:tcPr>
+          <w:p>
+            <w:pPr>
+              <w:spacing w:line="240" w:lineRule="auto"/>
+              <w:jc w:val="center"/>
+            </w:pPr>
+            <w:r>
+              <w:rPr>
+                <w:rFonts w:ascii="Arial" w:cs="Arial" w:eastAsia="Arial" w:hAnsi="Arial"/>
+                <w:b w:val="false"/>
+                <w:bCs w:val="false"/>
+                <w:sz w:val="18"/>
+                <w:szCs w:val="18"/>
+              </w:rPr>
+              <w:t xml:space="preserve">x</w:t>
+            </w:r>
+          </w:p>
+        </w:tc>
+        <w:tc>
+          <w:tcPr>
+            <w:tcW w:type="dxa" w:w="700"/>
+            <w:tcBorders>
+              <w:top w:val="single" w:color="BBBBBB" w:sz="4"/>
+              <w:left w:val="single" w:color="BBBBBB" w:sz="4"/>
+              <w:bottom w:val="single" w:color="BBBBBB" w:sz="4"/>
+              <w:right w:val="single" w:color="BBBBBB" w:sz="4"/>
+            </w:tcBorders>
+            <w:tcMar>
+              <w:top w:type="dxa" w:w="60"/>
+              <w:left w:type="dxa" w:w="100"/>
+              <w:bottom w:type="dxa" w:w="60"/>
+              <w:right w:type="dxa" w:w="100"/>
+            </w:tcMar>
+            <w:vAlign w:val="center"/>
+          </w:tcPr>
+          <w:p>
+            <w:pPr>
+              <w:spacing w:line="240" w:lineRule="auto"/>
+              <w:jc w:val="center"/>
+            </w:pPr>
+            <w:r>
+              <w:rPr>
+                <w:rFonts w:ascii="Arial" w:cs="Arial" w:eastAsia="Arial" w:hAnsi="Arial"/>
+                <w:b w:val="false"/>
+                <w:bCs w:val="false"/>
+                <w:sz w:val="18"/>
+                <w:szCs w:val="18"/>
+              </w:rPr>
+              <w:t xml:space="preserve">x</w:t>
+            </w:r>
+          </w:p>
+        </w:tc>
+      </w:tr>
+      <w:tr>
+        <w:tc>
+          <w:tcPr>
+            <w:tcW w:type="dxa" w:w="1500"/>
+            <w:tcBorders>
+              <w:top w:val="single" w:color="BBBBBB" w:sz="4"/>
+              <w:left w:val="single" w:color="BBBBBB" w:sz="4"/>
+              <w:bottom w:val="single" w:color="BBBBBB" w:sz="4"/>
+              <w:right w:val="single" w:color="BBBBBB" w:sz="4"/>
+            </w:tcBorders>
+            <w:tcMar>
+              <w:top w:type="dxa" w:w="60"/>
+              <w:left w:type="dxa" w:w="100"/>
+              <w:bottom w:type="dxa" w:w="60"/>
+              <w:right w:type="dxa" w:w="100"/>
+            </w:tcMar>
+            <w:vAlign w:val="center"/>
+          </w:tcPr>
+          <w:p>
+            <w:pPr>
+              <w:spacing w:line="240" w:lineRule="auto"/>
+              <w:jc w:val="center"/>
+            </w:pPr>
+            <w:r>
+              <w:rPr>
+                <w:rFonts w:ascii="Arial" w:cs="Arial" w:eastAsia="Arial" w:hAnsi="Arial"/>
+                <w:b w:val="false"/>
+                <w:bCs w:val="false"/>
+                <w:sz w:val="18"/>
+                <w:szCs w:val="18"/>
+              </w:rPr>
+              <w:t xml:space="preserve">16.03.2026</w:t>
+            </w:r>
+          </w:p>
+        </w:tc>
+        <w:tc>
+          <w:tcPr>
+            <w:tcW w:type="dxa" w:w="4337"/>
+            <w:tcBorders>
+              <w:top w:val="single" w:color="BBBBBB" w:sz="4"/>
+              <w:left w:val="single" w:color="BBBBBB" w:sz="4"/>
+              <w:bottom w:val="single" w:color="BBBBBB" w:sz="4"/>
+              <w:right w:val="single" w:color="BBBBBB" w:sz="4"/>
+            </w:tcBorders>
+            <w:tcMar>
+              <w:top w:type="dxa" w:w="60"/>
+              <w:left w:type="dxa" w:w="100"/>
+              <w:bottom w:type="dxa" w:w="60"/>
+              <w:right w:type="dxa" w:w="100"/>
+            </w:tcMar>
+            <w:vAlign w:val="center"/>
+          </w:tcPr>
+          <w:p>
+            <w:pPr>
+              <w:spacing w:line="240" w:lineRule="auto"/>
+              <w:jc w:val="left"/>
+            </w:pPr>
+            <w:r>
+              <w:rPr>
+                <w:rFonts w:ascii="Arial" w:cs="Arial" w:eastAsia="Arial" w:hAnsi="Arial"/>
+                <w:b w:val="false"/>
+                <w:bCs w:val="false"/>
+                <w:sz w:val="18"/>
+                <w:szCs w:val="18"/>
+              </w:rPr>
+              <w:t xml:space="preserve">Crumble-Farbe: Zerbroeckelnd gelb statt rot (Zeile 4)</w:t>
+            </w:r>
+          </w:p>
+        </w:tc>
+        <w:tc>
+          <w:tcPr>
+            <w:tcW w:type="dxa" w:w="700"/>
+            <w:tcBorders>
+              <w:top w:val="single" w:color="BBBBBB" w:sz="4"/>
+              <w:left w:val="single" w:color="BBBBBB" w:sz="4"/>
+              <w:bottom w:val="single" w:color="BBBBBB" w:sz="4"/>
+              <w:right w:val="single" w:color="BBBBBB" w:sz="4"/>
+            </w:tcBorders>
+            <w:tcMar>
+              <w:top w:type="dxa" w:w="60"/>
+              <w:left w:type="dxa" w:w="100"/>
+              <w:bottom w:type="dxa" w:w="60"/>
+              <w:right w:type="dxa" w:w="100"/>
+            </w:tcMar>
+            <w:vAlign w:val="center"/>
+          </w:tcPr>
+          <w:p>
+            <w:pPr>
+              <w:spacing w:line="240" w:lineRule="auto"/>
+              <w:jc w:val="center"/>
+            </w:pPr>
+            <w:r>
+              <w:rPr>
+                <w:rFonts w:ascii="Arial" w:cs="Arial" w:eastAsia="Arial" w:hAnsi="Arial"/>
+                <w:b w:val="false"/>
+                <w:bCs w:val="false"/>
+                <w:sz w:val="18"/>
+                <w:szCs w:val="18"/>
+              </w:rPr>
+              <w:t xml:space="preserve">x</w:t>
+            </w:r>
+          </w:p>
+        </w:tc>
+        <w:tc>
+          <w:tcPr>
+            <w:tcW w:type="dxa" w:w="700"/>
+            <w:tcBorders>
+              <w:top w:val="single" w:color="BBBBBB" w:sz="4"/>
+              <w:left w:val="single" w:color="BBBBBB" w:sz="4"/>
+              <w:bottom w:val="single" w:color="BBBBBB" w:sz="4"/>
+              <w:right w:val="single" w:color="BBBBBB" w:sz="4"/>
+            </w:tcBorders>
+            <w:tcMar>
+              <w:top w:type="dxa" w:w="60"/>
+              <w:left w:type="dxa" w:w="100"/>
+              <w:bottom w:type="dxa" w:w="60"/>
+              <w:right w:type="dxa" w:w="100"/>
+            </w:tcMar>
+            <w:vAlign w:val="center"/>
+          </w:tcPr>
+          <w:p>
+            <w:pPr>
+              <w:spacing w:line="240" w:lineRule="auto"/>
+              <w:jc w:val="center"/>
+            </w:pPr>
+            <w:r>
+              <w:rPr>
+                <w:rFonts w:ascii="Arial" w:cs="Arial" w:eastAsia="Arial" w:hAnsi="Arial"/>
+                <w:b w:val="false"/>
+                <w:bCs w:val="false"/>
+                <w:sz w:val="18"/>
+                <w:szCs w:val="18"/>
+              </w:rPr>
+              <w:t xml:space="preserve">x</w:t>
+            </w:r>
+          </w:p>
+        </w:tc>
+        <w:tc>
+          <w:tcPr>
+            <w:tcW w:type="dxa" w:w="700"/>
+            <w:tcBorders>
+              <w:top w:val="single" w:color="BBBBBB" w:sz="4"/>
+              <w:left w:val="single" w:color="BBBBBB" w:sz="4"/>
+              <w:bottom w:val="single" w:color="BBBBBB" w:sz="4"/>
+              <w:right w:val="single" w:color="BBBBBB" w:sz="4"/>
+            </w:tcBorders>
+            <w:tcMar>
+              <w:top w:type="dxa" w:w="60"/>
+              <w:left w:type="dxa" w:w="100"/>
+              <w:bottom w:type="dxa" w:w="60"/>
+              <w:right w:type="dxa" w:w="100"/>
+            </w:tcMar>
+            <w:vAlign w:val="center"/>
+          </w:tcPr>
+          <w:p>
+            <w:pPr>
+              <w:spacing w:line="240" w:lineRule="auto"/>
+              <w:jc w:val="center"/>
+            </w:pPr>
+            <w:r>
+              <w:rPr>
+                <w:rFonts w:ascii="Arial" w:cs="Arial" w:eastAsia="Arial" w:hAnsi="Arial"/>
+                <w:b w:val="false"/>
+                <w:bCs w:val="false"/>
+                <w:sz w:val="18"/>
+                <w:szCs w:val="18"/>
+              </w:rPr>
+              <w:t xml:space="preserve">x</w:t>
+            </w:r>
+          </w:p>
+        </w:tc>
+      </w:tr>
+      <w:tr>
+        <w:tc>
+          <w:tcPr>
+            <w:tcW w:type="dxa" w:w="1500"/>
+            <w:tcBorders>
+              <w:top w:val="single" w:color="BBBBBB" w:sz="4"/>
+              <w:left w:val="single" w:color="BBBBBB" w:sz="4"/>
+              <w:bottom w:val="single" w:color="BBBBBB" w:sz="4"/>
+              <w:right w:val="single" w:color="BBBBBB" w:sz="4"/>
+            </w:tcBorders>
+            <w:tcMar>
+              <w:top w:type="dxa" w:w="60"/>
+              <w:left w:type="dxa" w:w="100"/>
+              <w:bottom w:type="dxa" w:w="60"/>
+              <w:right w:type="dxa" w:w="100"/>
+            </w:tcMar>
+            <w:vAlign w:val="center"/>
+          </w:tcPr>
+          <w:p>
+            <w:pPr>
+              <w:spacing w:line="240" w:lineRule="auto"/>
+              <w:jc w:val="center"/>
+            </w:pPr>
+            <w:r>
+              <w:rPr>
+                <w:rFonts w:ascii="Arial" w:cs="Arial" w:eastAsia="Arial" w:hAnsi="Arial"/>
+                <w:b w:val="false"/>
+                <w:bCs w:val="false"/>
+                <w:sz w:val="18"/>
+                <w:szCs w:val="18"/>
+              </w:rPr>
+              <w:t xml:space="preserve">16.03.2026</w:t>
+            </w:r>
+          </w:p>
+        </w:tc>
+        <w:tc>
+          <w:tcPr>
+            <w:tcW w:type="dxa" w:w="4337"/>
+            <w:tcBorders>
+              <w:top w:val="single" w:color="BBBBBB" w:sz="4"/>
+              <w:left w:val="single" w:color="BBBBBB" w:sz="4"/>
+              <w:bottom w:val="single" w:color="BBBBBB" w:sz="4"/>
+              <w:right w:val="single" w:color="BBBBBB" w:sz="4"/>
+            </w:tcBorders>
+            <w:tcMar>
+              <w:top w:type="dxa" w:w="60"/>
+              <w:left w:type="dxa" w:w="100"/>
+              <w:bottom w:type="dxa" w:w="60"/>
+              <w:right w:type="dxa" w:w="100"/>
+            </w:tcMar>
+            <w:vAlign w:val="center"/>
+          </w:tcPr>
+          <w:p>
+            <w:pPr>
+              <w:spacing w:line="240" w:lineRule="auto"/>
+              <w:jc w:val="left"/>
+            </w:pPr>
+            <w:r>
+              <w:rPr>
+                <w:rFonts w:ascii="Arial" w:cs="Arial" w:eastAsia="Arial" w:hAnsi="Arial"/>
+                <w:b w:val="false"/>
+                <w:bCs w:val="false"/>
+                <w:sz w:val="18"/>
+                <w:szCs w:val="18"/>
+              </w:rPr>
+              <w:t xml:space="preserve">Level-abhaengiger Spawn: L1+L3 y=596, L2 y=528</w:t>
+            </w:r>
+          </w:p>
+        </w:tc>
+        <w:tc>
+          <w:tcPr>
+            <w:tcW w:type="dxa" w:w="700"/>
+            <w:tcBorders>
+              <w:top w:val="single" w:color="BBBBBB" w:sz="4"/>
+              <w:left w:val="single" w:color="BBBBBB" w:sz="4"/>
+              <w:bottom w:val="single" w:color="BBBBBB" w:sz="4"/>
+              <w:right w:val="single" w:color="BBBBBB" w:sz="4"/>
+            </w:tcBorders>
+            <w:tcMar>
+              <w:top w:type="dxa" w:w="60"/>
+              <w:left w:type="dxa" w:w="100"/>
+              <w:bottom w:type="dxa" w:w="60"/>
+              <w:right w:type="dxa" w:w="100"/>
+            </w:tcMar>
+            <w:vAlign w:val="center"/>
+          </w:tcPr>
+          <w:p>
+            <w:pPr>
+              <w:spacing w:line="240" w:lineRule="auto"/>
+              <w:jc w:val="center"/>
+            </w:pPr>
+            <w:r>
+              <w:rPr>
+                <w:rFonts w:ascii="Arial" w:cs="Arial" w:eastAsia="Arial" w:hAnsi="Arial"/>
+                <w:b w:val="false"/>
+                <w:bCs w:val="false"/>
+                <w:sz w:val="18"/>
+                <w:szCs w:val="18"/>
+              </w:rPr>
+              <w:t xml:space="preserve">x</w:t>
+            </w:r>
+          </w:p>
+        </w:tc>
+        <w:tc>
+          <w:tcPr>
+            <w:tcW w:type="dxa" w:w="700"/>
+            <w:tcBorders>
+              <w:top w:val="single" w:color="BBBBBB" w:sz="4"/>
+              <w:left w:val="single" w:color="BBBBBB" w:sz="4"/>
+              <w:bottom w:val="single" w:color="BBBBBB" w:sz="4"/>
+              <w:right w:val="single" w:color="BBBBBB" w:sz="4"/>
+            </w:tcBorders>
+            <w:tcMar>
+              <w:top w:type="dxa" w:w="60"/>
+              <w:left w:type="dxa" w:w="100"/>
+              <w:bottom w:type="dxa" w:w="60"/>
+              <w:right w:type="dxa" w:w="100"/>
+            </w:tcMar>
+            <w:vAlign w:val="center"/>
+          </w:tcPr>
+          <w:p>
+            <w:pPr>
+              <w:spacing w:line="240" w:lineRule="auto"/>
+              <w:jc w:val="center"/>
+            </w:pPr>
+            <w:r>
+              <w:rPr>
+                <w:rFonts w:ascii="Arial" w:cs="Arial" w:eastAsia="Arial" w:hAnsi="Arial"/>
+                <w:b w:val="false"/>
+                <w:bCs w:val="false"/>
+                <w:sz w:val="18"/>
+                <w:szCs w:val="18"/>
+              </w:rPr>
+              <w:t xml:space="preserve">x</w:t>
+            </w:r>
+          </w:p>
+        </w:tc>
+        <w:tc>
+          <w:tcPr>
+            <w:tcW w:type="dxa" w:w="700"/>
+            <w:tcBorders>
+              <w:top w:val="single" w:color="BBBBBB" w:sz="4"/>
+              <w:left w:val="single" w:color="BBBBBB" w:sz="4"/>
+              <w:bottom w:val="single" w:color="BBBBBB" w:sz="4"/>
+              <w:right w:val="single" w:color="BBBBBB" w:sz="4"/>
+            </w:tcBorders>
+            <w:tcMar>
+              <w:top w:type="dxa" w:w="60"/>
+              <w:left w:type="dxa" w:w="100"/>
+              <w:bottom w:type="dxa" w:w="60"/>
+              <w:right w:type="dxa" w:w="100"/>
+            </w:tcMar>
+            <w:vAlign w:val="center"/>
+          </w:tcPr>
+          <w:p>
+            <w:pPr>
+              <w:spacing w:line="240" w:lineRule="auto"/>
+              <w:jc w:val="center"/>
+            </w:pPr>
+            <w:r>
+              <w:rPr>
+                <w:rFonts w:ascii="Arial" w:cs="Arial" w:eastAsia="Arial" w:hAnsi="Arial"/>
+                <w:b w:val="false"/>
+                <w:bCs w:val="false"/>
+                <w:sz w:val="18"/>
+                <w:szCs w:val="18"/>
+              </w:rPr>
+              <w:t xml:space="preserve">x</w:t>
+            </w:r>
+          </w:p>
+        </w:tc>
+      </w:tr>
+      <w:tr>
+        <w:tc>
+          <w:tcPr>
+            <w:tcW w:type="dxa" w:w="1500"/>
+            <w:tcBorders>
+              <w:top w:val="single" w:color="BBBBBB" w:sz="4"/>
+              <w:left w:val="single" w:color="BBBBBB" w:sz="4"/>
+              <w:bottom w:val="single" w:color="BBBBBB" w:sz="4"/>
+              <w:right w:val="single" w:color="BBBBBB" w:sz="4"/>
+            </w:tcBorders>
+            <w:tcMar>
+              <w:top w:type="dxa" w:w="60"/>
+              <w:left w:type="dxa" w:w="100"/>
+              <w:bottom w:type="dxa" w:w="60"/>
+              <w:right w:type="dxa" w:w="100"/>
+            </w:tcMar>
+            <w:vAlign w:val="center"/>
+          </w:tcPr>
+          <w:p>
+            <w:pPr>
+              <w:spacing w:line="240" w:lineRule="auto"/>
+              <w:jc w:val="center"/>
+            </w:pPr>
+            <w:r>
+              <w:rPr>
+                <w:rFonts w:ascii="Arial" w:cs="Arial" w:eastAsia="Arial" w:hAnsi="Arial"/>
+                <w:b w:val="false"/>
+                <w:bCs w:val="false"/>
+                <w:sz w:val="18"/>
+                <w:szCs w:val="18"/>
+              </w:rPr>
+              <w:t xml:space="preserve">16.03.2026</w:t>
+            </w:r>
+          </w:p>
+        </w:tc>
+        <w:tc>
+          <w:tcPr>
+            <w:tcW w:type="dxa" w:w="4337"/>
+            <w:tcBorders>
+              <w:top w:val="single" w:color="BBBBBB" w:sz="4"/>
+              <w:left w:val="single" w:color="BBBBBB" w:sz="4"/>
+              <w:bottom w:val="single" w:color="BBBBBB" w:sz="4"/>
+              <w:right w:val="single" w:color="BBBBBB" w:sz="4"/>
+            </w:tcBorders>
+            <w:tcMar>
+              <w:top w:type="dxa" w:w="60"/>
+              <w:left w:type="dxa" w:w="100"/>
+              <w:bottom w:type="dxa" w:w="60"/>
+              <w:right w:type="dxa" w:w="100"/>
+            </w:tcMar>
+            <w:vAlign w:val="center"/>
+          </w:tcPr>
+          <w:p>
+            <w:pPr>
+              <w:spacing w:line="240" w:lineRule="auto"/>
+              <w:jc w:val="left"/>
+            </w:pPr>
+            <w:r>
+              <w:rPr>
+                <w:rFonts w:ascii="Arial" w:cs="Arial" w:eastAsia="Arial" w:hAnsi="Arial"/>
+                <w:b w:val="false"/>
+                <w:bCs w:val="false"/>
+                <w:sz w:val="18"/>
+                <w:szCs w:val="18"/>
+              </w:rPr>
+              <w:t xml:space="preserve">3-Schicht-Elektrizitaet: unabhaengige Frequenzen+Alpha</w:t>
+            </w:r>
+          </w:p>
+        </w:tc>
+        <w:tc>
+          <w:tcPr>
+            <w:tcW w:type="dxa" w:w="700"/>
+            <w:tcBorders>
+              <w:top w:val="single" w:color="BBBBBB" w:sz="4"/>
+              <w:left w:val="single" w:color="BBBBBB" w:sz="4"/>
+              <w:bottom w:val="single" w:color="BBBBBB" w:sz="4"/>
+              <w:right w:val="single" w:color="BBBBBB" w:sz="4"/>
+            </w:tcBorders>
+            <w:tcMar>
+              <w:top w:type="dxa" w:w="60"/>
+              <w:left w:type="dxa" w:w="100"/>
+              <w:bottom w:type="dxa" w:w="60"/>
+              <w:right w:type="dxa" w:w="100"/>
+            </w:tcMar>
+            <w:vAlign w:val="center"/>
+          </w:tcPr>
+          <w:p>
+            <w:pPr>
+              <w:spacing w:line="240" w:lineRule="auto"/>
+              <w:jc w:val="center"/>
+            </w:pPr>
+            <w:r>
+              <w:rPr>
+                <w:rFonts w:ascii="Arial" w:cs="Arial" w:eastAsia="Arial" w:hAnsi="Arial"/>
+                <w:b w:val="false"/>
+                <w:bCs w:val="false"/>
+                <w:sz w:val="18"/>
+                <w:szCs w:val="18"/>
+              </w:rPr>
+              <w:t xml:space="preserve">x</w:t>
+            </w:r>
+          </w:p>
+        </w:tc>
+        <w:tc>
+          <w:tcPr>
+            <w:tcW w:type="dxa" w:w="700"/>
+            <w:tcBorders>
+              <w:top w:val="single" w:color="BBBBBB" w:sz="4"/>
+              <w:left w:val="single" w:color="BBBBBB" w:sz="4"/>
+              <w:bottom w:val="single" w:color="BBBBBB" w:sz="4"/>
+              <w:right w:val="single" w:color="BBBBBB" w:sz="4"/>
+            </w:tcBorders>
+            <w:tcMar>
+              <w:top w:type="dxa" w:w="60"/>
+              <w:left w:type="dxa" w:w="100"/>
+              <w:bottom w:type="dxa" w:w="60"/>
+              <w:right w:type="dxa" w:w="100"/>
+            </w:tcMar>
+            <w:vAlign w:val="center"/>
+          </w:tcPr>
+          <w:p>
+            <w:pPr>
+              <w:spacing w:line="240" w:lineRule="auto"/>
+              <w:jc w:val="center"/>
+            </w:pPr>
+            <w:r>
+              <w:rPr>
+                <w:rFonts w:ascii="Arial" w:cs="Arial" w:eastAsia="Arial" w:hAnsi="Arial"/>
+                <w:b w:val="false"/>
+                <w:bCs w:val="false"/>
+                <w:sz w:val="18"/>
+                <w:szCs w:val="18"/>
+              </w:rPr>
+              <w:t xml:space="preserve">x</w:t>
+            </w:r>
+          </w:p>
+        </w:tc>
+        <w:tc>
+          <w:tcPr>
+            <w:tcW w:type="dxa" w:w="700"/>
+            <w:tcBorders>
+              <w:top w:val="single" w:color="BBBBBB" w:sz="4"/>
+              <w:left w:val="single" w:color="BBBBBB" w:sz="4"/>
+              <w:bottom w:val="single" w:color="BBBBBB" w:sz="4"/>
+              <w:right w:val="single" w:color="BBBBBB" w:sz="4"/>
+            </w:tcBorders>
+            <w:tcMar>
+              <w:top w:type="dxa" w:w="60"/>
+              <w:left w:type="dxa" w:w="100"/>
+              <w:bottom w:type="dxa" w:w="60"/>
+              <w:right w:type="dxa" w:w="100"/>
+            </w:tcMar>
+            <w:vAlign w:val="center"/>
+          </w:tcPr>
+          <w:p>
+            <w:pPr>
+              <w:spacing w:line="240" w:lineRule="auto"/>
+              <w:jc w:val="center"/>
+            </w:pPr>
+            <w:r>
+              <w:rPr>
+                <w:rFonts w:ascii="Arial" w:cs="Arial" w:eastAsia="Arial" w:hAnsi="Arial"/>
+                <w:b w:val="false"/>
+                <w:bCs w:val="false"/>
+                <w:sz w:val="18"/>
+                <w:szCs w:val="18"/>
+              </w:rPr>
+              <w:t xml:space="preserve">x</w:t>
+            </w:r>
+          </w:p>
+        </w:tc>
+      </w:tr>
+      <w:tr>
+        <w:tc>
+          <w:tcPr>
+            <w:tcW w:type="dxa" w:w="1500"/>
+            <w:tcBorders>
+              <w:top w:val="single" w:color="BBBBBB" w:sz="4"/>
+              <w:left w:val="single" w:color="BBBBBB" w:sz="4"/>
+              <w:bottom w:val="single" w:color="BBBBBB" w:sz="4"/>
+              <w:right w:val="single" w:color="BBBBBB" w:sz="4"/>
+            </w:tcBorders>
+            <w:tcMar>
+              <w:top w:type="dxa" w:w="60"/>
+              <w:left w:type="dxa" w:w="100"/>
+              <w:bottom w:type="dxa" w:w="60"/>
+              <w:right w:type="dxa" w:w="100"/>
+            </w:tcMar>
+            <w:vAlign w:val="center"/>
+          </w:tcPr>
+          <w:p>
+            <w:pPr>
+              <w:spacing w:line="240" w:lineRule="auto"/>
+              <w:jc w:val="center"/>
+            </w:pPr>
+            <w:r>
+              <w:rPr>
+                <w:rFonts w:ascii="Arial" w:cs="Arial" w:eastAsia="Arial" w:hAnsi="Arial"/>
+                <w:b w:val="false"/>
+                <w:bCs w:val="false"/>
+                <w:sz w:val="18"/>
+                <w:szCs w:val="18"/>
+              </w:rPr>
+              <w:t xml:space="preserve">16.03.2026</w:t>
+            </w:r>
+          </w:p>
+        </w:tc>
+        <w:tc>
+          <w:tcPr>
+            <w:tcW w:type="dxa" w:w="4337"/>
+            <w:tcBorders>
+              <w:top w:val="single" w:color="BBBBBB" w:sz="4"/>
+              <w:left w:val="single" w:color="BBBBBB" w:sz="4"/>
+              <w:bottom w:val="single" w:color="BBBBBB" w:sz="4"/>
+              <w:right w:val="single" w:color="BBBBBB" w:sz="4"/>
+            </w:tcBorders>
+            <w:tcMar>
+              <w:top w:type="dxa" w:w="60"/>
+              <w:left w:type="dxa" w:w="100"/>
+              <w:bottom w:type="dxa" w:w="60"/>
+              <w:right w:type="dxa" w:w="100"/>
+            </w:tcMar>
+            <w:vAlign w:val="center"/>
+          </w:tcPr>
+          <w:p>
+            <w:pPr>
+              <w:spacing w:line="240" w:lineRule="auto"/>
+              <w:jc w:val="left"/>
+            </w:pPr>
+            <w:r>
+              <w:rPr>
+                <w:rFonts w:ascii="Arial" w:cs="Arial" w:eastAsia="Arial" w:hAnsi="Arial"/>
+                <w:b w:val="false"/>
+                <w:bCs w:val="false"/>
+                <w:sz w:val="18"/>
+                <w:szCs w:val="18"/>
+              </w:rPr>
+              <w:t xml:space="preserve">Scope-Reduktion: 4 Level auf 3 (L4 Freizeitpark gestrichen)</w:t>
+            </w:r>
+          </w:p>
+        </w:tc>
+        <w:tc>
+          <w:tcPr>
+            <w:tcW w:type="dxa" w:w="700"/>
+            <w:tcBorders>
+              <w:top w:val="single" w:color="BBBBBB" w:sz="4"/>
+              <w:left w:val="single" w:color="BBBBBB" w:sz="4"/>
+              <w:bottom w:val="single" w:color="BBBBBB" w:sz="4"/>
+              <w:right w:val="single" w:color="BBBBBB" w:sz="4"/>
+            </w:tcBorders>
+            <w:tcMar>
+              <w:top w:type="dxa" w:w="60"/>
+              <w:left w:type="dxa" w:w="100"/>
+              <w:bottom w:type="dxa" w:w="60"/>
+              <w:right w:type="dxa" w:w="100"/>
+            </w:tcMar>
+            <w:vAlign w:val="center"/>
+          </w:tcPr>
+          <w:p>
+            <w:pPr>
+              <w:spacing w:line="240" w:lineRule="auto"/>
+              <w:jc w:val="center"/>
+            </w:pPr>
+            <w:r>
+              <w:rPr>
+                <w:rFonts w:ascii="Arial" w:cs="Arial" w:eastAsia="Arial" w:hAnsi="Arial"/>
+                <w:b w:val="false"/>
+                <w:bCs w:val="false"/>
+                <w:sz w:val="18"/>
+                <w:szCs w:val="18"/>
+              </w:rPr>
+              <w:t xml:space="preserve">x</w:t>
+            </w:r>
+          </w:p>
+        </w:tc>
+        <w:tc>
+          <w:tcPr>
+            <w:tcW w:type="dxa" w:w="700"/>
+            <w:tcBorders>
+              <w:top w:val="single" w:color="BBBBBB" w:sz="4"/>
+              <w:left w:val="single" w:color="BBBBBB" w:sz="4"/>
+              <w:bottom w:val="single" w:color="BBBBBB" w:sz="4"/>
+              <w:right w:val="single" w:color="BBBBBB" w:sz="4"/>
+            </w:tcBorders>
+            <w:tcMar>
+              <w:top w:type="dxa" w:w="60"/>
+              <w:left w:type="dxa" w:w="100"/>
+              <w:bottom w:type="dxa" w:w="60"/>
+              <w:right w:type="dxa" w:w="100"/>
+            </w:tcMar>
+            <w:vAlign w:val="center"/>
+          </w:tcPr>
+          <w:p>
+            <w:pPr>
+              <w:spacing w:line="240" w:lineRule="auto"/>
+              <w:jc w:val="center"/>
+            </w:pPr>
+            <w:r>
+              <w:rPr>
+                <w:rFonts w:ascii="Arial" w:cs="Arial" w:eastAsia="Arial" w:hAnsi="Arial"/>
+                <w:b w:val="false"/>
+                <w:bCs w:val="false"/>
+                <w:sz w:val="18"/>
+                <w:szCs w:val="18"/>
+              </w:rPr>
+              <w:t xml:space="preserve">x</w:t>
+            </w:r>
+          </w:p>
+        </w:tc>
+        <w:tc>
+          <w:tcPr>
+            <w:tcW w:type="dxa" w:w="700"/>
+            <w:tcBorders>
+              <w:top w:val="single" w:color="BBBBBB" w:sz="4"/>
+              <w:left w:val="single" w:color="BBBBBB" w:sz="4"/>
+              <w:bottom w:val="single" w:color="BBBBBB" w:sz="4"/>
+              <w:right w:val="single" w:color="BBBBBB" w:sz="4"/>
+            </w:tcBorders>
+            <w:tcMar>
+              <w:top w:type="dxa" w:w="60"/>
+              <w:left w:type="dxa" w:w="100"/>
+              <w:bottom w:type="dxa" w:w="60"/>
+              <w:right w:type="dxa" w:w="100"/>
+            </w:tcMar>
+            <w:vAlign w:val="center"/>
+          </w:tcPr>
+          <w:p>
+            <w:pPr>
+              <w:spacing w:line="240" w:lineRule="auto"/>
+              <w:jc w:val="center"/>
+            </w:pPr>
+            <w:r>
+              <w:rPr>
+                <w:rFonts w:ascii="Arial" w:cs="Arial" w:eastAsia="Arial" w:hAnsi="Arial"/>
+                <w:b w:val="false"/>
+                <w:bCs w:val="false"/>
+                <w:sz w:val="18"/>
+                <w:szCs w:val="18"/>
+              </w:rPr>
+              <w:t xml:space="preserve">x</w:t>
+            </w:r>
+          </w:p>
+        </w:tc>
+      </w:tr>
+      <w:tr>
+        <w:tc>
+          <w:tcPr>
+            <w:tcW w:type="dxa" w:w="1500"/>
+            <w:tcBorders>
+              <w:top w:val="single" w:color="BBBBBB" w:sz="4"/>
+              <w:left w:val="single" w:color="BBBBBB" w:sz="4"/>
+              <w:bottom w:val="single" w:color="BBBBBB" w:sz="4"/>
+              <w:right w:val="single" w:color="BBBBBB" w:sz="4"/>
+            </w:tcBorders>
+            <w:tcMar>
+              <w:top w:type="dxa" w:w="60"/>
+              <w:left w:type="dxa" w:w="100"/>
+              <w:bottom w:type="dxa" w:w="60"/>
+              <w:right w:type="dxa" w:w="100"/>
+            </w:tcMar>
+            <w:vAlign w:val="center"/>
+          </w:tcPr>
+          <w:p>
+            <w:pPr>
+              <w:spacing w:line="240" w:lineRule="auto"/>
+              <w:jc w:val="center"/>
+            </w:pPr>
+            <w:r>
+              <w:rPr>
+                <w:rFonts w:ascii="Arial" w:cs="Arial" w:eastAsia="Arial" w:hAnsi="Arial"/>
+                <w:b w:val="false"/>
+                <w:bCs w:val="false"/>
+                <w:sz w:val="18"/>
+                <w:szCs w:val="18"/>
+              </w:rPr>
+              <w:t xml:space="preserve">16.03.2026</w:t>
+            </w:r>
+          </w:p>
+        </w:tc>
+        <w:tc>
+          <w:tcPr>
+            <w:tcW w:type="dxa" w:w="4337"/>
+            <w:tcBorders>
+              <w:top w:val="single" w:color="BBBBBB" w:sz="4"/>
+              <w:left w:val="single" w:color="BBBBBB" w:sz="4"/>
+              <w:bottom w:val="single" w:color="BBBBBB" w:sz="4"/>
+              <w:right w:val="single" w:color="BBBBBB" w:sz="4"/>
+            </w:tcBorders>
+            <w:tcMar>
+              <w:top w:type="dxa" w:w="60"/>
+              <w:left w:type="dxa" w:w="100"/>
+              <w:bottom w:type="dxa" w:w="60"/>
+              <w:right w:type="dxa" w:w="100"/>
+            </w:tcMar>
+            <w:vAlign w:val="center"/>
+          </w:tcPr>
+          <w:p>
+            <w:pPr>
+              <w:spacing w:line="240" w:lineRule="auto"/>
+              <w:jc w:val="left"/>
+            </w:pPr>
+            <w:r>
+              <w:rPr>
+                <w:rFonts w:ascii="Arial" w:cs="Arial" w:eastAsia="Arial" w:hAnsi="Arial"/>
+                <w:b w:val="false"/>
+                <w:bCs w:val="false"/>
+                <w:sz w:val="18"/>
+                <w:szCs w:val="18"/>
+              </w:rPr>
+              <w:t xml:space="preserve">GDD + Arbeitsprotokoll aktualisiert (alle Aenderungen)</w:t>
             </w:r>
           </w:p>
         </w:tc>

</xml_diff>

<commit_message>
fix(balloon+smog): tune balloon physics, add Arbeitsprotokoll entries 17+21.03
- balloon rise speed 30→60 px/s, horizontal amplitude 100→150px, period 2.5→1.8s
- smog cap fix and balloon spawn fix already applied in water.js/main.js
- arbeitsprotokoll: L2 rocket, finish trigger, balloon mechanic (17.03) + today's fixes (21.03)
- L2 rocket Pixelorama source files updated

Co-Authored-By: Claude Sonnet 4.6 <noreply@anthropic.com>
</commit_message>
<xml_diff>
--- a/Dokumente_Schule/Ausgefuellt/Arbeitsprotokoll_Julian_Gomez.docx
+++ b/Dokumente_Schule/Ausgefuellt/Arbeitsprotokoll_Julian_Gomez.docx
@@ -9263,6 +9263,1554 @@
                 <w:szCs w:val="18"/>
               </w:rPr>
               <w:t xml:space="preserve">GDD + Arbeitsprotokoll aktualisiert (alle Aenderungen)</w:t>
+            </w:r>
+          </w:p>
+        </w:tc>
+        <w:tc>
+          <w:tcPr>
+            <w:tcW w:type="dxa" w:w="700"/>
+            <w:tcBorders>
+              <w:top w:val="single" w:color="BBBBBB" w:sz="4"/>
+              <w:left w:val="single" w:color="BBBBBB" w:sz="4"/>
+              <w:bottom w:val="single" w:color="BBBBBB" w:sz="4"/>
+              <w:right w:val="single" w:color="BBBBBB" w:sz="4"/>
+            </w:tcBorders>
+            <w:tcMar>
+              <w:top w:type="dxa" w:w="60"/>
+              <w:left w:type="dxa" w:w="100"/>
+              <w:bottom w:type="dxa" w:w="60"/>
+              <w:right w:type="dxa" w:w="100"/>
+            </w:tcMar>
+            <w:vAlign w:val="center"/>
+          </w:tcPr>
+          <w:p>
+            <w:pPr>
+              <w:spacing w:line="240" w:lineRule="auto"/>
+              <w:jc w:val="center"/>
+            </w:pPr>
+            <w:r>
+              <w:rPr>
+                <w:rFonts w:ascii="Arial" w:cs="Arial" w:eastAsia="Arial" w:hAnsi="Arial"/>
+                <w:b w:val="false"/>
+                <w:bCs w:val="false"/>
+                <w:sz w:val="18"/>
+                <w:szCs w:val="18"/>
+              </w:rPr>
+              <w:t xml:space="preserve">x</w:t>
+            </w:r>
+          </w:p>
+        </w:tc>
+        <w:tc>
+          <w:tcPr>
+            <w:tcW w:type="dxa" w:w="700"/>
+            <w:tcBorders>
+              <w:top w:val="single" w:color="BBBBBB" w:sz="4"/>
+              <w:left w:val="single" w:color="BBBBBB" w:sz="4"/>
+              <w:bottom w:val="single" w:color="BBBBBB" w:sz="4"/>
+              <w:right w:val="single" w:color="BBBBBB" w:sz="4"/>
+            </w:tcBorders>
+            <w:tcMar>
+              <w:top w:type="dxa" w:w="60"/>
+              <w:left w:type="dxa" w:w="100"/>
+              <w:bottom w:type="dxa" w:w="60"/>
+              <w:right w:type="dxa" w:w="100"/>
+            </w:tcMar>
+            <w:vAlign w:val="center"/>
+          </w:tcPr>
+          <w:p>
+            <w:pPr>
+              <w:spacing w:line="240" w:lineRule="auto"/>
+              <w:jc w:val="center"/>
+            </w:pPr>
+            <w:r>
+              <w:rPr>
+                <w:rFonts w:ascii="Arial" w:cs="Arial" w:eastAsia="Arial" w:hAnsi="Arial"/>
+                <w:b w:val="false"/>
+                <w:bCs w:val="false"/>
+                <w:sz w:val="18"/>
+                <w:szCs w:val="18"/>
+              </w:rPr>
+              <w:t xml:space="preserve">x</w:t>
+            </w:r>
+          </w:p>
+        </w:tc>
+        <w:tc>
+          <w:tcPr>
+            <w:tcW w:type="dxa" w:w="700"/>
+            <w:tcBorders>
+              <w:top w:val="single" w:color="BBBBBB" w:sz="4"/>
+              <w:left w:val="single" w:color="BBBBBB" w:sz="4"/>
+              <w:bottom w:val="single" w:color="BBBBBB" w:sz="4"/>
+              <w:right w:val="single" w:color="BBBBBB" w:sz="4"/>
+            </w:tcBorders>
+            <w:tcMar>
+              <w:top w:type="dxa" w:w="60"/>
+              <w:left w:type="dxa" w:w="100"/>
+              <w:bottom w:type="dxa" w:w="60"/>
+              <w:right w:type="dxa" w:w="100"/>
+            </w:tcMar>
+            <w:vAlign w:val="center"/>
+          </w:tcPr>
+          <w:p>
+            <w:pPr>
+              <w:spacing w:line="240" w:lineRule="auto"/>
+              <w:jc w:val="center"/>
+            </w:pPr>
+            <w:r>
+              <w:rPr>
+                <w:rFonts w:ascii="Arial" w:cs="Arial" w:eastAsia="Arial" w:hAnsi="Arial"/>
+                <w:b w:val="false"/>
+                <w:bCs w:val="false"/>
+                <w:sz w:val="18"/>
+                <w:szCs w:val="18"/>
+              </w:rPr>
+              <w:t xml:space="preserve">x</w:t>
+            </w:r>
+          </w:p>
+        </w:tc>
+      </w:tr>
+      <w:tr>
+        <w:tc>
+          <w:tcPr>
+            <w:tcW w:type="dxa" w:w="1500"/>
+            <w:tcBorders>
+              <w:top w:val="single" w:color="BBBBBB" w:sz="4"/>
+              <w:left w:val="single" w:color="BBBBBB" w:sz="4"/>
+              <w:bottom w:val="single" w:color="BBBBBB" w:sz="4"/>
+              <w:right w:val="single" w:color="BBBBBB" w:sz="4"/>
+            </w:tcBorders>
+            <w:tcMar>
+              <w:top w:type="dxa" w:w="60"/>
+              <w:left w:type="dxa" w:w="100"/>
+              <w:bottom w:type="dxa" w:w="60"/>
+              <w:right w:type="dxa" w:w="100"/>
+            </w:tcMar>
+            <w:vAlign w:val="center"/>
+          </w:tcPr>
+          <w:p>
+            <w:pPr>
+              <w:spacing w:line="240" w:lineRule="auto"/>
+              <w:jc w:val="center"/>
+            </w:pPr>
+            <w:r>
+              <w:rPr>
+                <w:rFonts w:ascii="Arial" w:cs="Arial" w:eastAsia="Arial" w:hAnsi="Arial"/>
+                <w:b w:val="false"/>
+                <w:bCs w:val="false"/>
+                <w:sz w:val="18"/>
+                <w:szCs w:val="18"/>
+              </w:rPr>
+              <w:t xml:space="preserve">17.03.2026</w:t>
+            </w:r>
+          </w:p>
+        </w:tc>
+        <w:tc>
+          <w:tcPr>
+            <w:tcW w:type="dxa" w:w="4337"/>
+            <w:tcBorders>
+              <w:top w:val="single" w:color="BBBBBB" w:sz="4"/>
+              <w:left w:val="single" w:color="BBBBBB" w:sz="4"/>
+              <w:bottom w:val="single" w:color="BBBBBB" w:sz="4"/>
+              <w:right w:val="single" w:color="BBBBBB" w:sz="4"/>
+            </w:tcBorders>
+            <w:tcMar>
+              <w:top w:type="dxa" w:w="60"/>
+              <w:left w:type="dxa" w:w="100"/>
+              <w:bottom w:type="dxa" w:w="60"/>
+              <w:right w:type="dxa" w:w="100"/>
+            </w:tcMar>
+            <w:vAlign w:val="center"/>
+          </w:tcPr>
+          <w:p>
+            <w:pPr>
+              <w:spacing w:line="240" w:lineRule="auto"/>
+              <w:jc w:val="left"/>
+            </w:pPr>
+            <w:r>
+              <w:rPr>
+                <w:rFonts w:ascii="Arial" w:cs="Arial" w:eastAsia="Arial" w:hAnsi="Arial"/>
+                <w:b w:val="false"/>
+                <w:bCs w:val="false"/>
+                <w:sz w:val="18"/>
+                <w:szCs w:val="18"/>
+              </w:rPr>
+              <w:t xml:space="preserve">L2 Hintergrund: Rocket-Sprite als 3-Layer-Parallax</w:t>
+            </w:r>
+          </w:p>
+        </w:tc>
+        <w:tc>
+          <w:tcPr>
+            <w:tcW w:type="dxa" w:w="700"/>
+            <w:tcBorders>
+              <w:top w:val="single" w:color="BBBBBB" w:sz="4"/>
+              <w:left w:val="single" w:color="BBBBBB" w:sz="4"/>
+              <w:bottom w:val="single" w:color="BBBBBB" w:sz="4"/>
+              <w:right w:val="single" w:color="BBBBBB" w:sz="4"/>
+            </w:tcBorders>
+            <w:tcMar>
+              <w:top w:type="dxa" w:w="60"/>
+              <w:left w:type="dxa" w:w="100"/>
+              <w:bottom w:type="dxa" w:w="60"/>
+              <w:right w:type="dxa" w:w="100"/>
+            </w:tcMar>
+            <w:vAlign w:val="center"/>
+          </w:tcPr>
+          <w:p>
+            <w:pPr>
+              <w:spacing w:line="240" w:lineRule="auto"/>
+              <w:jc w:val="center"/>
+            </w:pPr>
+            <w:r>
+              <w:rPr>
+                <w:rFonts w:ascii="Arial" w:cs="Arial" w:eastAsia="Arial" w:hAnsi="Arial"/>
+                <w:b w:val="false"/>
+                <w:bCs w:val="false"/>
+                <w:sz w:val="18"/>
+                <w:szCs w:val="18"/>
+              </w:rPr>
+              <w:t xml:space="preserve">x</w:t>
+            </w:r>
+          </w:p>
+        </w:tc>
+        <w:tc>
+          <w:tcPr>
+            <w:tcW w:type="dxa" w:w="700"/>
+            <w:tcBorders>
+              <w:top w:val="single" w:color="BBBBBB" w:sz="4"/>
+              <w:left w:val="single" w:color="BBBBBB" w:sz="4"/>
+              <w:bottom w:val="single" w:color="BBBBBB" w:sz="4"/>
+              <w:right w:val="single" w:color="BBBBBB" w:sz="4"/>
+            </w:tcBorders>
+            <w:tcMar>
+              <w:top w:type="dxa" w:w="60"/>
+              <w:left w:type="dxa" w:w="100"/>
+              <w:bottom w:type="dxa" w:w="60"/>
+              <w:right w:type="dxa" w:w="100"/>
+            </w:tcMar>
+            <w:vAlign w:val="center"/>
+          </w:tcPr>
+          <w:p>
+            <w:pPr>
+              <w:spacing w:line="240" w:lineRule="auto"/>
+              <w:jc w:val="center"/>
+            </w:pPr>
+            <w:r>
+              <w:rPr>
+                <w:rFonts w:ascii="Arial" w:cs="Arial" w:eastAsia="Arial" w:hAnsi="Arial"/>
+                <w:b w:val="false"/>
+                <w:bCs w:val="false"/>
+                <w:sz w:val="18"/>
+                <w:szCs w:val="18"/>
+              </w:rPr>
+              <w:t xml:space="preserve">x</w:t>
+            </w:r>
+          </w:p>
+        </w:tc>
+        <w:tc>
+          <w:tcPr>
+            <w:tcW w:type="dxa" w:w="700"/>
+            <w:tcBorders>
+              <w:top w:val="single" w:color="BBBBBB" w:sz="4"/>
+              <w:left w:val="single" w:color="BBBBBB" w:sz="4"/>
+              <w:bottom w:val="single" w:color="BBBBBB" w:sz="4"/>
+              <w:right w:val="single" w:color="BBBBBB" w:sz="4"/>
+            </w:tcBorders>
+            <w:tcMar>
+              <w:top w:type="dxa" w:w="60"/>
+              <w:left w:type="dxa" w:w="100"/>
+              <w:bottom w:type="dxa" w:w="60"/>
+              <w:right w:type="dxa" w:w="100"/>
+            </w:tcMar>
+            <w:vAlign w:val="center"/>
+          </w:tcPr>
+          <w:p>
+            <w:pPr>
+              <w:spacing w:line="240" w:lineRule="auto"/>
+              <w:jc w:val="center"/>
+            </w:pPr>
+            <w:r>
+              <w:rPr>
+                <w:rFonts w:ascii="Arial" w:cs="Arial" w:eastAsia="Arial" w:hAnsi="Arial"/>
+                <w:b w:val="false"/>
+                <w:bCs w:val="false"/>
+                <w:sz w:val="18"/>
+                <w:szCs w:val="18"/>
+              </w:rPr>
+              <w:t xml:space="preserve">x</w:t>
+            </w:r>
+          </w:p>
+        </w:tc>
+      </w:tr>
+      <w:tr>
+        <w:tc>
+          <w:tcPr>
+            <w:tcW w:type="dxa" w:w="1500"/>
+            <w:tcBorders>
+              <w:top w:val="single" w:color="BBBBBB" w:sz="4"/>
+              <w:left w:val="single" w:color="BBBBBB" w:sz="4"/>
+              <w:bottom w:val="single" w:color="BBBBBB" w:sz="4"/>
+              <w:right w:val="single" w:color="BBBBBB" w:sz="4"/>
+            </w:tcBorders>
+            <w:tcMar>
+              <w:top w:type="dxa" w:w="60"/>
+              <w:left w:type="dxa" w:w="100"/>
+              <w:bottom w:type="dxa" w:w="60"/>
+              <w:right w:type="dxa" w:w="100"/>
+            </w:tcMar>
+            <w:vAlign w:val="center"/>
+          </w:tcPr>
+          <w:p>
+            <w:pPr>
+              <w:spacing w:line="240" w:lineRule="auto"/>
+              <w:jc w:val="center"/>
+            </w:pPr>
+            <w:r>
+              <w:rPr>
+                <w:rFonts w:ascii="Arial" w:cs="Arial" w:eastAsia="Arial" w:hAnsi="Arial"/>
+                <w:b w:val="false"/>
+                <w:bCs w:val="false"/>
+                <w:sz w:val="18"/>
+                <w:szCs w:val="18"/>
+              </w:rPr>
+              <w:t xml:space="preserve">17.03.2026</w:t>
+            </w:r>
+          </w:p>
+        </w:tc>
+        <w:tc>
+          <w:tcPr>
+            <w:tcW w:type="dxa" w:w="4337"/>
+            <w:tcBorders>
+              <w:top w:val="single" w:color="BBBBBB" w:sz="4"/>
+              <w:left w:val="single" w:color="BBBBBB" w:sz="4"/>
+              <w:bottom w:val="single" w:color="BBBBBB" w:sz="4"/>
+              <w:right w:val="single" w:color="BBBBBB" w:sz="4"/>
+            </w:tcBorders>
+            <w:tcMar>
+              <w:top w:type="dxa" w:w="60"/>
+              <w:left w:type="dxa" w:w="100"/>
+              <w:bottom w:type="dxa" w:w="60"/>
+              <w:right w:type="dxa" w:w="100"/>
+            </w:tcMar>
+            <w:vAlign w:val="center"/>
+          </w:tcPr>
+          <w:p>
+            <w:pPr>
+              <w:spacing w:line="240" w:lineRule="auto"/>
+              <w:jc w:val="left"/>
+            </w:pPr>
+            <w:r>
+              <w:rPr>
+                <w:rFonts w:ascii="Arial" w:cs="Arial" w:eastAsia="Arial" w:hAnsi="Arial"/>
+                <w:b w:val="false"/>
+                <w:bCs w:val="false"/>
+                <w:sz w:val="18"/>
+                <w:szCs w:val="18"/>
+              </w:rPr>
+              <w:t xml:space="preserve">Finish-Trigger: Z-Taste auf Zielplattform loest Levelende aus</w:t>
+            </w:r>
+          </w:p>
+        </w:tc>
+        <w:tc>
+          <w:tcPr>
+            <w:tcW w:type="dxa" w:w="700"/>
+            <w:tcBorders>
+              <w:top w:val="single" w:color="BBBBBB" w:sz="4"/>
+              <w:left w:val="single" w:color="BBBBBB" w:sz="4"/>
+              <w:bottom w:val="single" w:color="BBBBBB" w:sz="4"/>
+              <w:right w:val="single" w:color="BBBBBB" w:sz="4"/>
+            </w:tcBorders>
+            <w:tcMar>
+              <w:top w:type="dxa" w:w="60"/>
+              <w:left w:type="dxa" w:w="100"/>
+              <w:bottom w:type="dxa" w:w="60"/>
+              <w:right w:type="dxa" w:w="100"/>
+            </w:tcMar>
+            <w:vAlign w:val="center"/>
+          </w:tcPr>
+          <w:p>
+            <w:pPr>
+              <w:spacing w:line="240" w:lineRule="auto"/>
+              <w:jc w:val="center"/>
+            </w:pPr>
+            <w:r>
+              <w:rPr>
+                <w:rFonts w:ascii="Arial" w:cs="Arial" w:eastAsia="Arial" w:hAnsi="Arial"/>
+                <w:b w:val="false"/>
+                <w:bCs w:val="false"/>
+                <w:sz w:val="18"/>
+                <w:szCs w:val="18"/>
+              </w:rPr>
+              <w:t xml:space="preserve">x</w:t>
+            </w:r>
+          </w:p>
+        </w:tc>
+        <w:tc>
+          <w:tcPr>
+            <w:tcW w:type="dxa" w:w="700"/>
+            <w:tcBorders>
+              <w:top w:val="single" w:color="BBBBBB" w:sz="4"/>
+              <w:left w:val="single" w:color="BBBBBB" w:sz="4"/>
+              <w:bottom w:val="single" w:color="BBBBBB" w:sz="4"/>
+              <w:right w:val="single" w:color="BBBBBB" w:sz="4"/>
+            </w:tcBorders>
+            <w:tcMar>
+              <w:top w:type="dxa" w:w="60"/>
+              <w:left w:type="dxa" w:w="100"/>
+              <w:bottom w:type="dxa" w:w="60"/>
+              <w:right w:type="dxa" w:w="100"/>
+            </w:tcMar>
+            <w:vAlign w:val="center"/>
+          </w:tcPr>
+          <w:p>
+            <w:pPr>
+              <w:spacing w:line="240" w:lineRule="auto"/>
+              <w:jc w:val="center"/>
+            </w:pPr>
+            <w:r>
+              <w:rPr>
+                <w:rFonts w:ascii="Arial" w:cs="Arial" w:eastAsia="Arial" w:hAnsi="Arial"/>
+                <w:b w:val="false"/>
+                <w:bCs w:val="false"/>
+                <w:sz w:val="18"/>
+                <w:szCs w:val="18"/>
+              </w:rPr>
+              <w:t xml:space="preserve">x</w:t>
+            </w:r>
+          </w:p>
+        </w:tc>
+        <w:tc>
+          <w:tcPr>
+            <w:tcW w:type="dxa" w:w="700"/>
+            <w:tcBorders>
+              <w:top w:val="single" w:color="BBBBBB" w:sz="4"/>
+              <w:left w:val="single" w:color="BBBBBB" w:sz="4"/>
+              <w:bottom w:val="single" w:color="BBBBBB" w:sz="4"/>
+              <w:right w:val="single" w:color="BBBBBB" w:sz="4"/>
+            </w:tcBorders>
+            <w:tcMar>
+              <w:top w:type="dxa" w:w="60"/>
+              <w:left w:type="dxa" w:w="100"/>
+              <w:bottom w:type="dxa" w:w="60"/>
+              <w:right w:type="dxa" w:w="100"/>
+            </w:tcMar>
+            <w:vAlign w:val="center"/>
+          </w:tcPr>
+          <w:p>
+            <w:pPr>
+              <w:spacing w:line="240" w:lineRule="auto"/>
+              <w:jc w:val="center"/>
+            </w:pPr>
+            <w:r>
+              <w:rPr>
+                <w:rFonts w:ascii="Arial" w:cs="Arial" w:eastAsia="Arial" w:hAnsi="Arial"/>
+                <w:b w:val="false"/>
+                <w:bCs w:val="false"/>
+                <w:sz w:val="18"/>
+                <w:szCs w:val="18"/>
+              </w:rPr>
+              <w:t xml:space="preserve">x</w:t>
+            </w:r>
+          </w:p>
+        </w:tc>
+      </w:tr>
+      <w:tr>
+        <w:tc>
+          <w:tcPr>
+            <w:tcW w:type="dxa" w:w="1500"/>
+            <w:tcBorders>
+              <w:top w:val="single" w:color="BBBBBB" w:sz="4"/>
+              <w:left w:val="single" w:color="BBBBBB" w:sz="4"/>
+              <w:bottom w:val="single" w:color="BBBBBB" w:sz="4"/>
+              <w:right w:val="single" w:color="BBBBBB" w:sz="4"/>
+            </w:tcBorders>
+            <w:tcMar>
+              <w:top w:type="dxa" w:w="60"/>
+              <w:left w:type="dxa" w:w="100"/>
+              <w:bottom w:type="dxa" w:w="60"/>
+              <w:right w:type="dxa" w:w="100"/>
+            </w:tcMar>
+            <w:vAlign w:val="center"/>
+          </w:tcPr>
+          <w:p>
+            <w:pPr>
+              <w:spacing w:line="240" w:lineRule="auto"/>
+              <w:jc w:val="center"/>
+            </w:pPr>
+            <w:r>
+              <w:rPr>
+                <w:rFonts w:ascii="Arial" w:cs="Arial" w:eastAsia="Arial" w:hAnsi="Arial"/>
+                <w:b w:val="false"/>
+                <w:bCs w:val="false"/>
+                <w:sz w:val="18"/>
+                <w:szCs w:val="18"/>
+              </w:rPr>
+              <w:t xml:space="preserve">17.03.2026</w:t>
+            </w:r>
+          </w:p>
+        </w:tc>
+        <w:tc>
+          <w:tcPr>
+            <w:tcW w:type="dxa" w:w="4337"/>
+            <w:tcBorders>
+              <w:top w:val="single" w:color="BBBBBB" w:sz="4"/>
+              <w:left w:val="single" w:color="BBBBBB" w:sz="4"/>
+              <w:bottom w:val="single" w:color="BBBBBB" w:sz="4"/>
+              <w:right w:val="single" w:color="BBBBBB" w:sz="4"/>
+            </w:tcBorders>
+            <w:tcMar>
+              <w:top w:type="dxa" w:w="60"/>
+              <w:left w:type="dxa" w:w="100"/>
+              <w:bottom w:type="dxa" w:w="60"/>
+              <w:right w:type="dxa" w:w="100"/>
+            </w:tcMar>
+            <w:vAlign w:val="center"/>
+          </w:tcPr>
+          <w:p>
+            <w:pPr>
+              <w:spacing w:line="240" w:lineRule="auto"/>
+              <w:jc w:val="left"/>
+            </w:pPr>
+            <w:r>
+              <w:rPr>
+                <w:rFonts w:ascii="Arial" w:cs="Arial" w:eastAsia="Arial" w:hAnsi="Arial"/>
+                <w:b w:val="false"/>
+                <w:bCs w:val="false"/>
+                <w:sz w:val="18"/>
+                <w:szCs w:val="18"/>
+              </w:rPr>
+              <w:t xml:space="preserve">Finish-Animationen: Windrad (L1), Glocke (L2), Hebel (L3)</w:t>
+            </w:r>
+          </w:p>
+        </w:tc>
+        <w:tc>
+          <w:tcPr>
+            <w:tcW w:type="dxa" w:w="700"/>
+            <w:tcBorders>
+              <w:top w:val="single" w:color="BBBBBB" w:sz="4"/>
+              <w:left w:val="single" w:color="BBBBBB" w:sz="4"/>
+              <w:bottom w:val="single" w:color="BBBBBB" w:sz="4"/>
+              <w:right w:val="single" w:color="BBBBBB" w:sz="4"/>
+            </w:tcBorders>
+            <w:tcMar>
+              <w:top w:type="dxa" w:w="60"/>
+              <w:left w:type="dxa" w:w="100"/>
+              <w:bottom w:type="dxa" w:w="60"/>
+              <w:right w:type="dxa" w:w="100"/>
+            </w:tcMar>
+            <w:vAlign w:val="center"/>
+          </w:tcPr>
+          <w:p>
+            <w:pPr>
+              <w:spacing w:line="240" w:lineRule="auto"/>
+              <w:jc w:val="center"/>
+            </w:pPr>
+            <w:r>
+              <w:rPr>
+                <w:rFonts w:ascii="Arial" w:cs="Arial" w:eastAsia="Arial" w:hAnsi="Arial"/>
+                <w:b w:val="false"/>
+                <w:bCs w:val="false"/>
+                <w:sz w:val="18"/>
+                <w:szCs w:val="18"/>
+              </w:rPr>
+              <w:t xml:space="preserve">x</w:t>
+            </w:r>
+          </w:p>
+        </w:tc>
+        <w:tc>
+          <w:tcPr>
+            <w:tcW w:type="dxa" w:w="700"/>
+            <w:tcBorders>
+              <w:top w:val="single" w:color="BBBBBB" w:sz="4"/>
+              <w:left w:val="single" w:color="BBBBBB" w:sz="4"/>
+              <w:bottom w:val="single" w:color="BBBBBB" w:sz="4"/>
+              <w:right w:val="single" w:color="BBBBBB" w:sz="4"/>
+            </w:tcBorders>
+            <w:tcMar>
+              <w:top w:type="dxa" w:w="60"/>
+              <w:left w:type="dxa" w:w="100"/>
+              <w:bottom w:type="dxa" w:w="60"/>
+              <w:right w:type="dxa" w:w="100"/>
+            </w:tcMar>
+            <w:vAlign w:val="center"/>
+          </w:tcPr>
+          <w:p>
+            <w:pPr>
+              <w:spacing w:line="240" w:lineRule="auto"/>
+              <w:jc w:val="center"/>
+            </w:pPr>
+            <w:r>
+              <w:rPr>
+                <w:rFonts w:ascii="Arial" w:cs="Arial" w:eastAsia="Arial" w:hAnsi="Arial"/>
+                <w:b w:val="false"/>
+                <w:bCs w:val="false"/>
+                <w:sz w:val="18"/>
+                <w:szCs w:val="18"/>
+              </w:rPr>
+              <w:t xml:space="preserve">x</w:t>
+            </w:r>
+          </w:p>
+        </w:tc>
+        <w:tc>
+          <w:tcPr>
+            <w:tcW w:type="dxa" w:w="700"/>
+            <w:tcBorders>
+              <w:top w:val="single" w:color="BBBBBB" w:sz="4"/>
+              <w:left w:val="single" w:color="BBBBBB" w:sz="4"/>
+              <w:bottom w:val="single" w:color="BBBBBB" w:sz="4"/>
+              <w:right w:val="single" w:color="BBBBBB" w:sz="4"/>
+            </w:tcBorders>
+            <w:tcMar>
+              <w:top w:type="dxa" w:w="60"/>
+              <w:left w:type="dxa" w:w="100"/>
+              <w:bottom w:type="dxa" w:w="60"/>
+              <w:right w:type="dxa" w:w="100"/>
+            </w:tcMar>
+            <w:vAlign w:val="center"/>
+          </w:tcPr>
+          <w:p>
+            <w:pPr>
+              <w:spacing w:line="240" w:lineRule="auto"/>
+              <w:jc w:val="center"/>
+            </w:pPr>
+            <w:r>
+              <w:rPr>
+                <w:rFonts w:ascii="Arial" w:cs="Arial" w:eastAsia="Arial" w:hAnsi="Arial"/>
+                <w:b w:val="false"/>
+                <w:bCs w:val="false"/>
+                <w:sz w:val="18"/>
+                <w:szCs w:val="18"/>
+              </w:rPr>
+              <w:t xml:space="preserve">x</w:t>
+            </w:r>
+          </w:p>
+        </w:tc>
+      </w:tr>
+      <w:tr>
+        <w:tc>
+          <w:tcPr>
+            <w:tcW w:type="dxa" w:w="1500"/>
+            <w:tcBorders>
+              <w:top w:val="single" w:color="BBBBBB" w:sz="4"/>
+              <w:left w:val="single" w:color="BBBBBB" w:sz="4"/>
+              <w:bottom w:val="single" w:color="BBBBBB" w:sz="4"/>
+              <w:right w:val="single" w:color="BBBBBB" w:sz="4"/>
+            </w:tcBorders>
+            <w:tcMar>
+              <w:top w:type="dxa" w:w="60"/>
+              <w:left w:type="dxa" w:w="100"/>
+              <w:bottom w:type="dxa" w:w="60"/>
+              <w:right w:type="dxa" w:w="100"/>
+            </w:tcMar>
+            <w:vAlign w:val="center"/>
+          </w:tcPr>
+          <w:p>
+            <w:pPr>
+              <w:spacing w:line="240" w:lineRule="auto"/>
+              <w:jc w:val="center"/>
+            </w:pPr>
+            <w:r>
+              <w:rPr>
+                <w:rFonts w:ascii="Arial" w:cs="Arial" w:eastAsia="Arial" w:hAnsi="Arial"/>
+                <w:b w:val="false"/>
+                <w:bCs w:val="false"/>
+                <w:sz w:val="18"/>
+                <w:szCs w:val="18"/>
+              </w:rPr>
+              <w:t xml:space="preserve">17.03.2026</w:t>
+            </w:r>
+          </w:p>
+        </w:tc>
+        <w:tc>
+          <w:tcPr>
+            <w:tcW w:type="dxa" w:w="4337"/>
+            <w:tcBorders>
+              <w:top w:val="single" w:color="BBBBBB" w:sz="4"/>
+              <w:left w:val="single" w:color="BBBBBB" w:sz="4"/>
+              <w:bottom w:val="single" w:color="BBBBBB" w:sz="4"/>
+              <w:right w:val="single" w:color="BBBBBB" w:sz="4"/>
+            </w:tcBorders>
+            <w:tcMar>
+              <w:top w:type="dxa" w:w="60"/>
+              <w:left w:type="dxa" w:w="100"/>
+              <w:bottom w:type="dxa" w:w="60"/>
+              <w:right w:type="dxa" w:w="100"/>
+            </w:tcMar>
+            <w:vAlign w:val="center"/>
+          </w:tcPr>
+          <w:p>
+            <w:pPr>
+              <w:spacing w:line="240" w:lineRule="auto"/>
+              <w:jc w:val="left"/>
+            </w:pPr>
+            <w:r>
+              <w:rPr>
+                <w:rFonts w:ascii="Arial" w:cs="Arial" w:eastAsia="Arial" w:hAnsi="Arial"/>
+                <w:b w:val="false"/>
+                <w:bCs w:val="false"/>
+                <w:sz w:val="18"/>
+                <w:szCs w:val="18"/>
+              </w:rPr>
+              <w:t xml:space="preserve">Hazard-Fade: 1.2s Alpha-Ausblenden bei Levelende</w:t>
+            </w:r>
+          </w:p>
+        </w:tc>
+        <w:tc>
+          <w:tcPr>
+            <w:tcW w:type="dxa" w:w="700"/>
+            <w:tcBorders>
+              <w:top w:val="single" w:color="BBBBBB" w:sz="4"/>
+              <w:left w:val="single" w:color="BBBBBB" w:sz="4"/>
+              <w:bottom w:val="single" w:color="BBBBBB" w:sz="4"/>
+              <w:right w:val="single" w:color="BBBBBB" w:sz="4"/>
+            </w:tcBorders>
+            <w:tcMar>
+              <w:top w:type="dxa" w:w="60"/>
+              <w:left w:type="dxa" w:w="100"/>
+              <w:bottom w:type="dxa" w:w="60"/>
+              <w:right w:type="dxa" w:w="100"/>
+            </w:tcMar>
+            <w:vAlign w:val="center"/>
+          </w:tcPr>
+          <w:p>
+            <w:pPr>
+              <w:spacing w:line="240" w:lineRule="auto"/>
+              <w:jc w:val="center"/>
+            </w:pPr>
+            <w:r>
+              <w:rPr>
+                <w:rFonts w:ascii="Arial" w:cs="Arial" w:eastAsia="Arial" w:hAnsi="Arial"/>
+                <w:b w:val="false"/>
+                <w:bCs w:val="false"/>
+                <w:sz w:val="18"/>
+                <w:szCs w:val="18"/>
+              </w:rPr>
+              <w:t xml:space="preserve">x</w:t>
+            </w:r>
+          </w:p>
+        </w:tc>
+        <w:tc>
+          <w:tcPr>
+            <w:tcW w:type="dxa" w:w="700"/>
+            <w:tcBorders>
+              <w:top w:val="single" w:color="BBBBBB" w:sz="4"/>
+              <w:left w:val="single" w:color="BBBBBB" w:sz="4"/>
+              <w:bottom w:val="single" w:color="BBBBBB" w:sz="4"/>
+              <w:right w:val="single" w:color="BBBBBB" w:sz="4"/>
+            </w:tcBorders>
+            <w:tcMar>
+              <w:top w:type="dxa" w:w="60"/>
+              <w:left w:type="dxa" w:w="100"/>
+              <w:bottom w:type="dxa" w:w="60"/>
+              <w:right w:type="dxa" w:w="100"/>
+            </w:tcMar>
+            <w:vAlign w:val="center"/>
+          </w:tcPr>
+          <w:p>
+            <w:pPr>
+              <w:spacing w:line="240" w:lineRule="auto"/>
+              <w:jc w:val="center"/>
+            </w:pPr>
+            <w:r>
+              <w:rPr>
+                <w:rFonts w:ascii="Arial" w:cs="Arial" w:eastAsia="Arial" w:hAnsi="Arial"/>
+                <w:b w:val="false"/>
+                <w:bCs w:val="false"/>
+                <w:sz w:val="18"/>
+                <w:szCs w:val="18"/>
+              </w:rPr>
+              <w:t xml:space="preserve">x</w:t>
+            </w:r>
+          </w:p>
+        </w:tc>
+        <w:tc>
+          <w:tcPr>
+            <w:tcW w:type="dxa" w:w="700"/>
+            <w:tcBorders>
+              <w:top w:val="single" w:color="BBBBBB" w:sz="4"/>
+              <w:left w:val="single" w:color="BBBBBB" w:sz="4"/>
+              <w:bottom w:val="single" w:color="BBBBBB" w:sz="4"/>
+              <w:right w:val="single" w:color="BBBBBB" w:sz="4"/>
+            </w:tcBorders>
+            <w:tcMar>
+              <w:top w:type="dxa" w:w="60"/>
+              <w:left w:type="dxa" w:w="100"/>
+              <w:bottom w:type="dxa" w:w="60"/>
+              <w:right w:type="dxa" w:w="100"/>
+            </w:tcMar>
+            <w:vAlign w:val="center"/>
+          </w:tcPr>
+          <w:p>
+            <w:pPr>
+              <w:spacing w:line="240" w:lineRule="auto"/>
+              <w:jc w:val="center"/>
+            </w:pPr>
+            <w:r>
+              <w:rPr>
+                <w:rFonts w:ascii="Arial" w:cs="Arial" w:eastAsia="Arial" w:hAnsi="Arial"/>
+                <w:b w:val="false"/>
+                <w:bCs w:val="false"/>
+                <w:sz w:val="18"/>
+                <w:szCs w:val="18"/>
+              </w:rPr>
+              <w:t xml:space="preserve">x</w:t>
+            </w:r>
+          </w:p>
+        </w:tc>
+      </w:tr>
+      <w:tr>
+        <w:tc>
+          <w:tcPr>
+            <w:tcW w:type="dxa" w:w="1500"/>
+            <w:tcBorders>
+              <w:top w:val="single" w:color="BBBBBB" w:sz="4"/>
+              <w:left w:val="single" w:color="BBBBBB" w:sz="4"/>
+              <w:bottom w:val="single" w:color="BBBBBB" w:sz="4"/>
+              <w:right w:val="single" w:color="BBBBBB" w:sz="4"/>
+            </w:tcBorders>
+            <w:tcMar>
+              <w:top w:type="dxa" w:w="60"/>
+              <w:left w:type="dxa" w:w="100"/>
+              <w:bottom w:type="dxa" w:w="60"/>
+              <w:right w:type="dxa" w:w="100"/>
+            </w:tcMar>
+            <w:vAlign w:val="center"/>
+          </w:tcPr>
+          <w:p>
+            <w:pPr>
+              <w:spacing w:line="240" w:lineRule="auto"/>
+              <w:jc w:val="center"/>
+            </w:pPr>
+            <w:r>
+              <w:rPr>
+                <w:rFonts w:ascii="Arial" w:cs="Arial" w:eastAsia="Arial" w:hAnsi="Arial"/>
+                <w:b w:val="false"/>
+                <w:bCs w:val="false"/>
+                <w:sz w:val="18"/>
+                <w:szCs w:val="18"/>
+              </w:rPr>
+              <w:t xml:space="preserve">17.03.2026</w:t>
+            </w:r>
+          </w:p>
+        </w:tc>
+        <w:tc>
+          <w:tcPr>
+            <w:tcW w:type="dxa" w:w="4337"/>
+            <w:tcBorders>
+              <w:top w:val="single" w:color="BBBBBB" w:sz="4"/>
+              <w:left w:val="single" w:color="BBBBBB" w:sz="4"/>
+              <w:bottom w:val="single" w:color="BBBBBB" w:sz="4"/>
+              <w:right w:val="single" w:color="BBBBBB" w:sz="4"/>
+            </w:tcBorders>
+            <w:tcMar>
+              <w:top w:type="dxa" w:w="60"/>
+              <w:left w:type="dxa" w:w="100"/>
+              <w:bottom w:type="dxa" w:w="60"/>
+              <w:right w:type="dxa" w:w="100"/>
+            </w:tcMar>
+            <w:vAlign w:val="center"/>
+          </w:tcPr>
+          <w:p>
+            <w:pPr>
+              <w:spacing w:line="240" w:lineRule="auto"/>
+              <w:jc w:val="left"/>
+            </w:pPr>
+            <w:r>
+              <w:rPr>
+                <w:rFonts w:ascii="Arial" w:cs="Arial" w:eastAsia="Arial" w:hAnsi="Arial"/>
+                <w:b w:val="false"/>
+                <w:bCs w:val="false"/>
+                <w:sz w:val="18"/>
+                <w:szCs w:val="18"/>
+              </w:rPr>
+              <w:t xml:space="preserve">Ballon-Sammelobjekt: Spawn, Lissajous, Z-Fang-Mechanik</w:t>
+            </w:r>
+          </w:p>
+        </w:tc>
+        <w:tc>
+          <w:tcPr>
+            <w:tcW w:type="dxa" w:w="700"/>
+            <w:tcBorders>
+              <w:top w:val="single" w:color="BBBBBB" w:sz="4"/>
+              <w:left w:val="single" w:color="BBBBBB" w:sz="4"/>
+              <w:bottom w:val="single" w:color="BBBBBB" w:sz="4"/>
+              <w:right w:val="single" w:color="BBBBBB" w:sz="4"/>
+            </w:tcBorders>
+            <w:tcMar>
+              <w:top w:type="dxa" w:w="60"/>
+              <w:left w:type="dxa" w:w="100"/>
+              <w:bottom w:type="dxa" w:w="60"/>
+              <w:right w:type="dxa" w:w="100"/>
+            </w:tcMar>
+            <w:vAlign w:val="center"/>
+          </w:tcPr>
+          <w:p>
+            <w:pPr>
+              <w:spacing w:line="240" w:lineRule="auto"/>
+              <w:jc w:val="center"/>
+            </w:pPr>
+            <w:r>
+              <w:rPr>
+                <w:rFonts w:ascii="Arial" w:cs="Arial" w:eastAsia="Arial" w:hAnsi="Arial"/>
+                <w:b w:val="false"/>
+                <w:bCs w:val="false"/>
+                <w:sz w:val="18"/>
+                <w:szCs w:val="18"/>
+              </w:rPr>
+              <w:t xml:space="preserve">x</w:t>
+            </w:r>
+          </w:p>
+        </w:tc>
+        <w:tc>
+          <w:tcPr>
+            <w:tcW w:type="dxa" w:w="700"/>
+            <w:tcBorders>
+              <w:top w:val="single" w:color="BBBBBB" w:sz="4"/>
+              <w:left w:val="single" w:color="BBBBBB" w:sz="4"/>
+              <w:bottom w:val="single" w:color="BBBBBB" w:sz="4"/>
+              <w:right w:val="single" w:color="BBBBBB" w:sz="4"/>
+            </w:tcBorders>
+            <w:tcMar>
+              <w:top w:type="dxa" w:w="60"/>
+              <w:left w:type="dxa" w:w="100"/>
+              <w:bottom w:type="dxa" w:w="60"/>
+              <w:right w:type="dxa" w:w="100"/>
+            </w:tcMar>
+            <w:vAlign w:val="center"/>
+          </w:tcPr>
+          <w:p>
+            <w:pPr>
+              <w:spacing w:line="240" w:lineRule="auto"/>
+              <w:jc w:val="center"/>
+            </w:pPr>
+            <w:r>
+              <w:rPr>
+                <w:rFonts w:ascii="Arial" w:cs="Arial" w:eastAsia="Arial" w:hAnsi="Arial"/>
+                <w:b w:val="false"/>
+                <w:bCs w:val="false"/>
+                <w:sz w:val="18"/>
+                <w:szCs w:val="18"/>
+              </w:rPr>
+              <w:t xml:space="preserve">x</w:t>
+            </w:r>
+          </w:p>
+        </w:tc>
+        <w:tc>
+          <w:tcPr>
+            <w:tcW w:type="dxa" w:w="700"/>
+            <w:tcBorders>
+              <w:top w:val="single" w:color="BBBBBB" w:sz="4"/>
+              <w:left w:val="single" w:color="BBBBBB" w:sz="4"/>
+              <w:bottom w:val="single" w:color="BBBBBB" w:sz="4"/>
+              <w:right w:val="single" w:color="BBBBBB" w:sz="4"/>
+            </w:tcBorders>
+            <w:tcMar>
+              <w:top w:type="dxa" w:w="60"/>
+              <w:left w:type="dxa" w:w="100"/>
+              <w:bottom w:type="dxa" w:w="60"/>
+              <w:right w:type="dxa" w:w="100"/>
+            </w:tcMar>
+            <w:vAlign w:val="center"/>
+          </w:tcPr>
+          <w:p>
+            <w:pPr>
+              <w:spacing w:line="240" w:lineRule="auto"/>
+              <w:jc w:val="center"/>
+            </w:pPr>
+            <w:r>
+              <w:rPr>
+                <w:rFonts w:ascii="Arial" w:cs="Arial" w:eastAsia="Arial" w:hAnsi="Arial"/>
+                <w:b w:val="false"/>
+                <w:bCs w:val="false"/>
+                <w:sz w:val="18"/>
+                <w:szCs w:val="18"/>
+              </w:rPr>
+              <w:t xml:space="preserve">x</w:t>
+            </w:r>
+          </w:p>
+        </w:tc>
+      </w:tr>
+      <w:tr>
+        <w:tc>
+          <w:tcPr>
+            <w:tcW w:type="dxa" w:w="1500"/>
+            <w:tcBorders>
+              <w:top w:val="single" w:color="BBBBBB" w:sz="4"/>
+              <w:left w:val="single" w:color="BBBBBB" w:sz="4"/>
+              <w:bottom w:val="single" w:color="BBBBBB" w:sz="4"/>
+              <w:right w:val="single" w:color="BBBBBB" w:sz="4"/>
+            </w:tcBorders>
+            <w:tcMar>
+              <w:top w:type="dxa" w:w="60"/>
+              <w:left w:type="dxa" w:w="100"/>
+              <w:bottom w:type="dxa" w:w="60"/>
+              <w:right w:type="dxa" w:w="100"/>
+            </w:tcMar>
+            <w:vAlign w:val="center"/>
+          </w:tcPr>
+          <w:p>
+            <w:pPr>
+              <w:spacing w:line="240" w:lineRule="auto"/>
+              <w:jc w:val="center"/>
+            </w:pPr>
+            <w:r>
+              <w:rPr>
+                <w:rFonts w:ascii="Arial" w:cs="Arial" w:eastAsia="Arial" w:hAnsi="Arial"/>
+                <w:b w:val="false"/>
+                <w:bCs w:val="false"/>
+                <w:sz w:val="18"/>
+                <w:szCs w:val="18"/>
+              </w:rPr>
+              <w:t xml:space="preserve">17.03.2026</w:t>
+            </w:r>
+          </w:p>
+        </w:tc>
+        <w:tc>
+          <w:tcPr>
+            <w:tcW w:type="dxa" w:w="4337"/>
+            <w:tcBorders>
+              <w:top w:val="single" w:color="BBBBBB" w:sz="4"/>
+              <w:left w:val="single" w:color="BBBBBB" w:sz="4"/>
+              <w:bottom w:val="single" w:color="BBBBBB" w:sz="4"/>
+              <w:right w:val="single" w:color="BBBBBB" w:sz="4"/>
+            </w:tcBorders>
+            <w:tcMar>
+              <w:top w:type="dxa" w:w="60"/>
+              <w:left w:type="dxa" w:w="100"/>
+              <w:bottom w:type="dxa" w:w="60"/>
+              <w:right w:type="dxa" w:w="100"/>
+            </w:tcMar>
+            <w:vAlign w:val="center"/>
+          </w:tcPr>
+          <w:p>
+            <w:pPr>
+              <w:spacing w:line="240" w:lineRule="auto"/>
+              <w:jc w:val="left"/>
+            </w:pPr>
+            <w:r>
+              <w:rPr>
+                <w:rFonts w:ascii="Arial" w:cs="Arial" w:eastAsia="Arial" w:hAnsi="Arial"/>
+                <w:b w:val="false"/>
+                <w:bCs w:val="false"/>
+                <w:sz w:val="18"/>
+                <w:szCs w:val="18"/>
+              </w:rPr>
+              <w:t xml:space="preserve">Walk-Animation: walk_1/walk_2 Sprites integriert</w:t>
+            </w:r>
+          </w:p>
+        </w:tc>
+        <w:tc>
+          <w:tcPr>
+            <w:tcW w:type="dxa" w:w="700"/>
+            <w:tcBorders>
+              <w:top w:val="single" w:color="BBBBBB" w:sz="4"/>
+              <w:left w:val="single" w:color="BBBBBB" w:sz="4"/>
+              <w:bottom w:val="single" w:color="BBBBBB" w:sz="4"/>
+              <w:right w:val="single" w:color="BBBBBB" w:sz="4"/>
+            </w:tcBorders>
+            <w:tcMar>
+              <w:top w:type="dxa" w:w="60"/>
+              <w:left w:type="dxa" w:w="100"/>
+              <w:bottom w:type="dxa" w:w="60"/>
+              <w:right w:type="dxa" w:w="100"/>
+            </w:tcMar>
+            <w:vAlign w:val="center"/>
+          </w:tcPr>
+          <w:p>
+            <w:pPr>
+              <w:spacing w:line="240" w:lineRule="auto"/>
+              <w:jc w:val="center"/>
+            </w:pPr>
+            <w:r>
+              <w:rPr>
+                <w:rFonts w:ascii="Arial" w:cs="Arial" w:eastAsia="Arial" w:hAnsi="Arial"/>
+                <w:b w:val="false"/>
+                <w:bCs w:val="false"/>
+                <w:sz w:val="18"/>
+                <w:szCs w:val="18"/>
+              </w:rPr>
+              <w:t xml:space="preserve">x</w:t>
+            </w:r>
+          </w:p>
+        </w:tc>
+        <w:tc>
+          <w:tcPr>
+            <w:tcW w:type="dxa" w:w="700"/>
+            <w:tcBorders>
+              <w:top w:val="single" w:color="BBBBBB" w:sz="4"/>
+              <w:left w:val="single" w:color="BBBBBB" w:sz="4"/>
+              <w:bottom w:val="single" w:color="BBBBBB" w:sz="4"/>
+              <w:right w:val="single" w:color="BBBBBB" w:sz="4"/>
+            </w:tcBorders>
+            <w:tcMar>
+              <w:top w:type="dxa" w:w="60"/>
+              <w:left w:type="dxa" w:w="100"/>
+              <w:bottom w:type="dxa" w:w="60"/>
+              <w:right w:type="dxa" w:w="100"/>
+            </w:tcMar>
+            <w:vAlign w:val="center"/>
+          </w:tcPr>
+          <w:p>
+            <w:pPr>
+              <w:spacing w:line="240" w:lineRule="auto"/>
+              <w:jc w:val="center"/>
+            </w:pPr>
+            <w:r>
+              <w:rPr>
+                <w:rFonts w:ascii="Arial" w:cs="Arial" w:eastAsia="Arial" w:hAnsi="Arial"/>
+                <w:b w:val="false"/>
+                <w:bCs w:val="false"/>
+                <w:sz w:val="18"/>
+                <w:szCs w:val="18"/>
+              </w:rPr>
+              <w:t xml:space="preserve">x</w:t>
+            </w:r>
+          </w:p>
+        </w:tc>
+        <w:tc>
+          <w:tcPr>
+            <w:tcW w:type="dxa" w:w="700"/>
+            <w:tcBorders>
+              <w:top w:val="single" w:color="BBBBBB" w:sz="4"/>
+              <w:left w:val="single" w:color="BBBBBB" w:sz="4"/>
+              <w:bottom w:val="single" w:color="BBBBBB" w:sz="4"/>
+              <w:right w:val="single" w:color="BBBBBB" w:sz="4"/>
+            </w:tcBorders>
+            <w:tcMar>
+              <w:top w:type="dxa" w:w="60"/>
+              <w:left w:type="dxa" w:w="100"/>
+              <w:bottom w:type="dxa" w:w="60"/>
+              <w:right w:type="dxa" w:w="100"/>
+            </w:tcMar>
+            <w:vAlign w:val="center"/>
+          </w:tcPr>
+          <w:p>
+            <w:pPr>
+              <w:spacing w:line="240" w:lineRule="auto"/>
+              <w:jc w:val="center"/>
+            </w:pPr>
+            <w:r>
+              <w:rPr>
+                <w:rFonts w:ascii="Arial" w:cs="Arial" w:eastAsia="Arial" w:hAnsi="Arial"/>
+                <w:b w:val="false"/>
+                <w:bCs w:val="false"/>
+                <w:sz w:val="18"/>
+                <w:szCs w:val="18"/>
+              </w:rPr>
+              <w:t xml:space="preserve">x</w:t>
+            </w:r>
+          </w:p>
+        </w:tc>
+      </w:tr>
+      <w:tr>
+        <w:tc>
+          <w:tcPr>
+            <w:tcW w:type="dxa" w:w="1500"/>
+            <w:tcBorders>
+              <w:top w:val="single" w:color="BBBBBB" w:sz="4"/>
+              <w:left w:val="single" w:color="BBBBBB" w:sz="4"/>
+              <w:bottom w:val="single" w:color="BBBBBB" w:sz="4"/>
+              <w:right w:val="single" w:color="BBBBBB" w:sz="4"/>
+            </w:tcBorders>
+            <w:tcMar>
+              <w:top w:type="dxa" w:w="60"/>
+              <w:left w:type="dxa" w:w="100"/>
+              <w:bottom w:type="dxa" w:w="60"/>
+              <w:right w:type="dxa" w:w="100"/>
+            </w:tcMar>
+            <w:vAlign w:val="center"/>
+          </w:tcPr>
+          <w:p>
+            <w:pPr>
+              <w:spacing w:line="240" w:lineRule="auto"/>
+              <w:jc w:val="center"/>
+            </w:pPr>
+            <w:r>
+              <w:rPr>
+                <w:rFonts w:ascii="Arial" w:cs="Arial" w:eastAsia="Arial" w:hAnsi="Arial"/>
+                <w:b w:val="false"/>
+                <w:bCs w:val="false"/>
+                <w:sz w:val="18"/>
+                <w:szCs w:val="18"/>
+              </w:rPr>
+              <w:t xml:space="preserve">21.03.2026</w:t>
+            </w:r>
+          </w:p>
+        </w:tc>
+        <w:tc>
+          <w:tcPr>
+            <w:tcW w:type="dxa" w:w="4337"/>
+            <w:tcBorders>
+              <w:top w:val="single" w:color="BBBBBB" w:sz="4"/>
+              <w:left w:val="single" w:color="BBBBBB" w:sz="4"/>
+              <w:bottom w:val="single" w:color="BBBBBB" w:sz="4"/>
+              <w:right w:val="single" w:color="BBBBBB" w:sz="4"/>
+            </w:tcBorders>
+            <w:tcMar>
+              <w:top w:type="dxa" w:w="60"/>
+              <w:left w:type="dxa" w:w="100"/>
+              <w:bottom w:type="dxa" w:w="60"/>
+              <w:right w:type="dxa" w:w="100"/>
+            </w:tcMar>
+            <w:vAlign w:val="center"/>
+          </w:tcPr>
+          <w:p>
+            <w:pPr>
+              <w:spacing w:line="240" w:lineRule="auto"/>
+              <w:jc w:val="left"/>
+            </w:pPr>
+            <w:r>
+              <w:rPr>
+                <w:rFonts w:ascii="Arial" w:cs="Arial" w:eastAsia="Arial" w:hAnsi="Arial"/>
+                <w:b w:val="false"/>
+                <w:bCs w:val="false"/>
+                <w:sz w:val="18"/>
+                <w:szCs w:val="18"/>
+              </w:rPr>
+              <w:t xml:space="preserve">Smog L1: Obergrenze bei levelGoalY+22 nach Sichtbarkeits-Clamp</w:t>
+            </w:r>
+          </w:p>
+        </w:tc>
+        <w:tc>
+          <w:tcPr>
+            <w:tcW w:type="dxa" w:w="700"/>
+            <w:tcBorders>
+              <w:top w:val="single" w:color="BBBBBB" w:sz="4"/>
+              <w:left w:val="single" w:color="BBBBBB" w:sz="4"/>
+              <w:bottom w:val="single" w:color="BBBBBB" w:sz="4"/>
+              <w:right w:val="single" w:color="BBBBBB" w:sz="4"/>
+            </w:tcBorders>
+            <w:tcMar>
+              <w:top w:type="dxa" w:w="60"/>
+              <w:left w:type="dxa" w:w="100"/>
+              <w:bottom w:type="dxa" w:w="60"/>
+              <w:right w:type="dxa" w:w="100"/>
+            </w:tcMar>
+            <w:vAlign w:val="center"/>
+          </w:tcPr>
+          <w:p>
+            <w:pPr>
+              <w:spacing w:line="240" w:lineRule="auto"/>
+              <w:jc w:val="center"/>
+            </w:pPr>
+            <w:r>
+              <w:rPr>
+                <w:rFonts w:ascii="Arial" w:cs="Arial" w:eastAsia="Arial" w:hAnsi="Arial"/>
+                <w:b w:val="false"/>
+                <w:bCs w:val="false"/>
+                <w:sz w:val="18"/>
+                <w:szCs w:val="18"/>
+              </w:rPr>
+              <w:t xml:space="preserve">x</w:t>
+            </w:r>
+          </w:p>
+        </w:tc>
+        <w:tc>
+          <w:tcPr>
+            <w:tcW w:type="dxa" w:w="700"/>
+            <w:tcBorders>
+              <w:top w:val="single" w:color="BBBBBB" w:sz="4"/>
+              <w:left w:val="single" w:color="BBBBBB" w:sz="4"/>
+              <w:bottom w:val="single" w:color="BBBBBB" w:sz="4"/>
+              <w:right w:val="single" w:color="BBBBBB" w:sz="4"/>
+            </w:tcBorders>
+            <w:tcMar>
+              <w:top w:type="dxa" w:w="60"/>
+              <w:left w:type="dxa" w:w="100"/>
+              <w:bottom w:type="dxa" w:w="60"/>
+              <w:right w:type="dxa" w:w="100"/>
+            </w:tcMar>
+            <w:vAlign w:val="center"/>
+          </w:tcPr>
+          <w:p>
+            <w:pPr>
+              <w:spacing w:line="240" w:lineRule="auto"/>
+              <w:jc w:val="center"/>
+            </w:pPr>
+            <w:r>
+              <w:rPr>
+                <w:rFonts w:ascii="Arial" w:cs="Arial" w:eastAsia="Arial" w:hAnsi="Arial"/>
+                <w:b w:val="false"/>
+                <w:bCs w:val="false"/>
+                <w:sz w:val="18"/>
+                <w:szCs w:val="18"/>
+              </w:rPr>
+              <w:t xml:space="preserve">x</w:t>
+            </w:r>
+          </w:p>
+        </w:tc>
+        <w:tc>
+          <w:tcPr>
+            <w:tcW w:type="dxa" w:w="700"/>
+            <w:tcBorders>
+              <w:top w:val="single" w:color="BBBBBB" w:sz="4"/>
+              <w:left w:val="single" w:color="BBBBBB" w:sz="4"/>
+              <w:bottom w:val="single" w:color="BBBBBB" w:sz="4"/>
+              <w:right w:val="single" w:color="BBBBBB" w:sz="4"/>
+            </w:tcBorders>
+            <w:tcMar>
+              <w:top w:type="dxa" w:w="60"/>
+              <w:left w:type="dxa" w:w="100"/>
+              <w:bottom w:type="dxa" w:w="60"/>
+              <w:right w:type="dxa" w:w="100"/>
+            </w:tcMar>
+            <w:vAlign w:val="center"/>
+          </w:tcPr>
+          <w:p>
+            <w:pPr>
+              <w:spacing w:line="240" w:lineRule="auto"/>
+              <w:jc w:val="center"/>
+            </w:pPr>
+            <w:r>
+              <w:rPr>
+                <w:rFonts w:ascii="Arial" w:cs="Arial" w:eastAsia="Arial" w:hAnsi="Arial"/>
+                <w:b w:val="false"/>
+                <w:bCs w:val="false"/>
+                <w:sz w:val="18"/>
+                <w:szCs w:val="18"/>
+              </w:rPr>
+              <w:t xml:space="preserve">x</w:t>
+            </w:r>
+          </w:p>
+        </w:tc>
+      </w:tr>
+      <w:tr>
+        <w:tc>
+          <w:tcPr>
+            <w:tcW w:type="dxa" w:w="1500"/>
+            <w:tcBorders>
+              <w:top w:val="single" w:color="BBBBBB" w:sz="4"/>
+              <w:left w:val="single" w:color="BBBBBB" w:sz="4"/>
+              <w:bottom w:val="single" w:color="BBBBBB" w:sz="4"/>
+              <w:right w:val="single" w:color="BBBBBB" w:sz="4"/>
+            </w:tcBorders>
+            <w:tcMar>
+              <w:top w:type="dxa" w:w="60"/>
+              <w:left w:type="dxa" w:w="100"/>
+              <w:bottom w:type="dxa" w:w="60"/>
+              <w:right w:type="dxa" w:w="100"/>
+            </w:tcMar>
+            <w:vAlign w:val="center"/>
+          </w:tcPr>
+          <w:p>
+            <w:pPr>
+              <w:spacing w:line="240" w:lineRule="auto"/>
+              <w:jc w:val="center"/>
+            </w:pPr>
+            <w:r>
+              <w:rPr>
+                <w:rFonts w:ascii="Arial" w:cs="Arial" w:eastAsia="Arial" w:hAnsi="Arial"/>
+                <w:b w:val="false"/>
+                <w:bCs w:val="false"/>
+                <w:sz w:val="18"/>
+                <w:szCs w:val="18"/>
+              </w:rPr>
+              <w:t xml:space="preserve">21.03.2026</w:t>
+            </w:r>
+          </w:p>
+        </w:tc>
+        <w:tc>
+          <w:tcPr>
+            <w:tcW w:type="dxa" w:w="4337"/>
+            <w:tcBorders>
+              <w:top w:val="single" w:color="BBBBBB" w:sz="4"/>
+              <w:left w:val="single" w:color="BBBBBB" w:sz="4"/>
+              <w:bottom w:val="single" w:color="BBBBBB" w:sz="4"/>
+              <w:right w:val="single" w:color="BBBBBB" w:sz="4"/>
+            </w:tcBorders>
+            <w:tcMar>
+              <w:top w:type="dxa" w:w="60"/>
+              <w:left w:type="dxa" w:w="100"/>
+              <w:bottom w:type="dxa" w:w="60"/>
+              <w:right w:type="dxa" w:w="100"/>
+            </w:tcMar>
+            <w:vAlign w:val="center"/>
+          </w:tcPr>
+          <w:p>
+            <w:pPr>
+              <w:spacing w:line="240" w:lineRule="auto"/>
+              <w:jc w:val="left"/>
+            </w:pPr>
+            <w:r>
+              <w:rPr>
+                <w:rFonts w:ascii="Arial" w:cs="Arial" w:eastAsia="Arial" w:hAnsi="Arial"/>
+                <w:b w:val="false"/>
+                <w:bCs w:val="false"/>
+                <w:sz w:val="18"/>
+                <w:szCs w:val="18"/>
+              </w:rPr>
+              <w:t xml:space="preserve">Ballon: Spawn bei player.y-90 (Weltkoordinaten) statt Bildschirmrand</w:t>
+            </w:r>
+          </w:p>
+        </w:tc>
+        <w:tc>
+          <w:tcPr>
+            <w:tcW w:type="dxa" w:w="700"/>
+            <w:tcBorders>
+              <w:top w:val="single" w:color="BBBBBB" w:sz="4"/>
+              <w:left w:val="single" w:color="BBBBBB" w:sz="4"/>
+              <w:bottom w:val="single" w:color="BBBBBB" w:sz="4"/>
+              <w:right w:val="single" w:color="BBBBBB" w:sz="4"/>
+            </w:tcBorders>
+            <w:tcMar>
+              <w:top w:type="dxa" w:w="60"/>
+              <w:left w:type="dxa" w:w="100"/>
+              <w:bottom w:type="dxa" w:w="60"/>
+              <w:right w:type="dxa" w:w="100"/>
+            </w:tcMar>
+            <w:vAlign w:val="center"/>
+          </w:tcPr>
+          <w:p>
+            <w:pPr>
+              <w:spacing w:line="240" w:lineRule="auto"/>
+              <w:jc w:val="center"/>
+            </w:pPr>
+            <w:r>
+              <w:rPr>
+                <w:rFonts w:ascii="Arial" w:cs="Arial" w:eastAsia="Arial" w:hAnsi="Arial"/>
+                <w:b w:val="false"/>
+                <w:bCs w:val="false"/>
+                <w:sz w:val="18"/>
+                <w:szCs w:val="18"/>
+              </w:rPr>
+              <w:t xml:space="preserve">x</w:t>
+            </w:r>
+          </w:p>
+        </w:tc>
+        <w:tc>
+          <w:tcPr>
+            <w:tcW w:type="dxa" w:w="700"/>
+            <w:tcBorders>
+              <w:top w:val="single" w:color="BBBBBB" w:sz="4"/>
+              <w:left w:val="single" w:color="BBBBBB" w:sz="4"/>
+              <w:bottom w:val="single" w:color="BBBBBB" w:sz="4"/>
+              <w:right w:val="single" w:color="BBBBBB" w:sz="4"/>
+            </w:tcBorders>
+            <w:tcMar>
+              <w:top w:type="dxa" w:w="60"/>
+              <w:left w:type="dxa" w:w="100"/>
+              <w:bottom w:type="dxa" w:w="60"/>
+              <w:right w:type="dxa" w:w="100"/>
+            </w:tcMar>
+            <w:vAlign w:val="center"/>
+          </w:tcPr>
+          <w:p>
+            <w:pPr>
+              <w:spacing w:line="240" w:lineRule="auto"/>
+              <w:jc w:val="center"/>
+            </w:pPr>
+            <w:r>
+              <w:rPr>
+                <w:rFonts w:ascii="Arial" w:cs="Arial" w:eastAsia="Arial" w:hAnsi="Arial"/>
+                <w:b w:val="false"/>
+                <w:bCs w:val="false"/>
+                <w:sz w:val="18"/>
+                <w:szCs w:val="18"/>
+              </w:rPr>
+              <w:t xml:space="preserve">x</w:t>
+            </w:r>
+          </w:p>
+        </w:tc>
+        <w:tc>
+          <w:tcPr>
+            <w:tcW w:type="dxa" w:w="700"/>
+            <w:tcBorders>
+              <w:top w:val="single" w:color="BBBBBB" w:sz="4"/>
+              <w:left w:val="single" w:color="BBBBBB" w:sz="4"/>
+              <w:bottom w:val="single" w:color="BBBBBB" w:sz="4"/>
+              <w:right w:val="single" w:color="BBBBBB" w:sz="4"/>
+            </w:tcBorders>
+            <w:tcMar>
+              <w:top w:type="dxa" w:w="60"/>
+              <w:left w:type="dxa" w:w="100"/>
+              <w:bottom w:type="dxa" w:w="60"/>
+              <w:right w:type="dxa" w:w="100"/>
+            </w:tcMar>
+            <w:vAlign w:val="center"/>
+          </w:tcPr>
+          <w:p>
+            <w:pPr>
+              <w:spacing w:line="240" w:lineRule="auto"/>
+              <w:jc w:val="center"/>
+            </w:pPr>
+            <w:r>
+              <w:rPr>
+                <w:rFonts w:ascii="Arial" w:cs="Arial" w:eastAsia="Arial" w:hAnsi="Arial"/>
+                <w:b w:val="false"/>
+                <w:bCs w:val="false"/>
+                <w:sz w:val="18"/>
+                <w:szCs w:val="18"/>
+              </w:rPr>
+              <w:t xml:space="preserve">x</w:t>
+            </w:r>
+          </w:p>
+        </w:tc>
+      </w:tr>
+      <w:tr>
+        <w:tc>
+          <w:tcPr>
+            <w:tcW w:type="dxa" w:w="1500"/>
+            <w:tcBorders>
+              <w:top w:val="single" w:color="BBBBBB" w:sz="4"/>
+              <w:left w:val="single" w:color="BBBBBB" w:sz="4"/>
+              <w:bottom w:val="single" w:color="BBBBBB" w:sz="4"/>
+              <w:right w:val="single" w:color="BBBBBB" w:sz="4"/>
+            </w:tcBorders>
+            <w:tcMar>
+              <w:top w:type="dxa" w:w="60"/>
+              <w:left w:type="dxa" w:w="100"/>
+              <w:bottom w:type="dxa" w:w="60"/>
+              <w:right w:type="dxa" w:w="100"/>
+            </w:tcMar>
+            <w:vAlign w:val="center"/>
+          </w:tcPr>
+          <w:p>
+            <w:pPr>
+              <w:spacing w:line="240" w:lineRule="auto"/>
+              <w:jc w:val="center"/>
+            </w:pPr>
+            <w:r>
+              <w:rPr>
+                <w:rFonts w:ascii="Arial" w:cs="Arial" w:eastAsia="Arial" w:hAnsi="Arial"/>
+                <w:b w:val="false"/>
+                <w:bCs w:val="false"/>
+                <w:sz w:val="18"/>
+                <w:szCs w:val="18"/>
+              </w:rPr>
+              <w:t xml:space="preserve">21.03.2026</w:t>
+            </w:r>
+          </w:p>
+        </w:tc>
+        <w:tc>
+          <w:tcPr>
+            <w:tcW w:type="dxa" w:w="4337"/>
+            <w:tcBorders>
+              <w:top w:val="single" w:color="BBBBBB" w:sz="4"/>
+              <w:left w:val="single" w:color="BBBBBB" w:sz="4"/>
+              <w:bottom w:val="single" w:color="BBBBBB" w:sz="4"/>
+              <w:right w:val="single" w:color="BBBBBB" w:sz="4"/>
+            </w:tcBorders>
+            <w:tcMar>
+              <w:top w:type="dxa" w:w="60"/>
+              <w:left w:type="dxa" w:w="100"/>
+              <w:bottom w:type="dxa" w:w="60"/>
+              <w:right w:type="dxa" w:w="100"/>
+            </w:tcMar>
+            <w:vAlign w:val="center"/>
+          </w:tcPr>
+          <w:p>
+            <w:pPr>
+              <w:spacing w:line="240" w:lineRule="auto"/>
+              <w:jc w:val="left"/>
+            </w:pPr>
+            <w:r>
+              <w:rPr>
+                <w:rFonts w:ascii="Arial" w:cs="Arial" w:eastAsia="Arial" w:hAnsi="Arial"/>
+                <w:b w:val="false"/>
+                <w:bCs w:val="false"/>
+                <w:sz w:val="18"/>
+                <w:szCs w:val="18"/>
+              </w:rPr>
+              <w:t xml:space="preserve">Ballon: Steiggeschwindigkeit 60px/s, Amplitude 150px, Periode 1.8s</w:t>
             </w:r>
           </w:p>
         </w:tc>

</xml_diff>

<commit_message>
docs: update GDD, Arbeitsprotokoll, STATE for 04.2 work (06.04.2026)
GDD: sprite table updated — 7 individual PNGs replaced by
animation_sheet.png; Y-offset table reflects new unified values
(16px for idle/rise/walk/push_rise; 12px for push_peak/peak).

Arbeitsprotokoll: 10 new entries added covering 25.03, 30.03, and
06.04 work sessions (snake_case enforcement, merge, GDD scope update,
Phase 04.2 research, spritesheet migration, lighthouse renderer,
branch creation). Regenerated .docx from create_docs.js.

STATE.md: last_updated → 2026-04-06, active phase → 04.2 in progress,
current focus and next action updated.

Co-Authored-By: Claude Sonnet 4.6 <noreply@anthropic.com>
</commit_message>
<xml_diff>
--- a/Dokumente_Schule/Ausgefuellt/Arbeitsprotokoll_Julian_Gomez.docx
+++ b/Dokumente_Schule/Ausgefuellt/Arbeitsprotokoll_Julian_Gomez.docx
@@ -12359,6 +12359,1554 @@
                 <w:szCs w:val="18"/>
               </w:rPr>
               <w:t xml:space="preserve">water.js umbenannt zu hazards.js (korrekte Benennung)</w:t>
+            </w:r>
+          </w:p>
+        </w:tc>
+        <w:tc>
+          <w:tcPr>
+            <w:tcW w:type="dxa" w:w="700"/>
+            <w:tcBorders>
+              <w:top w:val="single" w:color="BBBBBB" w:sz="4"/>
+              <w:left w:val="single" w:color="BBBBBB" w:sz="4"/>
+              <w:bottom w:val="single" w:color="BBBBBB" w:sz="4"/>
+              <w:right w:val="single" w:color="BBBBBB" w:sz="4"/>
+            </w:tcBorders>
+            <w:tcMar>
+              <w:top w:type="dxa" w:w="60"/>
+              <w:left w:type="dxa" w:w="100"/>
+              <w:bottom w:type="dxa" w:w="60"/>
+              <w:right w:type="dxa" w:w="100"/>
+            </w:tcMar>
+            <w:vAlign w:val="center"/>
+          </w:tcPr>
+          <w:p>
+            <w:pPr>
+              <w:spacing w:line="240" w:lineRule="auto"/>
+              <w:jc w:val="center"/>
+            </w:pPr>
+            <w:r>
+              <w:rPr>
+                <w:rFonts w:ascii="Arial" w:cs="Arial" w:eastAsia="Arial" w:hAnsi="Arial"/>
+                <w:b w:val="false"/>
+                <w:bCs w:val="false"/>
+                <w:sz w:val="18"/>
+                <w:szCs w:val="18"/>
+              </w:rPr>
+              <w:t xml:space="preserve">x</w:t>
+            </w:r>
+          </w:p>
+        </w:tc>
+        <w:tc>
+          <w:tcPr>
+            <w:tcW w:type="dxa" w:w="700"/>
+            <w:tcBorders>
+              <w:top w:val="single" w:color="BBBBBB" w:sz="4"/>
+              <w:left w:val="single" w:color="BBBBBB" w:sz="4"/>
+              <w:bottom w:val="single" w:color="BBBBBB" w:sz="4"/>
+              <w:right w:val="single" w:color="BBBBBB" w:sz="4"/>
+            </w:tcBorders>
+            <w:tcMar>
+              <w:top w:type="dxa" w:w="60"/>
+              <w:left w:type="dxa" w:w="100"/>
+              <w:bottom w:type="dxa" w:w="60"/>
+              <w:right w:type="dxa" w:w="100"/>
+            </w:tcMar>
+            <w:vAlign w:val="center"/>
+          </w:tcPr>
+          <w:p>
+            <w:pPr>
+              <w:spacing w:line="240" w:lineRule="auto"/>
+              <w:jc w:val="center"/>
+            </w:pPr>
+            <w:r>
+              <w:rPr>
+                <w:rFonts w:ascii="Arial" w:cs="Arial" w:eastAsia="Arial" w:hAnsi="Arial"/>
+                <w:b w:val="false"/>
+                <w:bCs w:val="false"/>
+                <w:sz w:val="18"/>
+                <w:szCs w:val="18"/>
+              </w:rPr>
+              <w:t xml:space="preserve">x</w:t>
+            </w:r>
+          </w:p>
+        </w:tc>
+        <w:tc>
+          <w:tcPr>
+            <w:tcW w:type="dxa" w:w="700"/>
+            <w:tcBorders>
+              <w:top w:val="single" w:color="BBBBBB" w:sz="4"/>
+              <w:left w:val="single" w:color="BBBBBB" w:sz="4"/>
+              <w:bottom w:val="single" w:color="BBBBBB" w:sz="4"/>
+              <w:right w:val="single" w:color="BBBBBB" w:sz="4"/>
+            </w:tcBorders>
+            <w:tcMar>
+              <w:top w:type="dxa" w:w="60"/>
+              <w:left w:type="dxa" w:w="100"/>
+              <w:bottom w:type="dxa" w:w="60"/>
+              <w:right w:type="dxa" w:w="100"/>
+            </w:tcMar>
+            <w:vAlign w:val="center"/>
+          </w:tcPr>
+          <w:p>
+            <w:pPr>
+              <w:spacing w:line="240" w:lineRule="auto"/>
+              <w:jc w:val="center"/>
+            </w:pPr>
+            <w:r>
+              <w:rPr>
+                <w:rFonts w:ascii="Arial" w:cs="Arial" w:eastAsia="Arial" w:hAnsi="Arial"/>
+                <w:b w:val="false"/>
+                <w:bCs w:val="false"/>
+                <w:sz w:val="18"/>
+                <w:szCs w:val="18"/>
+              </w:rPr>
+              <w:t xml:space="preserve">x</w:t>
+            </w:r>
+          </w:p>
+        </w:tc>
+      </w:tr>
+      <w:tr>
+        <w:tc>
+          <w:tcPr>
+            <w:tcW w:type="dxa" w:w="1500"/>
+            <w:tcBorders>
+              <w:top w:val="single" w:color="BBBBBB" w:sz="4"/>
+              <w:left w:val="single" w:color="BBBBBB" w:sz="4"/>
+              <w:bottom w:val="single" w:color="BBBBBB" w:sz="4"/>
+              <w:right w:val="single" w:color="BBBBBB" w:sz="4"/>
+            </w:tcBorders>
+            <w:tcMar>
+              <w:top w:type="dxa" w:w="60"/>
+              <w:left w:type="dxa" w:w="100"/>
+              <w:bottom w:type="dxa" w:w="60"/>
+              <w:right w:type="dxa" w:w="100"/>
+            </w:tcMar>
+            <w:vAlign w:val="center"/>
+          </w:tcPr>
+          <w:p>
+            <w:pPr>
+              <w:spacing w:line="240" w:lineRule="auto"/>
+              <w:jc w:val="center"/>
+            </w:pPr>
+            <w:r>
+              <w:rPr>
+                <w:rFonts w:ascii="Arial" w:cs="Arial" w:eastAsia="Arial" w:hAnsi="Arial"/>
+                <w:b w:val="false"/>
+                <w:bCs w:val="false"/>
+                <w:sz w:val="18"/>
+                <w:szCs w:val="18"/>
+              </w:rPr>
+              <w:t xml:space="preserve">25.03.2026</w:t>
+            </w:r>
+          </w:p>
+        </w:tc>
+        <w:tc>
+          <w:tcPr>
+            <w:tcW w:type="dxa" w:w="4337"/>
+            <w:tcBorders>
+              <w:top w:val="single" w:color="BBBBBB" w:sz="4"/>
+              <w:left w:val="single" w:color="BBBBBB" w:sz="4"/>
+              <w:bottom w:val="single" w:color="BBBBBB" w:sz="4"/>
+              <w:right w:val="single" w:color="BBBBBB" w:sz="4"/>
+            </w:tcBorders>
+            <w:tcMar>
+              <w:top w:type="dxa" w:w="60"/>
+              <w:left w:type="dxa" w:w="100"/>
+              <w:bottom w:type="dxa" w:w="60"/>
+              <w:right w:type="dxa" w:w="100"/>
+            </w:tcMar>
+            <w:vAlign w:val="center"/>
+          </w:tcPr>
+          <w:p>
+            <w:pPr>
+              <w:spacing w:line="240" w:lineRule="auto"/>
+              <w:jc w:val="left"/>
+            </w:pPr>
+            <w:r>
+              <w:rPr>
+                <w:rFonts w:ascii="Arial" w:cs="Arial" w:eastAsia="Arial" w:hAnsi="Arial"/>
+                <w:b w:val="false"/>
+                <w:bCs w:val="false"/>
+                <w:sz w:val="18"/>
+                <w:szCs w:val="18"/>
+              </w:rPr>
+              <w:t xml:space="preserve">PixelArt: snake_case Benennung alle Assets erzwungen</w:t>
+            </w:r>
+          </w:p>
+        </w:tc>
+        <w:tc>
+          <w:tcPr>
+            <w:tcW w:type="dxa" w:w="700"/>
+            <w:tcBorders>
+              <w:top w:val="single" w:color="BBBBBB" w:sz="4"/>
+              <w:left w:val="single" w:color="BBBBBB" w:sz="4"/>
+              <w:bottom w:val="single" w:color="BBBBBB" w:sz="4"/>
+              <w:right w:val="single" w:color="BBBBBB" w:sz="4"/>
+            </w:tcBorders>
+            <w:tcMar>
+              <w:top w:type="dxa" w:w="60"/>
+              <w:left w:type="dxa" w:w="100"/>
+              <w:bottom w:type="dxa" w:w="60"/>
+              <w:right w:type="dxa" w:w="100"/>
+            </w:tcMar>
+            <w:vAlign w:val="center"/>
+          </w:tcPr>
+          <w:p>
+            <w:pPr>
+              <w:spacing w:line="240" w:lineRule="auto"/>
+              <w:jc w:val="center"/>
+            </w:pPr>
+            <w:r>
+              <w:rPr>
+                <w:rFonts w:ascii="Arial" w:cs="Arial" w:eastAsia="Arial" w:hAnsi="Arial"/>
+                <w:b w:val="false"/>
+                <w:bCs w:val="false"/>
+                <w:sz w:val="18"/>
+                <w:szCs w:val="18"/>
+              </w:rPr>
+              <w:t xml:space="preserve">x</w:t>
+            </w:r>
+          </w:p>
+        </w:tc>
+        <w:tc>
+          <w:tcPr>
+            <w:tcW w:type="dxa" w:w="700"/>
+            <w:tcBorders>
+              <w:top w:val="single" w:color="BBBBBB" w:sz="4"/>
+              <w:left w:val="single" w:color="BBBBBB" w:sz="4"/>
+              <w:bottom w:val="single" w:color="BBBBBB" w:sz="4"/>
+              <w:right w:val="single" w:color="BBBBBB" w:sz="4"/>
+            </w:tcBorders>
+            <w:tcMar>
+              <w:top w:type="dxa" w:w="60"/>
+              <w:left w:type="dxa" w:w="100"/>
+              <w:bottom w:type="dxa" w:w="60"/>
+              <w:right w:type="dxa" w:w="100"/>
+            </w:tcMar>
+            <w:vAlign w:val="center"/>
+          </w:tcPr>
+          <w:p>
+            <w:pPr>
+              <w:spacing w:line="240" w:lineRule="auto"/>
+              <w:jc w:val="center"/>
+            </w:pPr>
+            <w:r>
+              <w:rPr>
+                <w:rFonts w:ascii="Arial" w:cs="Arial" w:eastAsia="Arial" w:hAnsi="Arial"/>
+                <w:b w:val="false"/>
+                <w:bCs w:val="false"/>
+                <w:sz w:val="18"/>
+                <w:szCs w:val="18"/>
+              </w:rPr>
+              <w:t xml:space="preserve">x</w:t>
+            </w:r>
+          </w:p>
+        </w:tc>
+        <w:tc>
+          <w:tcPr>
+            <w:tcW w:type="dxa" w:w="700"/>
+            <w:tcBorders>
+              <w:top w:val="single" w:color="BBBBBB" w:sz="4"/>
+              <w:left w:val="single" w:color="BBBBBB" w:sz="4"/>
+              <w:bottom w:val="single" w:color="BBBBBB" w:sz="4"/>
+              <w:right w:val="single" w:color="BBBBBB" w:sz="4"/>
+            </w:tcBorders>
+            <w:tcMar>
+              <w:top w:type="dxa" w:w="60"/>
+              <w:left w:type="dxa" w:w="100"/>
+              <w:bottom w:type="dxa" w:w="60"/>
+              <w:right w:type="dxa" w:w="100"/>
+            </w:tcMar>
+            <w:vAlign w:val="center"/>
+          </w:tcPr>
+          <w:p>
+            <w:pPr>
+              <w:spacing w:line="240" w:lineRule="auto"/>
+              <w:jc w:val="center"/>
+            </w:pPr>
+            <w:r>
+              <w:rPr>
+                <w:rFonts w:ascii="Arial" w:cs="Arial" w:eastAsia="Arial" w:hAnsi="Arial"/>
+                <w:b w:val="false"/>
+                <w:bCs w:val="false"/>
+                <w:sz w:val="18"/>
+                <w:szCs w:val="18"/>
+              </w:rPr>
+              <w:t xml:space="preserve">x</w:t>
+            </w:r>
+          </w:p>
+        </w:tc>
+      </w:tr>
+      <w:tr>
+        <w:tc>
+          <w:tcPr>
+            <w:tcW w:type="dxa" w:w="1500"/>
+            <w:tcBorders>
+              <w:top w:val="single" w:color="BBBBBB" w:sz="4"/>
+              <w:left w:val="single" w:color="BBBBBB" w:sz="4"/>
+              <w:bottom w:val="single" w:color="BBBBBB" w:sz="4"/>
+              <w:right w:val="single" w:color="BBBBBB" w:sz="4"/>
+            </w:tcBorders>
+            <w:tcMar>
+              <w:top w:type="dxa" w:w="60"/>
+              <w:left w:type="dxa" w:w="100"/>
+              <w:bottom w:type="dxa" w:w="60"/>
+              <w:right w:type="dxa" w:w="100"/>
+            </w:tcMar>
+            <w:vAlign w:val="center"/>
+          </w:tcPr>
+          <w:p>
+            <w:pPr>
+              <w:spacing w:line="240" w:lineRule="auto"/>
+              <w:jc w:val="center"/>
+            </w:pPr>
+            <w:r>
+              <w:rPr>
+                <w:rFonts w:ascii="Arial" w:cs="Arial" w:eastAsia="Arial" w:hAnsi="Arial"/>
+                <w:b w:val="false"/>
+                <w:bCs w:val="false"/>
+                <w:sz w:val="18"/>
+                <w:szCs w:val="18"/>
+              </w:rPr>
+              <w:t xml:space="preserve">25.03.2026</w:t>
+            </w:r>
+          </w:p>
+        </w:tc>
+        <w:tc>
+          <w:tcPr>
+            <w:tcW w:type="dxa" w:w="4337"/>
+            <w:tcBorders>
+              <w:top w:val="single" w:color="BBBBBB" w:sz="4"/>
+              <w:left w:val="single" w:color="BBBBBB" w:sz="4"/>
+              <w:bottom w:val="single" w:color="BBBBBB" w:sz="4"/>
+              <w:right w:val="single" w:color="BBBBBB" w:sz="4"/>
+            </w:tcBorders>
+            <w:tcMar>
+              <w:top w:type="dxa" w:w="60"/>
+              <w:left w:type="dxa" w:w="100"/>
+              <w:bottom w:type="dxa" w:w="60"/>
+              <w:right w:type="dxa" w:w="100"/>
+            </w:tcMar>
+            <w:vAlign w:val="center"/>
+          </w:tcPr>
+          <w:p>
+            <w:pPr>
+              <w:spacing w:line="240" w:lineRule="auto"/>
+              <w:jc w:val="left"/>
+            </w:pPr>
+            <w:r>
+              <w:rPr>
+                <w:rFonts w:ascii="Arial" w:cs="Arial" w:eastAsia="Arial" w:hAnsi="Arial"/>
+                <w:b w:val="false"/>
+                <w:bCs w:val="false"/>
+                <w:sz w:val="18"/>
+                <w:szCs w:val="18"/>
+              </w:rPr>
+              <w:t xml:space="preserve">Sprite-Pfade in player.js + background.js aktualisiert</w:t>
+            </w:r>
+          </w:p>
+        </w:tc>
+        <w:tc>
+          <w:tcPr>
+            <w:tcW w:type="dxa" w:w="700"/>
+            <w:tcBorders>
+              <w:top w:val="single" w:color="BBBBBB" w:sz="4"/>
+              <w:left w:val="single" w:color="BBBBBB" w:sz="4"/>
+              <w:bottom w:val="single" w:color="BBBBBB" w:sz="4"/>
+              <w:right w:val="single" w:color="BBBBBB" w:sz="4"/>
+            </w:tcBorders>
+            <w:tcMar>
+              <w:top w:type="dxa" w:w="60"/>
+              <w:left w:type="dxa" w:w="100"/>
+              <w:bottom w:type="dxa" w:w="60"/>
+              <w:right w:type="dxa" w:w="100"/>
+            </w:tcMar>
+            <w:vAlign w:val="center"/>
+          </w:tcPr>
+          <w:p>
+            <w:pPr>
+              <w:spacing w:line="240" w:lineRule="auto"/>
+              <w:jc w:val="center"/>
+            </w:pPr>
+            <w:r>
+              <w:rPr>
+                <w:rFonts w:ascii="Arial" w:cs="Arial" w:eastAsia="Arial" w:hAnsi="Arial"/>
+                <w:b w:val="false"/>
+                <w:bCs w:val="false"/>
+                <w:sz w:val="18"/>
+                <w:szCs w:val="18"/>
+              </w:rPr>
+              <w:t xml:space="preserve">x</w:t>
+            </w:r>
+          </w:p>
+        </w:tc>
+        <w:tc>
+          <w:tcPr>
+            <w:tcW w:type="dxa" w:w="700"/>
+            <w:tcBorders>
+              <w:top w:val="single" w:color="BBBBBB" w:sz="4"/>
+              <w:left w:val="single" w:color="BBBBBB" w:sz="4"/>
+              <w:bottom w:val="single" w:color="BBBBBB" w:sz="4"/>
+              <w:right w:val="single" w:color="BBBBBB" w:sz="4"/>
+            </w:tcBorders>
+            <w:tcMar>
+              <w:top w:type="dxa" w:w="60"/>
+              <w:left w:type="dxa" w:w="100"/>
+              <w:bottom w:type="dxa" w:w="60"/>
+              <w:right w:type="dxa" w:w="100"/>
+            </w:tcMar>
+            <w:vAlign w:val="center"/>
+          </w:tcPr>
+          <w:p>
+            <w:pPr>
+              <w:spacing w:line="240" w:lineRule="auto"/>
+              <w:jc w:val="center"/>
+            </w:pPr>
+            <w:r>
+              <w:rPr>
+                <w:rFonts w:ascii="Arial" w:cs="Arial" w:eastAsia="Arial" w:hAnsi="Arial"/>
+                <w:b w:val="false"/>
+                <w:bCs w:val="false"/>
+                <w:sz w:val="18"/>
+                <w:szCs w:val="18"/>
+              </w:rPr>
+              <w:t xml:space="preserve">x</w:t>
+            </w:r>
+          </w:p>
+        </w:tc>
+        <w:tc>
+          <w:tcPr>
+            <w:tcW w:type="dxa" w:w="700"/>
+            <w:tcBorders>
+              <w:top w:val="single" w:color="BBBBBB" w:sz="4"/>
+              <w:left w:val="single" w:color="BBBBBB" w:sz="4"/>
+              <w:bottom w:val="single" w:color="BBBBBB" w:sz="4"/>
+              <w:right w:val="single" w:color="BBBBBB" w:sz="4"/>
+            </w:tcBorders>
+            <w:tcMar>
+              <w:top w:type="dxa" w:w="60"/>
+              <w:left w:type="dxa" w:w="100"/>
+              <w:bottom w:type="dxa" w:w="60"/>
+              <w:right w:type="dxa" w:w="100"/>
+            </w:tcMar>
+            <w:vAlign w:val="center"/>
+          </w:tcPr>
+          <w:p>
+            <w:pPr>
+              <w:spacing w:line="240" w:lineRule="auto"/>
+              <w:jc w:val="center"/>
+            </w:pPr>
+            <w:r>
+              <w:rPr>
+                <w:rFonts w:ascii="Arial" w:cs="Arial" w:eastAsia="Arial" w:hAnsi="Arial"/>
+                <w:b w:val="false"/>
+                <w:bCs w:val="false"/>
+                <w:sz w:val="18"/>
+                <w:szCs w:val="18"/>
+              </w:rPr>
+              <w:t xml:space="preserve">x</w:t>
+            </w:r>
+          </w:p>
+        </w:tc>
+      </w:tr>
+      <w:tr>
+        <w:tc>
+          <w:tcPr>
+            <w:tcW w:type="dxa" w:w="1500"/>
+            <w:tcBorders>
+              <w:top w:val="single" w:color="BBBBBB" w:sz="4"/>
+              <w:left w:val="single" w:color="BBBBBB" w:sz="4"/>
+              <w:bottom w:val="single" w:color="BBBBBB" w:sz="4"/>
+              <w:right w:val="single" w:color="BBBBBB" w:sz="4"/>
+            </w:tcBorders>
+            <w:tcMar>
+              <w:top w:type="dxa" w:w="60"/>
+              <w:left w:type="dxa" w:w="100"/>
+              <w:bottom w:type="dxa" w:w="60"/>
+              <w:right w:type="dxa" w:w="100"/>
+            </w:tcMar>
+            <w:vAlign w:val="center"/>
+          </w:tcPr>
+          <w:p>
+            <w:pPr>
+              <w:spacing w:line="240" w:lineRule="auto"/>
+              <w:jc w:val="center"/>
+            </w:pPr>
+            <w:r>
+              <w:rPr>
+                <w:rFonts w:ascii="Arial" w:cs="Arial" w:eastAsia="Arial" w:hAnsi="Arial"/>
+                <w:b w:val="false"/>
+                <w:bCs w:val="false"/>
+                <w:sz w:val="18"/>
+                <w:szCs w:val="18"/>
+              </w:rPr>
+              <w:t xml:space="preserve">30.03.2026</w:t>
+            </w:r>
+          </w:p>
+        </w:tc>
+        <w:tc>
+          <w:tcPr>
+            <w:tcW w:type="dxa" w:w="4337"/>
+            <w:tcBorders>
+              <w:top w:val="single" w:color="BBBBBB" w:sz="4"/>
+              <w:left w:val="single" w:color="BBBBBB" w:sz="4"/>
+              <w:bottom w:val="single" w:color="BBBBBB" w:sz="4"/>
+              <w:right w:val="single" w:color="BBBBBB" w:sz="4"/>
+            </w:tcBorders>
+            <w:tcMar>
+              <w:top w:type="dxa" w:w="60"/>
+              <w:left w:type="dxa" w:w="100"/>
+              <w:bottom w:type="dxa" w:w="60"/>
+              <w:right w:type="dxa" w:w="100"/>
+            </w:tcMar>
+            <w:vAlign w:val="center"/>
+          </w:tcPr>
+          <w:p>
+            <w:pPr>
+              <w:spacing w:line="240" w:lineRule="auto"/>
+              <w:jc w:val="left"/>
+            </w:pPr>
+            <w:r>
+              <w:rPr>
+                <w:rFonts w:ascii="Arial" w:cs="Arial" w:eastAsia="Arial" w:hAnsi="Arial"/>
+                <w:b w:val="false"/>
+                <w:bCs w:val="false"/>
+                <w:sz w:val="18"/>
+                <w:szCs w:val="18"/>
+              </w:rPr>
+              <w:t xml:space="preserve">Merge: feature/asset-restructure-mechanics → master</w:t>
+            </w:r>
+          </w:p>
+        </w:tc>
+        <w:tc>
+          <w:tcPr>
+            <w:tcW w:type="dxa" w:w="700"/>
+            <w:tcBorders>
+              <w:top w:val="single" w:color="BBBBBB" w:sz="4"/>
+              <w:left w:val="single" w:color="BBBBBB" w:sz="4"/>
+              <w:bottom w:val="single" w:color="BBBBBB" w:sz="4"/>
+              <w:right w:val="single" w:color="BBBBBB" w:sz="4"/>
+            </w:tcBorders>
+            <w:tcMar>
+              <w:top w:type="dxa" w:w="60"/>
+              <w:left w:type="dxa" w:w="100"/>
+              <w:bottom w:type="dxa" w:w="60"/>
+              <w:right w:type="dxa" w:w="100"/>
+            </w:tcMar>
+            <w:vAlign w:val="center"/>
+          </w:tcPr>
+          <w:p>
+            <w:pPr>
+              <w:spacing w:line="240" w:lineRule="auto"/>
+              <w:jc w:val="center"/>
+            </w:pPr>
+            <w:r>
+              <w:rPr>
+                <w:rFonts w:ascii="Arial" w:cs="Arial" w:eastAsia="Arial" w:hAnsi="Arial"/>
+                <w:b w:val="false"/>
+                <w:bCs w:val="false"/>
+                <w:sz w:val="18"/>
+                <w:szCs w:val="18"/>
+              </w:rPr>
+              <w:t xml:space="preserve">x</w:t>
+            </w:r>
+          </w:p>
+        </w:tc>
+        <w:tc>
+          <w:tcPr>
+            <w:tcW w:type="dxa" w:w="700"/>
+            <w:tcBorders>
+              <w:top w:val="single" w:color="BBBBBB" w:sz="4"/>
+              <w:left w:val="single" w:color="BBBBBB" w:sz="4"/>
+              <w:bottom w:val="single" w:color="BBBBBB" w:sz="4"/>
+              <w:right w:val="single" w:color="BBBBBB" w:sz="4"/>
+            </w:tcBorders>
+            <w:tcMar>
+              <w:top w:type="dxa" w:w="60"/>
+              <w:left w:type="dxa" w:w="100"/>
+              <w:bottom w:type="dxa" w:w="60"/>
+              <w:right w:type="dxa" w:w="100"/>
+            </w:tcMar>
+            <w:vAlign w:val="center"/>
+          </w:tcPr>
+          <w:p>
+            <w:pPr>
+              <w:spacing w:line="240" w:lineRule="auto"/>
+              <w:jc w:val="center"/>
+            </w:pPr>
+            <w:r>
+              <w:rPr>
+                <w:rFonts w:ascii="Arial" w:cs="Arial" w:eastAsia="Arial" w:hAnsi="Arial"/>
+                <w:b w:val="false"/>
+                <w:bCs w:val="false"/>
+                <w:sz w:val="18"/>
+                <w:szCs w:val="18"/>
+              </w:rPr>
+              <w:t xml:space="preserve">x</w:t>
+            </w:r>
+          </w:p>
+        </w:tc>
+        <w:tc>
+          <w:tcPr>
+            <w:tcW w:type="dxa" w:w="700"/>
+            <w:tcBorders>
+              <w:top w:val="single" w:color="BBBBBB" w:sz="4"/>
+              <w:left w:val="single" w:color="BBBBBB" w:sz="4"/>
+              <w:bottom w:val="single" w:color="BBBBBB" w:sz="4"/>
+              <w:right w:val="single" w:color="BBBBBB" w:sz="4"/>
+            </w:tcBorders>
+            <w:tcMar>
+              <w:top w:type="dxa" w:w="60"/>
+              <w:left w:type="dxa" w:w="100"/>
+              <w:bottom w:type="dxa" w:w="60"/>
+              <w:right w:type="dxa" w:w="100"/>
+            </w:tcMar>
+            <w:vAlign w:val="center"/>
+          </w:tcPr>
+          <w:p>
+            <w:pPr>
+              <w:spacing w:line="240" w:lineRule="auto"/>
+              <w:jc w:val="center"/>
+            </w:pPr>
+            <w:r>
+              <w:rPr>
+                <w:rFonts w:ascii="Arial" w:cs="Arial" w:eastAsia="Arial" w:hAnsi="Arial"/>
+                <w:b w:val="false"/>
+                <w:bCs w:val="false"/>
+                <w:sz w:val="18"/>
+                <w:szCs w:val="18"/>
+              </w:rPr>
+              <w:t xml:space="preserve">x</w:t>
+            </w:r>
+          </w:p>
+        </w:tc>
+      </w:tr>
+      <w:tr>
+        <w:tc>
+          <w:tcPr>
+            <w:tcW w:type="dxa" w:w="1500"/>
+            <w:tcBorders>
+              <w:top w:val="single" w:color="BBBBBB" w:sz="4"/>
+              <w:left w:val="single" w:color="BBBBBB" w:sz="4"/>
+              <w:bottom w:val="single" w:color="BBBBBB" w:sz="4"/>
+              <w:right w:val="single" w:color="BBBBBB" w:sz="4"/>
+            </w:tcBorders>
+            <w:tcMar>
+              <w:top w:type="dxa" w:w="60"/>
+              <w:left w:type="dxa" w:w="100"/>
+              <w:bottom w:type="dxa" w:w="60"/>
+              <w:right w:type="dxa" w:w="100"/>
+            </w:tcMar>
+            <w:vAlign w:val="center"/>
+          </w:tcPr>
+          <w:p>
+            <w:pPr>
+              <w:spacing w:line="240" w:lineRule="auto"/>
+              <w:jc w:val="center"/>
+            </w:pPr>
+            <w:r>
+              <w:rPr>
+                <w:rFonts w:ascii="Arial" w:cs="Arial" w:eastAsia="Arial" w:hAnsi="Arial"/>
+                <w:b w:val="false"/>
+                <w:bCs w:val="false"/>
+                <w:sz w:val="18"/>
+                <w:szCs w:val="18"/>
+              </w:rPr>
+              <w:t xml:space="preserve">30.03.2026</w:t>
+            </w:r>
+          </w:p>
+        </w:tc>
+        <w:tc>
+          <w:tcPr>
+            <w:tcW w:type="dxa" w:w="4337"/>
+            <w:tcBorders>
+              <w:top w:val="single" w:color="BBBBBB" w:sz="4"/>
+              <w:left w:val="single" w:color="BBBBBB" w:sz="4"/>
+              <w:bottom w:val="single" w:color="BBBBBB" w:sz="4"/>
+              <w:right w:val="single" w:color="BBBBBB" w:sz="4"/>
+            </w:tcBorders>
+            <w:tcMar>
+              <w:top w:type="dxa" w:w="60"/>
+              <w:left w:type="dxa" w:w="100"/>
+              <w:bottom w:type="dxa" w:w="60"/>
+              <w:right w:type="dxa" w:w="100"/>
+            </w:tcMar>
+            <w:vAlign w:val="center"/>
+          </w:tcPr>
+          <w:p>
+            <w:pPr>
+              <w:spacing w:line="240" w:lineRule="auto"/>
+              <w:jc w:val="left"/>
+            </w:pPr>
+            <w:r>
+              <w:rPr>
+                <w:rFonts w:ascii="Arial" w:cs="Arial" w:eastAsia="Arial" w:hAnsi="Arial"/>
+                <w:b w:val="false"/>
+                <w:bCs w:val="false"/>
+                <w:sz w:val="18"/>
+                <w:szCs w:val="18"/>
+              </w:rPr>
+              <w:t xml:space="preserve">GDD: Scope-Entscheidungen (Push-Mechanik, L2 Leuchtturm)</w:t>
+            </w:r>
+          </w:p>
+        </w:tc>
+        <w:tc>
+          <w:tcPr>
+            <w:tcW w:type="dxa" w:w="700"/>
+            <w:tcBorders>
+              <w:top w:val="single" w:color="BBBBBB" w:sz="4"/>
+              <w:left w:val="single" w:color="BBBBBB" w:sz="4"/>
+              <w:bottom w:val="single" w:color="BBBBBB" w:sz="4"/>
+              <w:right w:val="single" w:color="BBBBBB" w:sz="4"/>
+            </w:tcBorders>
+            <w:tcMar>
+              <w:top w:type="dxa" w:w="60"/>
+              <w:left w:type="dxa" w:w="100"/>
+              <w:bottom w:type="dxa" w:w="60"/>
+              <w:right w:type="dxa" w:w="100"/>
+            </w:tcMar>
+            <w:vAlign w:val="center"/>
+          </w:tcPr>
+          <w:p>
+            <w:pPr>
+              <w:spacing w:line="240" w:lineRule="auto"/>
+              <w:jc w:val="center"/>
+            </w:pPr>
+            <w:r>
+              <w:rPr>
+                <w:rFonts w:ascii="Arial" w:cs="Arial" w:eastAsia="Arial" w:hAnsi="Arial"/>
+                <w:b w:val="false"/>
+                <w:bCs w:val="false"/>
+                <w:sz w:val="18"/>
+                <w:szCs w:val="18"/>
+              </w:rPr>
+              <w:t xml:space="preserve">x</w:t>
+            </w:r>
+          </w:p>
+        </w:tc>
+        <w:tc>
+          <w:tcPr>
+            <w:tcW w:type="dxa" w:w="700"/>
+            <w:tcBorders>
+              <w:top w:val="single" w:color="BBBBBB" w:sz="4"/>
+              <w:left w:val="single" w:color="BBBBBB" w:sz="4"/>
+              <w:bottom w:val="single" w:color="BBBBBB" w:sz="4"/>
+              <w:right w:val="single" w:color="BBBBBB" w:sz="4"/>
+            </w:tcBorders>
+            <w:tcMar>
+              <w:top w:type="dxa" w:w="60"/>
+              <w:left w:type="dxa" w:w="100"/>
+              <w:bottom w:type="dxa" w:w="60"/>
+              <w:right w:type="dxa" w:w="100"/>
+            </w:tcMar>
+            <w:vAlign w:val="center"/>
+          </w:tcPr>
+          <w:p>
+            <w:pPr>
+              <w:spacing w:line="240" w:lineRule="auto"/>
+              <w:jc w:val="center"/>
+            </w:pPr>
+            <w:r>
+              <w:rPr>
+                <w:rFonts w:ascii="Arial" w:cs="Arial" w:eastAsia="Arial" w:hAnsi="Arial"/>
+                <w:b w:val="false"/>
+                <w:bCs w:val="false"/>
+                <w:sz w:val="18"/>
+                <w:szCs w:val="18"/>
+              </w:rPr>
+              <w:t xml:space="preserve">x</w:t>
+            </w:r>
+          </w:p>
+        </w:tc>
+        <w:tc>
+          <w:tcPr>
+            <w:tcW w:type="dxa" w:w="700"/>
+            <w:tcBorders>
+              <w:top w:val="single" w:color="BBBBBB" w:sz="4"/>
+              <w:left w:val="single" w:color="BBBBBB" w:sz="4"/>
+              <w:bottom w:val="single" w:color="BBBBBB" w:sz="4"/>
+              <w:right w:val="single" w:color="BBBBBB" w:sz="4"/>
+            </w:tcBorders>
+            <w:tcMar>
+              <w:top w:type="dxa" w:w="60"/>
+              <w:left w:type="dxa" w:w="100"/>
+              <w:bottom w:type="dxa" w:w="60"/>
+              <w:right w:type="dxa" w:w="100"/>
+            </w:tcMar>
+            <w:vAlign w:val="center"/>
+          </w:tcPr>
+          <w:p>
+            <w:pPr>
+              <w:spacing w:line="240" w:lineRule="auto"/>
+              <w:jc w:val="center"/>
+            </w:pPr>
+            <w:r>
+              <w:rPr>
+                <w:rFonts w:ascii="Arial" w:cs="Arial" w:eastAsia="Arial" w:hAnsi="Arial"/>
+                <w:b w:val="false"/>
+                <w:bCs w:val="false"/>
+                <w:sz w:val="18"/>
+                <w:szCs w:val="18"/>
+              </w:rPr>
+              <w:t xml:space="preserve">x</w:t>
+            </w:r>
+          </w:p>
+        </w:tc>
+      </w:tr>
+      <w:tr>
+        <w:tc>
+          <w:tcPr>
+            <w:tcW w:type="dxa" w:w="1500"/>
+            <w:tcBorders>
+              <w:top w:val="single" w:color="BBBBBB" w:sz="4"/>
+              <w:left w:val="single" w:color="BBBBBB" w:sz="4"/>
+              <w:bottom w:val="single" w:color="BBBBBB" w:sz="4"/>
+              <w:right w:val="single" w:color="BBBBBB" w:sz="4"/>
+            </w:tcBorders>
+            <w:tcMar>
+              <w:top w:type="dxa" w:w="60"/>
+              <w:left w:type="dxa" w:w="100"/>
+              <w:bottom w:type="dxa" w:w="60"/>
+              <w:right w:type="dxa" w:w="100"/>
+            </w:tcMar>
+            <w:vAlign w:val="center"/>
+          </w:tcPr>
+          <w:p>
+            <w:pPr>
+              <w:spacing w:line="240" w:lineRule="auto"/>
+              <w:jc w:val="center"/>
+            </w:pPr>
+            <w:r>
+              <w:rPr>
+                <w:rFonts w:ascii="Arial" w:cs="Arial" w:eastAsia="Arial" w:hAnsi="Arial"/>
+                <w:b w:val="false"/>
+                <w:bCs w:val="false"/>
+                <w:sz w:val="18"/>
+                <w:szCs w:val="18"/>
+              </w:rPr>
+              <w:t xml:space="preserve">30.03.2026</w:t>
+            </w:r>
+          </w:p>
+        </w:tc>
+        <w:tc>
+          <w:tcPr>
+            <w:tcW w:type="dxa" w:w="4337"/>
+            <w:tcBorders>
+              <w:top w:val="single" w:color="BBBBBB" w:sz="4"/>
+              <w:left w:val="single" w:color="BBBBBB" w:sz="4"/>
+              <w:bottom w:val="single" w:color="BBBBBB" w:sz="4"/>
+              <w:right w:val="single" w:color="BBBBBB" w:sz="4"/>
+            </w:tcBorders>
+            <w:tcMar>
+              <w:top w:type="dxa" w:w="60"/>
+              <w:left w:type="dxa" w:w="100"/>
+              <w:bottom w:type="dxa" w:w="60"/>
+              <w:right w:type="dxa" w:w="100"/>
+            </w:tcMar>
+            <w:vAlign w:val="center"/>
+          </w:tcPr>
+          <w:p>
+            <w:pPr>
+              <w:spacing w:line="240" w:lineRule="auto"/>
+              <w:jc w:val="left"/>
+            </w:pPr>
+            <w:r>
+              <w:rPr>
+                <w:rFonts w:ascii="Arial" w:cs="Arial" w:eastAsia="Arial" w:hAnsi="Arial"/>
+                <w:b w:val="false"/>
+                <w:bCs w:val="false"/>
+                <w:sz w:val="18"/>
+                <w:szCs w:val="18"/>
+              </w:rPr>
+              <w:t xml:space="preserve">Phase 04.2 initialisiert: Recherche L2-Leuchtturm-Redesign</w:t>
+            </w:r>
+          </w:p>
+        </w:tc>
+        <w:tc>
+          <w:tcPr>
+            <w:tcW w:type="dxa" w:w="700"/>
+            <w:tcBorders>
+              <w:top w:val="single" w:color="BBBBBB" w:sz="4"/>
+              <w:left w:val="single" w:color="BBBBBB" w:sz="4"/>
+              <w:bottom w:val="single" w:color="BBBBBB" w:sz="4"/>
+              <w:right w:val="single" w:color="BBBBBB" w:sz="4"/>
+            </w:tcBorders>
+            <w:tcMar>
+              <w:top w:type="dxa" w:w="60"/>
+              <w:left w:type="dxa" w:w="100"/>
+              <w:bottom w:type="dxa" w:w="60"/>
+              <w:right w:type="dxa" w:w="100"/>
+            </w:tcMar>
+            <w:vAlign w:val="center"/>
+          </w:tcPr>
+          <w:p>
+            <w:pPr>
+              <w:spacing w:line="240" w:lineRule="auto"/>
+              <w:jc w:val="center"/>
+            </w:pPr>
+            <w:r>
+              <w:rPr>
+                <w:rFonts w:ascii="Arial" w:cs="Arial" w:eastAsia="Arial" w:hAnsi="Arial"/>
+                <w:b w:val="false"/>
+                <w:bCs w:val="false"/>
+                <w:sz w:val="18"/>
+                <w:szCs w:val="18"/>
+              </w:rPr>
+              <w:t xml:space="preserve">x</w:t>
+            </w:r>
+          </w:p>
+        </w:tc>
+        <w:tc>
+          <w:tcPr>
+            <w:tcW w:type="dxa" w:w="700"/>
+            <w:tcBorders>
+              <w:top w:val="single" w:color="BBBBBB" w:sz="4"/>
+              <w:left w:val="single" w:color="BBBBBB" w:sz="4"/>
+              <w:bottom w:val="single" w:color="BBBBBB" w:sz="4"/>
+              <w:right w:val="single" w:color="BBBBBB" w:sz="4"/>
+            </w:tcBorders>
+            <w:tcMar>
+              <w:top w:type="dxa" w:w="60"/>
+              <w:left w:type="dxa" w:w="100"/>
+              <w:bottom w:type="dxa" w:w="60"/>
+              <w:right w:type="dxa" w:w="100"/>
+            </w:tcMar>
+            <w:vAlign w:val="center"/>
+          </w:tcPr>
+          <w:p>
+            <w:pPr>
+              <w:spacing w:line="240" w:lineRule="auto"/>
+              <w:jc w:val="center"/>
+            </w:pPr>
+            <w:r>
+              <w:rPr>
+                <w:rFonts w:ascii="Arial" w:cs="Arial" w:eastAsia="Arial" w:hAnsi="Arial"/>
+                <w:b w:val="false"/>
+                <w:bCs w:val="false"/>
+                <w:sz w:val="18"/>
+                <w:szCs w:val="18"/>
+              </w:rPr>
+              <w:t xml:space="preserve">x</w:t>
+            </w:r>
+          </w:p>
+        </w:tc>
+        <w:tc>
+          <w:tcPr>
+            <w:tcW w:type="dxa" w:w="700"/>
+            <w:tcBorders>
+              <w:top w:val="single" w:color="BBBBBB" w:sz="4"/>
+              <w:left w:val="single" w:color="BBBBBB" w:sz="4"/>
+              <w:bottom w:val="single" w:color="BBBBBB" w:sz="4"/>
+              <w:right w:val="single" w:color="BBBBBB" w:sz="4"/>
+            </w:tcBorders>
+            <w:tcMar>
+              <w:top w:type="dxa" w:w="60"/>
+              <w:left w:type="dxa" w:w="100"/>
+              <w:bottom w:type="dxa" w:w="60"/>
+              <w:right w:type="dxa" w:w="100"/>
+            </w:tcMar>
+            <w:vAlign w:val="center"/>
+          </w:tcPr>
+          <w:p>
+            <w:pPr>
+              <w:spacing w:line="240" w:lineRule="auto"/>
+              <w:jc w:val="center"/>
+            </w:pPr>
+            <w:r>
+              <w:rPr>
+                <w:rFonts w:ascii="Arial" w:cs="Arial" w:eastAsia="Arial" w:hAnsi="Arial"/>
+                <w:b w:val="false"/>
+                <w:bCs w:val="false"/>
+                <w:sz w:val="18"/>
+                <w:szCs w:val="18"/>
+              </w:rPr>
+              <w:t xml:space="preserve">x</w:t>
+            </w:r>
+          </w:p>
+        </w:tc>
+      </w:tr>
+      <w:tr>
+        <w:tc>
+          <w:tcPr>
+            <w:tcW w:type="dxa" w:w="1500"/>
+            <w:tcBorders>
+              <w:top w:val="single" w:color="BBBBBB" w:sz="4"/>
+              <w:left w:val="single" w:color="BBBBBB" w:sz="4"/>
+              <w:bottom w:val="single" w:color="BBBBBB" w:sz="4"/>
+              <w:right w:val="single" w:color="BBBBBB" w:sz="4"/>
+            </w:tcBorders>
+            <w:tcMar>
+              <w:top w:type="dxa" w:w="60"/>
+              <w:left w:type="dxa" w:w="100"/>
+              <w:bottom w:type="dxa" w:w="60"/>
+              <w:right w:type="dxa" w:w="100"/>
+            </w:tcMar>
+            <w:vAlign w:val="center"/>
+          </w:tcPr>
+          <w:p>
+            <w:pPr>
+              <w:spacing w:line="240" w:lineRule="auto"/>
+              <w:jc w:val="center"/>
+            </w:pPr>
+            <w:r>
+              <w:rPr>
+                <w:rFonts w:ascii="Arial" w:cs="Arial" w:eastAsia="Arial" w:hAnsi="Arial"/>
+                <w:b w:val="false"/>
+                <w:bCs w:val="false"/>
+                <w:sz w:val="18"/>
+                <w:szCs w:val="18"/>
+              </w:rPr>
+              <w:t xml:space="preserve">06.04.2026</w:t>
+            </w:r>
+          </w:p>
+        </w:tc>
+        <w:tc>
+          <w:tcPr>
+            <w:tcW w:type="dxa" w:w="4337"/>
+            <w:tcBorders>
+              <w:top w:val="single" w:color="BBBBBB" w:sz="4"/>
+              <w:left w:val="single" w:color="BBBBBB" w:sz="4"/>
+              <w:bottom w:val="single" w:color="BBBBBB" w:sz="4"/>
+              <w:right w:val="single" w:color="BBBBBB" w:sz="4"/>
+            </w:tcBorders>
+            <w:tcMar>
+              <w:top w:type="dxa" w:w="60"/>
+              <w:left w:type="dxa" w:w="100"/>
+              <w:bottom w:type="dxa" w:w="60"/>
+              <w:right w:type="dxa" w:w="100"/>
+            </w:tcMar>
+            <w:vAlign w:val="center"/>
+          </w:tcPr>
+          <w:p>
+            <w:pPr>
+              <w:spacing w:line="240" w:lineRule="auto"/>
+              <w:jc w:val="left"/>
+            </w:pPr>
+            <w:r>
+              <w:rPr>
+                <w:rFonts w:ascii="Arial" w:cs="Arial" w:eastAsia="Arial" w:hAnsi="Arial"/>
+                <w:b w:val="false"/>
+                <w:bCs w:val="false"/>
+                <w:sz w:val="18"/>
+                <w:szCs w:val="18"/>
+              </w:rPr>
+              <w:t xml:space="preserve">Katzen-Sprites: 7 Einzeldateien zu animation_sheet.png konsolidiert</w:t>
+            </w:r>
+          </w:p>
+        </w:tc>
+        <w:tc>
+          <w:tcPr>
+            <w:tcW w:type="dxa" w:w="700"/>
+            <w:tcBorders>
+              <w:top w:val="single" w:color="BBBBBB" w:sz="4"/>
+              <w:left w:val="single" w:color="BBBBBB" w:sz="4"/>
+              <w:bottom w:val="single" w:color="BBBBBB" w:sz="4"/>
+              <w:right w:val="single" w:color="BBBBBB" w:sz="4"/>
+            </w:tcBorders>
+            <w:tcMar>
+              <w:top w:type="dxa" w:w="60"/>
+              <w:left w:type="dxa" w:w="100"/>
+              <w:bottom w:type="dxa" w:w="60"/>
+              <w:right w:type="dxa" w:w="100"/>
+            </w:tcMar>
+            <w:vAlign w:val="center"/>
+          </w:tcPr>
+          <w:p>
+            <w:pPr>
+              <w:spacing w:line="240" w:lineRule="auto"/>
+              <w:jc w:val="center"/>
+            </w:pPr>
+            <w:r>
+              <w:rPr>
+                <w:rFonts w:ascii="Arial" w:cs="Arial" w:eastAsia="Arial" w:hAnsi="Arial"/>
+                <w:b w:val="false"/>
+                <w:bCs w:val="false"/>
+                <w:sz w:val="18"/>
+                <w:szCs w:val="18"/>
+              </w:rPr>
+              <w:t xml:space="preserve">x</w:t>
+            </w:r>
+          </w:p>
+        </w:tc>
+        <w:tc>
+          <w:tcPr>
+            <w:tcW w:type="dxa" w:w="700"/>
+            <w:tcBorders>
+              <w:top w:val="single" w:color="BBBBBB" w:sz="4"/>
+              <w:left w:val="single" w:color="BBBBBB" w:sz="4"/>
+              <w:bottom w:val="single" w:color="BBBBBB" w:sz="4"/>
+              <w:right w:val="single" w:color="BBBBBB" w:sz="4"/>
+            </w:tcBorders>
+            <w:tcMar>
+              <w:top w:type="dxa" w:w="60"/>
+              <w:left w:type="dxa" w:w="100"/>
+              <w:bottom w:type="dxa" w:w="60"/>
+              <w:right w:type="dxa" w:w="100"/>
+            </w:tcMar>
+            <w:vAlign w:val="center"/>
+          </w:tcPr>
+          <w:p>
+            <w:pPr>
+              <w:spacing w:line="240" w:lineRule="auto"/>
+              <w:jc w:val="center"/>
+            </w:pPr>
+            <w:r>
+              <w:rPr>
+                <w:rFonts w:ascii="Arial" w:cs="Arial" w:eastAsia="Arial" w:hAnsi="Arial"/>
+                <w:b w:val="false"/>
+                <w:bCs w:val="false"/>
+                <w:sz w:val="18"/>
+                <w:szCs w:val="18"/>
+              </w:rPr>
+              <w:t xml:space="preserve">x</w:t>
+            </w:r>
+          </w:p>
+        </w:tc>
+        <w:tc>
+          <w:tcPr>
+            <w:tcW w:type="dxa" w:w="700"/>
+            <w:tcBorders>
+              <w:top w:val="single" w:color="BBBBBB" w:sz="4"/>
+              <w:left w:val="single" w:color="BBBBBB" w:sz="4"/>
+              <w:bottom w:val="single" w:color="BBBBBB" w:sz="4"/>
+              <w:right w:val="single" w:color="BBBBBB" w:sz="4"/>
+            </w:tcBorders>
+            <w:tcMar>
+              <w:top w:type="dxa" w:w="60"/>
+              <w:left w:type="dxa" w:w="100"/>
+              <w:bottom w:type="dxa" w:w="60"/>
+              <w:right w:type="dxa" w:w="100"/>
+            </w:tcMar>
+            <w:vAlign w:val="center"/>
+          </w:tcPr>
+          <w:p>
+            <w:pPr>
+              <w:spacing w:line="240" w:lineRule="auto"/>
+              <w:jc w:val="center"/>
+            </w:pPr>
+            <w:r>
+              <w:rPr>
+                <w:rFonts w:ascii="Arial" w:cs="Arial" w:eastAsia="Arial" w:hAnsi="Arial"/>
+                <w:b w:val="false"/>
+                <w:bCs w:val="false"/>
+                <w:sz w:val="18"/>
+                <w:szCs w:val="18"/>
+              </w:rPr>
+              <w:t xml:space="preserve">x</w:t>
+            </w:r>
+          </w:p>
+        </w:tc>
+      </w:tr>
+      <w:tr>
+        <w:tc>
+          <w:tcPr>
+            <w:tcW w:type="dxa" w:w="1500"/>
+            <w:tcBorders>
+              <w:top w:val="single" w:color="BBBBBB" w:sz="4"/>
+              <w:left w:val="single" w:color="BBBBBB" w:sz="4"/>
+              <w:bottom w:val="single" w:color="BBBBBB" w:sz="4"/>
+              <w:right w:val="single" w:color="BBBBBB" w:sz="4"/>
+            </w:tcBorders>
+            <w:tcMar>
+              <w:top w:type="dxa" w:w="60"/>
+              <w:left w:type="dxa" w:w="100"/>
+              <w:bottom w:type="dxa" w:w="60"/>
+              <w:right w:type="dxa" w:w="100"/>
+            </w:tcMar>
+            <w:vAlign w:val="center"/>
+          </w:tcPr>
+          <w:p>
+            <w:pPr>
+              <w:spacing w:line="240" w:lineRule="auto"/>
+              <w:jc w:val="center"/>
+            </w:pPr>
+            <w:r>
+              <w:rPr>
+                <w:rFonts w:ascii="Arial" w:cs="Arial" w:eastAsia="Arial" w:hAnsi="Arial"/>
+                <w:b w:val="false"/>
+                <w:bCs w:val="false"/>
+                <w:sz w:val="18"/>
+                <w:szCs w:val="18"/>
+              </w:rPr>
+              <w:t xml:space="preserve">06.04.2026</w:t>
+            </w:r>
+          </w:p>
+        </w:tc>
+        <w:tc>
+          <w:tcPr>
+            <w:tcW w:type="dxa" w:w="4337"/>
+            <w:tcBorders>
+              <w:top w:val="single" w:color="BBBBBB" w:sz="4"/>
+              <w:left w:val="single" w:color="BBBBBB" w:sz="4"/>
+              <w:bottom w:val="single" w:color="BBBBBB" w:sz="4"/>
+              <w:right w:val="single" w:color="BBBBBB" w:sz="4"/>
+            </w:tcBorders>
+            <w:tcMar>
+              <w:top w:type="dxa" w:w="60"/>
+              <w:left w:type="dxa" w:w="100"/>
+              <w:bottom w:type="dxa" w:w="60"/>
+              <w:right w:type="dxa" w:w="100"/>
+            </w:tcMar>
+            <w:vAlign w:val="center"/>
+          </w:tcPr>
+          <w:p>
+            <w:pPr>
+              <w:spacing w:line="240" w:lineRule="auto"/>
+              <w:jc w:val="left"/>
+            </w:pPr>
+            <w:r>
+              <w:rPr>
+                <w:rFonts w:ascii="Arial" w:cs="Arial" w:eastAsia="Arial" w:hAnsi="Arial"/>
+                <w:b w:val="false"/>
+                <w:bCs w:val="false"/>
+                <w:sz w:val="18"/>
+                <w:szCs w:val="18"/>
+              </w:rPr>
+              <w:t xml:space="preserve">player.js: Spritesheet-System mit Index-Array (_CAT_SPRITES)</w:t>
+            </w:r>
+          </w:p>
+        </w:tc>
+        <w:tc>
+          <w:tcPr>
+            <w:tcW w:type="dxa" w:w="700"/>
+            <w:tcBorders>
+              <w:top w:val="single" w:color="BBBBBB" w:sz="4"/>
+              <w:left w:val="single" w:color="BBBBBB" w:sz="4"/>
+              <w:bottom w:val="single" w:color="BBBBBB" w:sz="4"/>
+              <w:right w:val="single" w:color="BBBBBB" w:sz="4"/>
+            </w:tcBorders>
+            <w:tcMar>
+              <w:top w:type="dxa" w:w="60"/>
+              <w:left w:type="dxa" w:w="100"/>
+              <w:bottom w:type="dxa" w:w="60"/>
+              <w:right w:type="dxa" w:w="100"/>
+            </w:tcMar>
+            <w:vAlign w:val="center"/>
+          </w:tcPr>
+          <w:p>
+            <w:pPr>
+              <w:spacing w:line="240" w:lineRule="auto"/>
+              <w:jc w:val="center"/>
+            </w:pPr>
+            <w:r>
+              <w:rPr>
+                <w:rFonts w:ascii="Arial" w:cs="Arial" w:eastAsia="Arial" w:hAnsi="Arial"/>
+                <w:b w:val="false"/>
+                <w:bCs w:val="false"/>
+                <w:sz w:val="18"/>
+                <w:szCs w:val="18"/>
+              </w:rPr>
+              <w:t xml:space="preserve">x</w:t>
+            </w:r>
+          </w:p>
+        </w:tc>
+        <w:tc>
+          <w:tcPr>
+            <w:tcW w:type="dxa" w:w="700"/>
+            <w:tcBorders>
+              <w:top w:val="single" w:color="BBBBBB" w:sz="4"/>
+              <w:left w:val="single" w:color="BBBBBB" w:sz="4"/>
+              <w:bottom w:val="single" w:color="BBBBBB" w:sz="4"/>
+              <w:right w:val="single" w:color="BBBBBB" w:sz="4"/>
+            </w:tcBorders>
+            <w:tcMar>
+              <w:top w:type="dxa" w:w="60"/>
+              <w:left w:type="dxa" w:w="100"/>
+              <w:bottom w:type="dxa" w:w="60"/>
+              <w:right w:type="dxa" w:w="100"/>
+            </w:tcMar>
+            <w:vAlign w:val="center"/>
+          </w:tcPr>
+          <w:p>
+            <w:pPr>
+              <w:spacing w:line="240" w:lineRule="auto"/>
+              <w:jc w:val="center"/>
+            </w:pPr>
+            <w:r>
+              <w:rPr>
+                <w:rFonts w:ascii="Arial" w:cs="Arial" w:eastAsia="Arial" w:hAnsi="Arial"/>
+                <w:b w:val="false"/>
+                <w:bCs w:val="false"/>
+                <w:sz w:val="18"/>
+                <w:szCs w:val="18"/>
+              </w:rPr>
+              <w:t xml:space="preserve">x</w:t>
+            </w:r>
+          </w:p>
+        </w:tc>
+        <w:tc>
+          <w:tcPr>
+            <w:tcW w:type="dxa" w:w="700"/>
+            <w:tcBorders>
+              <w:top w:val="single" w:color="BBBBBB" w:sz="4"/>
+              <w:left w:val="single" w:color="BBBBBB" w:sz="4"/>
+              <w:bottom w:val="single" w:color="BBBBBB" w:sz="4"/>
+              <w:right w:val="single" w:color="BBBBBB" w:sz="4"/>
+            </w:tcBorders>
+            <w:tcMar>
+              <w:top w:type="dxa" w:w="60"/>
+              <w:left w:type="dxa" w:w="100"/>
+              <w:bottom w:type="dxa" w:w="60"/>
+              <w:right w:type="dxa" w:w="100"/>
+            </w:tcMar>
+            <w:vAlign w:val="center"/>
+          </w:tcPr>
+          <w:p>
+            <w:pPr>
+              <w:spacing w:line="240" w:lineRule="auto"/>
+              <w:jc w:val="center"/>
+            </w:pPr>
+            <w:r>
+              <w:rPr>
+                <w:rFonts w:ascii="Arial" w:cs="Arial" w:eastAsia="Arial" w:hAnsi="Arial"/>
+                <w:b w:val="false"/>
+                <w:bCs w:val="false"/>
+                <w:sz w:val="18"/>
+                <w:szCs w:val="18"/>
+              </w:rPr>
+              <w:t xml:space="preserve">x</w:t>
+            </w:r>
+          </w:p>
+        </w:tc>
+      </w:tr>
+      <w:tr>
+        <w:tc>
+          <w:tcPr>
+            <w:tcW w:type="dxa" w:w="1500"/>
+            <w:tcBorders>
+              <w:top w:val="single" w:color="BBBBBB" w:sz="4"/>
+              <w:left w:val="single" w:color="BBBBBB" w:sz="4"/>
+              <w:bottom w:val="single" w:color="BBBBBB" w:sz="4"/>
+              <w:right w:val="single" w:color="BBBBBB" w:sz="4"/>
+            </w:tcBorders>
+            <w:tcMar>
+              <w:top w:type="dxa" w:w="60"/>
+              <w:left w:type="dxa" w:w="100"/>
+              <w:bottom w:type="dxa" w:w="60"/>
+              <w:right w:type="dxa" w:w="100"/>
+            </w:tcMar>
+            <w:vAlign w:val="center"/>
+          </w:tcPr>
+          <w:p>
+            <w:pPr>
+              <w:spacing w:line="240" w:lineRule="auto"/>
+              <w:jc w:val="center"/>
+            </w:pPr>
+            <w:r>
+              <w:rPr>
+                <w:rFonts w:ascii="Arial" w:cs="Arial" w:eastAsia="Arial" w:hAnsi="Arial"/>
+                <w:b w:val="false"/>
+                <w:bCs w:val="false"/>
+                <w:sz w:val="18"/>
+                <w:szCs w:val="18"/>
+              </w:rPr>
+              <w:t xml:space="preserve">06.04.2026</w:t>
+            </w:r>
+          </w:p>
+        </w:tc>
+        <w:tc>
+          <w:tcPr>
+            <w:tcW w:type="dxa" w:w="4337"/>
+            <w:tcBorders>
+              <w:top w:val="single" w:color="BBBBBB" w:sz="4"/>
+              <w:left w:val="single" w:color="BBBBBB" w:sz="4"/>
+              <w:bottom w:val="single" w:color="BBBBBB" w:sz="4"/>
+              <w:right w:val="single" w:color="BBBBBB" w:sz="4"/>
+            </w:tcBorders>
+            <w:tcMar>
+              <w:top w:type="dxa" w:w="60"/>
+              <w:left w:type="dxa" w:w="100"/>
+              <w:bottom w:type="dxa" w:w="60"/>
+              <w:right w:type="dxa" w:w="100"/>
+            </w:tcMar>
+            <w:vAlign w:val="center"/>
+          </w:tcPr>
+          <w:p>
+            <w:pPr>
+              <w:spacing w:line="240" w:lineRule="auto"/>
+              <w:jc w:val="left"/>
+            </w:pPr>
+            <w:r>
+              <w:rPr>
+                <w:rFonts w:ascii="Arial" w:cs="Arial" w:eastAsia="Arial" w:hAnsi="Arial"/>
+                <w:b w:val="false"/>
+                <w:bCs w:val="false"/>
+                <w:sz w:val="18"/>
+                <w:szCs w:val="18"/>
+              </w:rPr>
+              <w:t xml:space="preserve">background.js: Leuchtturm-Renderer (_drawL2Lighthouse) implementiert</w:t>
+            </w:r>
+          </w:p>
+        </w:tc>
+        <w:tc>
+          <w:tcPr>
+            <w:tcW w:type="dxa" w:w="700"/>
+            <w:tcBorders>
+              <w:top w:val="single" w:color="BBBBBB" w:sz="4"/>
+              <w:left w:val="single" w:color="BBBBBB" w:sz="4"/>
+              <w:bottom w:val="single" w:color="BBBBBB" w:sz="4"/>
+              <w:right w:val="single" w:color="BBBBBB" w:sz="4"/>
+            </w:tcBorders>
+            <w:tcMar>
+              <w:top w:type="dxa" w:w="60"/>
+              <w:left w:type="dxa" w:w="100"/>
+              <w:bottom w:type="dxa" w:w="60"/>
+              <w:right w:type="dxa" w:w="100"/>
+            </w:tcMar>
+            <w:vAlign w:val="center"/>
+          </w:tcPr>
+          <w:p>
+            <w:pPr>
+              <w:spacing w:line="240" w:lineRule="auto"/>
+              <w:jc w:val="center"/>
+            </w:pPr>
+            <w:r>
+              <w:rPr>
+                <w:rFonts w:ascii="Arial" w:cs="Arial" w:eastAsia="Arial" w:hAnsi="Arial"/>
+                <w:b w:val="false"/>
+                <w:bCs w:val="false"/>
+                <w:sz w:val="18"/>
+                <w:szCs w:val="18"/>
+              </w:rPr>
+              <w:t xml:space="preserve">x</w:t>
+            </w:r>
+          </w:p>
+        </w:tc>
+        <w:tc>
+          <w:tcPr>
+            <w:tcW w:type="dxa" w:w="700"/>
+            <w:tcBorders>
+              <w:top w:val="single" w:color="BBBBBB" w:sz="4"/>
+              <w:left w:val="single" w:color="BBBBBB" w:sz="4"/>
+              <w:bottom w:val="single" w:color="BBBBBB" w:sz="4"/>
+              <w:right w:val="single" w:color="BBBBBB" w:sz="4"/>
+            </w:tcBorders>
+            <w:tcMar>
+              <w:top w:type="dxa" w:w="60"/>
+              <w:left w:type="dxa" w:w="100"/>
+              <w:bottom w:type="dxa" w:w="60"/>
+              <w:right w:type="dxa" w:w="100"/>
+            </w:tcMar>
+            <w:vAlign w:val="center"/>
+          </w:tcPr>
+          <w:p>
+            <w:pPr>
+              <w:spacing w:line="240" w:lineRule="auto"/>
+              <w:jc w:val="center"/>
+            </w:pPr>
+            <w:r>
+              <w:rPr>
+                <w:rFonts w:ascii="Arial" w:cs="Arial" w:eastAsia="Arial" w:hAnsi="Arial"/>
+                <w:b w:val="false"/>
+                <w:bCs w:val="false"/>
+                <w:sz w:val="18"/>
+                <w:szCs w:val="18"/>
+              </w:rPr>
+              <w:t xml:space="preserve">x</w:t>
+            </w:r>
+          </w:p>
+        </w:tc>
+        <w:tc>
+          <w:tcPr>
+            <w:tcW w:type="dxa" w:w="700"/>
+            <w:tcBorders>
+              <w:top w:val="single" w:color="BBBBBB" w:sz="4"/>
+              <w:left w:val="single" w:color="BBBBBB" w:sz="4"/>
+              <w:bottom w:val="single" w:color="BBBBBB" w:sz="4"/>
+              <w:right w:val="single" w:color="BBBBBB" w:sz="4"/>
+            </w:tcBorders>
+            <w:tcMar>
+              <w:top w:type="dxa" w:w="60"/>
+              <w:left w:type="dxa" w:w="100"/>
+              <w:bottom w:type="dxa" w:w="60"/>
+              <w:right w:type="dxa" w:w="100"/>
+            </w:tcMar>
+            <w:vAlign w:val="center"/>
+          </w:tcPr>
+          <w:p>
+            <w:pPr>
+              <w:spacing w:line="240" w:lineRule="auto"/>
+              <w:jc w:val="center"/>
+            </w:pPr>
+            <w:r>
+              <w:rPr>
+                <w:rFonts w:ascii="Arial" w:cs="Arial" w:eastAsia="Arial" w:hAnsi="Arial"/>
+                <w:b w:val="false"/>
+                <w:bCs w:val="false"/>
+                <w:sz w:val="18"/>
+                <w:szCs w:val="18"/>
+              </w:rPr>
+              <w:t xml:space="preserve">x</w:t>
+            </w:r>
+          </w:p>
+        </w:tc>
+      </w:tr>
+      <w:tr>
+        <w:tc>
+          <w:tcPr>
+            <w:tcW w:type="dxa" w:w="1500"/>
+            <w:tcBorders>
+              <w:top w:val="single" w:color="BBBBBB" w:sz="4"/>
+              <w:left w:val="single" w:color="BBBBBB" w:sz="4"/>
+              <w:bottom w:val="single" w:color="BBBBBB" w:sz="4"/>
+              <w:right w:val="single" w:color="BBBBBB" w:sz="4"/>
+            </w:tcBorders>
+            <w:tcMar>
+              <w:top w:type="dxa" w:w="60"/>
+              <w:left w:type="dxa" w:w="100"/>
+              <w:bottom w:type="dxa" w:w="60"/>
+              <w:right w:type="dxa" w:w="100"/>
+            </w:tcMar>
+            <w:vAlign w:val="center"/>
+          </w:tcPr>
+          <w:p>
+            <w:pPr>
+              <w:spacing w:line="240" w:lineRule="auto"/>
+              <w:jc w:val="center"/>
+            </w:pPr>
+            <w:r>
+              <w:rPr>
+                <w:rFonts w:ascii="Arial" w:cs="Arial" w:eastAsia="Arial" w:hAnsi="Arial"/>
+                <w:b w:val="false"/>
+                <w:bCs w:val="false"/>
+                <w:sz w:val="18"/>
+                <w:szCs w:val="18"/>
+              </w:rPr>
+              <w:t xml:space="preserve">06.04.2026</w:t>
+            </w:r>
+          </w:p>
+        </w:tc>
+        <w:tc>
+          <w:tcPr>
+            <w:tcW w:type="dxa" w:w="4337"/>
+            <w:tcBorders>
+              <w:top w:val="single" w:color="BBBBBB" w:sz="4"/>
+              <w:left w:val="single" w:color="BBBBBB" w:sz="4"/>
+              <w:bottom w:val="single" w:color="BBBBBB" w:sz="4"/>
+              <w:right w:val="single" w:color="BBBBBB" w:sz="4"/>
+            </w:tcBorders>
+            <w:tcMar>
+              <w:top w:type="dxa" w:w="60"/>
+              <w:left w:type="dxa" w:w="100"/>
+              <w:bottom w:type="dxa" w:w="60"/>
+              <w:right w:type="dxa" w:w="100"/>
+            </w:tcMar>
+            <w:vAlign w:val="center"/>
+          </w:tcPr>
+          <w:p>
+            <w:pPr>
+              <w:spacing w:line="240" w:lineRule="auto"/>
+              <w:jc w:val="left"/>
+            </w:pPr>
+            <w:r>
+              <w:rPr>
+                <w:rFonts w:ascii="Arial" w:cs="Arial" w:eastAsia="Arial" w:hAnsi="Arial"/>
+                <w:b w:val="false"/>
+                <w:bCs w:val="false"/>
+                <w:sz w:val="18"/>
+                <w:szCs w:val="18"/>
+              </w:rPr>
+              <w:t xml:space="preserve">Branch feature/04.2-l2-lighthouse erstellt, Doku aktualisiert</w:t>
             </w:r>
           </w:p>
         </w:tc>

</xml_diff>